<commit_message>
Auto sync z praca - 2026-06-18 13:06
</commit_message>
<xml_diff>
--- a/Praca/praca.docx
+++ b/Praca/praca.docx
@@ -31,7 +31,7 @@
         <w:pStyle w:val="Date"/>
       </w:pPr>
       <w:r>
-        <w:t xml:space="preserve">2026-06-17</w:t>
+        <w:t xml:space="preserve">2026-06-18</w:t>
       </w:r>
     </w:p>
     <w:bookmarkStart w:id="9" w:name="streszczenie"/>
@@ -242,6 +242,55 @@
       </w:r>
       <w:r>
         <w:t xml:space="preserve">. Kryterium I, dominujące w naukach rolniczych, ma charakter bibliometryczny: liczbę punktów wyznacza się z udziałów jednostkowych autorów w publikacjach, w ramach limitu slotów publikacyjnych proporcjonalnego do liczby pracowników danej dyscypliny (liczby N).</w:t>
+      </w:r>
+    </w:p>
+    <w:p>
+      <w:pPr>
+        <w:pStyle w:val="BodyText"/>
+      </w:pPr>
+      <w:r>
+        <w:t xml:space="preserve">Rozporządzenie klasyfikacyjne wymienia dyscypliny wyłącznie z nazwy, nie wyznaczając formalnie ich zakresu przedmiotowego</w:t>
+      </w:r>
+      <w:r>
+        <w:t xml:space="preserve"> </w:t>
+      </w:r>
+      <w:r>
+        <w:t xml:space="preserve">(Minister Nauki i Szkolnictwa Wyższego 2025a)</w:t>
+      </w:r>
+      <w:r>
+        <w:t xml:space="preserve">.</w:t>
+      </w:r>
+      <w:r>
+        <w:t xml:space="preserve"> </w:t>
+      </w:r>
+      <w:r>
+        <w:rPr>
+          <w:i/>
+          <w:iCs/>
+        </w:rPr>
+        <w:t xml:space="preserve">Rolnictwo i ogrodnictwo</w:t>
+      </w:r>
+      <w:r>
+        <w:t xml:space="preserve"> </w:t>
+      </w:r>
+      <w:r>
+        <w:t xml:space="preserve">jest jedną z czterech dyscyplin dziedziny nauk rolniczych (obok nauk leśnych, technologii żywności i żywienia oraz zootechniki i rybactwa) i powstało przy reformie klasyfikacji z 2018 r. ze scalenia węższych, wcześniej odrębnych dyscyplin, przede wszystkim agronomii i ogrodnictwa. Jej merytoryczny trzon stanowią nauki o roślinie uprawnej i o środowisku jej wzrostu: produkcja roślinna i agrotechnika, ogrodnictwo (warzywnictwo, sadownictwo, rośliny ozdobne), gleboznawstwo i żywienie roślin, ochrona roślin, hodowla i genetyka roślin, łąkarstwo oraz kształtowanie i ochrona agrocenoz. Poza zakresem dyscypliny pozostają produkcja zwierzęca (przypisana do zootechniki i rybactwa) oraz przetwórstwo płodów rolnych (technologia żywności i żywienia), co czyni</w:t>
+      </w:r>
+      <w:r>
+        <w:t xml:space="preserve"> </w:t>
+      </w:r>
+      <w:r>
+        <w:rPr>
+          <w:i/>
+          <w:iCs/>
+        </w:rPr>
+        <w:t xml:space="preserve">rolnictwo i ogrodnictwo</w:t>
+      </w:r>
+      <w:r>
+        <w:t xml:space="preserve"> </w:t>
+      </w:r>
+      <w:r>
+        <w:t xml:space="preserve">przede wszystkim roślinno-środowiskowym segmentem nauk rolniczych.</w:t>
       </w:r>
     </w:p>
     <w:p>
@@ -715,12 +764,12 @@
     <w:tbl>
       <w:tblPr>
         <w:tblStyle w:val="Table"/>
-        <w:tblW w:type="dxa" w:w="9638"/>
-        <w:tblLayout w:type="autofit"/>
+        <w:tblW w:type="pct" w:w="5000"/>
+        <w:tblLayout w:type="fixed"/>
         <w:tblLook w:firstRow="0" w:lastRow="0" w:firstColumn="0" w:lastColumn="0" w:noHBand="0" w:noVBand="0" w:val="0000"/>
       </w:tblPr>
       <w:tblGrid>
-        <w:gridCol w:w="9638"/>
+        <w:gridCol w:w="7920"/>
       </w:tblGrid>
       <w:tr>
         <w:tc>
@@ -1146,12 +1195,12 @@
     <w:tbl>
       <w:tblPr>
         <w:tblStyle w:val="Table"/>
-        <w:tblW w:type="dxa" w:w="9638"/>
-        <w:tblLayout w:type="autofit"/>
+        <w:tblW w:type="pct" w:w="5000"/>
+        <w:tblLayout w:type="fixed"/>
         <w:tblLook w:firstRow="0" w:lastRow="0" w:firstColumn="0" w:lastColumn="0" w:noHBand="0" w:noVBand="0" w:val="0000"/>
       </w:tblPr>
       <w:tblGrid>
-        <w:gridCol w:w="9638"/>
+        <w:gridCol w:w="7920"/>
       </w:tblGrid>
       <w:tr>
         <w:tc>
@@ -1172,22 +1221,22 @@
           </w:p>
           <w:tbl xmlns:w="http://schemas.openxmlformats.org/wordprocessingml/2006/main" xmlns:r="http://schemas.openxmlformats.org/officeDocument/2006/relationships" xmlns:w14="http://schemas.microsoft.com/office/word/2010/wordml" xmlns:wp="http://schemas.openxmlformats.org/drawingml/2006/wordprocessingDrawing" xmlns:a="http://schemas.openxmlformats.org/drawingml/2006/main" xmlns:pic="http://schemas.openxmlformats.org/drawingml/2006/picture">
             <w:tblPr>
-              <w:tblLayout w:type="autofit"/>
+              <w:tblLayout w:type="fixed"/>
               <w:jc w:val="center"/>
               <w:tblLook w:firstRow="1" w:lastRow="0" w:firstColumn="0" w:lastColumn="0" w:noHBand="0" w:noVBand="1"/>
             </w:tblPr>
             <w:tblGrid>
-              <w:gridCol w:w="964"/>
-              <w:gridCol w:w="675"/>
-              <w:gridCol w:w="514"/>
-              <w:gridCol w:w="899"/>
-              <w:gridCol w:w="899"/>
-              <w:gridCol w:w="899"/>
-              <w:gridCol w:w="899"/>
-              <w:gridCol w:w="1189"/>
-              <w:gridCol w:w="996"/>
-              <w:gridCol w:w="803"/>
-              <w:gridCol w:w="901"/>
+              <w:gridCol w:w="864"/>
+              <w:gridCol w:w="605"/>
+              <w:gridCol w:w="461"/>
+              <w:gridCol w:w="806"/>
+              <w:gridCol w:w="806"/>
+              <w:gridCol w:w="806"/>
+              <w:gridCol w:w="806"/>
+              <w:gridCol w:w="1066"/>
+              <w:gridCol w:w="893"/>
+              <w:gridCol w:w="720"/>
+              <w:gridCol w:w="806"/>
             </w:tblGrid>
             <w:tr>
               <w:trPr>
@@ -1228,20 +1277,20 @@
                       <w:b w:val="false"/>
                       <w:u w:val="none"/>
                       <w:strike w:val="false"/>
-                      <w:sz w:val="16"/>
-                      <w:szCs w:val="16"/>
-                      <w:color w:val="000000"/>
-                    </w:rPr>
-                  </w:pPr>
-                  <w:r xmlns:w="http://schemas.openxmlformats.org/wordprocessingml/2006/main" xmlns:wp="http://schemas.openxmlformats.org/drawingml/2006/wordprocessingDrawing" xmlns:r="http://schemas.openxmlformats.org/officeDocument/2006/relationships" xmlns:w14="http://schemas.microsoft.com/office/word/2010/wordml">
-                    <w:rPr>
-                      <w:rFonts w:ascii="Aptos" w:hAnsi="Aptos" w:eastAsia="Aptos" w:cs="Aptos"/>
-                      <w:i w:val="false"/>
-                      <w:b w:val="false"/>
-                      <w:u w:val="none"/>
-                      <w:strike w:val="false"/>
-                      <w:sz w:val="16"/>
-                      <w:szCs w:val="16"/>
+                      <w:sz w:val="18"/>
+                      <w:szCs w:val="18"/>
+                      <w:color w:val="000000"/>
+                    </w:rPr>
+                  </w:pPr>
+                  <w:r xmlns:w="http://schemas.openxmlformats.org/wordprocessingml/2006/main" xmlns:wp="http://schemas.openxmlformats.org/drawingml/2006/wordprocessingDrawing" xmlns:r="http://schemas.openxmlformats.org/officeDocument/2006/relationships" xmlns:w14="http://schemas.microsoft.com/office/word/2010/wordml">
+                    <w:rPr>
+                      <w:rFonts w:ascii="Aptos" w:hAnsi="Aptos" w:eastAsia="Aptos" w:cs="Aptos"/>
+                      <w:i w:val="false"/>
+                      <w:b w:val="false"/>
+                      <w:u w:val="none"/>
+                      <w:strike w:val="false"/>
+                      <w:sz w:val="18"/>
+                      <w:szCs w:val="18"/>
                       <w:color w:val="000000"/>
                     </w:rPr>
                     <w:t xml:space="preserve">Uczelnia</w:t>
@@ -1282,20 +1331,20 @@
                       <w:b w:val="false"/>
                       <w:u w:val="none"/>
                       <w:strike w:val="false"/>
-                      <w:sz w:val="16"/>
-                      <w:szCs w:val="16"/>
-                      <w:color w:val="000000"/>
-                    </w:rPr>
-                  </w:pPr>
-                  <w:r xmlns:w="http://schemas.openxmlformats.org/wordprocessingml/2006/main" xmlns:wp="http://schemas.openxmlformats.org/drawingml/2006/wordprocessingDrawing" xmlns:r="http://schemas.openxmlformats.org/officeDocument/2006/relationships" xmlns:w14="http://schemas.microsoft.com/office/word/2010/wordml">
-                    <w:rPr>
-                      <w:rFonts w:ascii="Aptos" w:hAnsi="Aptos" w:eastAsia="Aptos" w:cs="Aptos"/>
-                      <w:i w:val="false"/>
-                      <w:b w:val="false"/>
-                      <w:u w:val="none"/>
-                      <w:strike w:val="false"/>
-                      <w:sz w:val="16"/>
-                      <w:szCs w:val="16"/>
+                      <w:sz w:val="18"/>
+                      <w:szCs w:val="18"/>
+                      <w:color w:val="000000"/>
+                    </w:rPr>
+                  </w:pPr>
+                  <w:r xmlns:w="http://schemas.openxmlformats.org/wordprocessingml/2006/main" xmlns:wp="http://schemas.openxmlformats.org/drawingml/2006/wordprocessingDrawing" xmlns:r="http://schemas.openxmlformats.org/officeDocument/2006/relationships" xmlns:w14="http://schemas.microsoft.com/office/word/2010/wordml">
+                    <w:rPr>
+                      <w:rFonts w:ascii="Aptos" w:hAnsi="Aptos" w:eastAsia="Aptos" w:cs="Aptos"/>
+                      <w:i w:val="false"/>
+                      <w:b w:val="false"/>
+                      <w:u w:val="none"/>
+                      <w:strike w:val="false"/>
+                      <w:sz w:val="18"/>
+                      <w:szCs w:val="18"/>
                       <w:color w:val="000000"/>
                     </w:rPr>
                     <w:t xml:space="preserve">Kat.</w:t>
@@ -1336,20 +1385,20 @@
                       <w:b w:val="false"/>
                       <w:u w:val="none"/>
                       <w:strike w:val="false"/>
-                      <w:sz w:val="16"/>
-                      <w:szCs w:val="16"/>
-                      <w:color w:val="000000"/>
-                    </w:rPr>
-                  </w:pPr>
-                  <w:r xmlns:w="http://schemas.openxmlformats.org/wordprocessingml/2006/main" xmlns:wp="http://schemas.openxmlformats.org/drawingml/2006/wordprocessingDrawing" xmlns:r="http://schemas.openxmlformats.org/officeDocument/2006/relationships" xmlns:w14="http://schemas.microsoft.com/office/word/2010/wordml">
-                    <w:rPr>
-                      <w:rFonts w:ascii="Aptos" w:hAnsi="Aptos" w:eastAsia="Aptos" w:cs="Aptos"/>
-                      <w:i w:val="false"/>
-                      <w:b w:val="false"/>
-                      <w:u w:val="none"/>
-                      <w:strike w:val="false"/>
-                      <w:sz w:val="16"/>
-                      <w:szCs w:val="16"/>
+                      <w:sz w:val="18"/>
+                      <w:szCs w:val="18"/>
+                      <w:color w:val="000000"/>
+                    </w:rPr>
+                  </w:pPr>
+                  <w:r xmlns:w="http://schemas.openxmlformats.org/wordprocessingml/2006/main" xmlns:wp="http://schemas.openxmlformats.org/drawingml/2006/wordprocessingDrawing" xmlns:r="http://schemas.openxmlformats.org/officeDocument/2006/relationships" xmlns:w14="http://schemas.microsoft.com/office/word/2010/wordml">
+                    <w:rPr>
+                      <w:rFonts w:ascii="Aptos" w:hAnsi="Aptos" w:eastAsia="Aptos" w:cs="Aptos"/>
+                      <w:i w:val="false"/>
+                      <w:b w:val="false"/>
+                      <w:u w:val="none"/>
+                      <w:strike w:val="false"/>
+                      <w:sz w:val="18"/>
+                      <w:szCs w:val="18"/>
                       <w:color w:val="000000"/>
                     </w:rPr>
                     <w:t xml:space="preserve">n</w:t>
@@ -1390,23 +1439,23 @@
                       <w:b w:val="false"/>
                       <w:u w:val="none"/>
                       <w:strike w:val="false"/>
-                      <w:sz w:val="16"/>
-                      <w:szCs w:val="16"/>
-                      <w:color w:val="000000"/>
-                    </w:rPr>
-                  </w:pPr>
-                  <w:r xmlns:w="http://schemas.openxmlformats.org/wordprocessingml/2006/main" xmlns:wp="http://schemas.openxmlformats.org/drawingml/2006/wordprocessingDrawing" xmlns:r="http://schemas.openxmlformats.org/officeDocument/2006/relationships" xmlns:w14="http://schemas.microsoft.com/office/word/2010/wordml">
-                    <w:rPr>
-                      <w:rFonts w:ascii="Aptos" w:hAnsi="Aptos" w:eastAsia="Aptos" w:cs="Aptos"/>
-                      <w:i w:val="false"/>
-                      <w:b w:val="false"/>
-                      <w:u w:val="none"/>
-                      <w:strike w:val="false"/>
-                      <w:sz w:val="16"/>
-                      <w:szCs w:val="16"/>
-                      <w:color w:val="000000"/>
-                    </w:rPr>
-                    <w:t xml:space="preserve">Adiunkt</w:t>
+                      <w:sz w:val="18"/>
+                      <w:szCs w:val="18"/>
+                      <w:color w:val="000000"/>
+                    </w:rPr>
+                  </w:pPr>
+                  <w:r xmlns:w="http://schemas.openxmlformats.org/wordprocessingml/2006/main" xmlns:wp="http://schemas.openxmlformats.org/drawingml/2006/wordprocessingDrawing" xmlns:r="http://schemas.openxmlformats.org/officeDocument/2006/relationships" xmlns:w14="http://schemas.microsoft.com/office/word/2010/wordml">
+                    <w:rPr>
+                      <w:rFonts w:ascii="Aptos" w:hAnsi="Aptos" w:eastAsia="Aptos" w:cs="Aptos"/>
+                      <w:i w:val="false"/>
+                      <w:b w:val="false"/>
+                      <w:u w:val="none"/>
+                      <w:strike w:val="false"/>
+                      <w:sz w:val="18"/>
+                      <w:szCs w:val="18"/>
+                      <w:color w:val="000000"/>
+                    </w:rPr>
+                    <w:t xml:space="preserve">Asystent</w:t>
                   </w:r>
                 </w:p>
               </w:tc>
@@ -1444,23 +1493,23 @@
                       <w:b w:val="false"/>
                       <w:u w:val="none"/>
                       <w:strike w:val="false"/>
-                      <w:sz w:val="16"/>
-                      <w:szCs w:val="16"/>
-                      <w:color w:val="000000"/>
-                    </w:rPr>
-                  </w:pPr>
-                  <w:r xmlns:w="http://schemas.openxmlformats.org/wordprocessingml/2006/main" xmlns:wp="http://schemas.openxmlformats.org/drawingml/2006/wordprocessingDrawing" xmlns:r="http://schemas.openxmlformats.org/officeDocument/2006/relationships" xmlns:w14="http://schemas.microsoft.com/office/word/2010/wordml">
-                    <w:rPr>
-                      <w:rFonts w:ascii="Aptos" w:hAnsi="Aptos" w:eastAsia="Aptos" w:cs="Aptos"/>
-                      <w:i w:val="false"/>
-                      <w:b w:val="false"/>
-                      <w:u w:val="none"/>
-                      <w:strike w:val="false"/>
-                      <w:sz w:val="16"/>
-                      <w:szCs w:val="16"/>
-                      <w:color w:val="000000"/>
-                    </w:rPr>
-                    <w:t xml:space="preserve">Prof. ucz.</w:t>
+                      <w:sz w:val="18"/>
+                      <w:szCs w:val="18"/>
+                      <w:color w:val="000000"/>
+                    </w:rPr>
+                  </w:pPr>
+                  <w:r xmlns:w="http://schemas.openxmlformats.org/wordprocessingml/2006/main" xmlns:wp="http://schemas.openxmlformats.org/drawingml/2006/wordprocessingDrawing" xmlns:r="http://schemas.openxmlformats.org/officeDocument/2006/relationships" xmlns:w14="http://schemas.microsoft.com/office/word/2010/wordml">
+                    <w:rPr>
+                      <w:rFonts w:ascii="Aptos" w:hAnsi="Aptos" w:eastAsia="Aptos" w:cs="Aptos"/>
+                      <w:i w:val="false"/>
+                      <w:b w:val="false"/>
+                      <w:u w:val="none"/>
+                      <w:strike w:val="false"/>
+                      <w:sz w:val="18"/>
+                      <w:szCs w:val="18"/>
+                      <w:color w:val="000000"/>
+                    </w:rPr>
+                    <w:t xml:space="preserve">Adiunkt</w:t>
                   </w:r>
                 </w:p>
               </w:tc>
@@ -1498,23 +1547,23 @@
                       <w:b w:val="false"/>
                       <w:u w:val="none"/>
                       <w:strike w:val="false"/>
-                      <w:sz w:val="16"/>
-                      <w:szCs w:val="16"/>
-                      <w:color w:val="000000"/>
-                    </w:rPr>
-                  </w:pPr>
-                  <w:r xmlns:w="http://schemas.openxmlformats.org/wordprocessingml/2006/main" xmlns:wp="http://schemas.openxmlformats.org/drawingml/2006/wordprocessingDrawing" xmlns:r="http://schemas.openxmlformats.org/officeDocument/2006/relationships" xmlns:w14="http://schemas.microsoft.com/office/word/2010/wordml">
-                    <w:rPr>
-                      <w:rFonts w:ascii="Aptos" w:hAnsi="Aptos" w:eastAsia="Aptos" w:cs="Aptos"/>
-                      <w:i w:val="false"/>
-                      <w:b w:val="false"/>
-                      <w:u w:val="none"/>
-                      <w:strike w:val="false"/>
-                      <w:sz w:val="16"/>
-                      <w:szCs w:val="16"/>
-                      <w:color w:val="000000"/>
-                    </w:rPr>
-                    <w:t xml:space="preserve">Profesor</w:t>
+                      <w:sz w:val="18"/>
+                      <w:szCs w:val="18"/>
+                      <w:color w:val="000000"/>
+                    </w:rPr>
+                  </w:pPr>
+                  <w:r xmlns:w="http://schemas.openxmlformats.org/wordprocessingml/2006/main" xmlns:wp="http://schemas.openxmlformats.org/drawingml/2006/wordprocessingDrawing" xmlns:r="http://schemas.openxmlformats.org/officeDocument/2006/relationships" xmlns:w14="http://schemas.microsoft.com/office/word/2010/wordml">
+                    <w:rPr>
+                      <w:rFonts w:ascii="Aptos" w:hAnsi="Aptos" w:eastAsia="Aptos" w:cs="Aptos"/>
+                      <w:i w:val="false"/>
+                      <w:b w:val="false"/>
+                      <w:u w:val="none"/>
+                      <w:strike w:val="false"/>
+                      <w:sz w:val="18"/>
+                      <w:szCs w:val="18"/>
+                      <w:color w:val="000000"/>
+                    </w:rPr>
+                    <w:t xml:space="preserve">Prof. ucz.</w:t>
                   </w:r>
                 </w:p>
               </w:tc>
@@ -1552,23 +1601,23 @@
                       <w:b w:val="false"/>
                       <w:u w:val="none"/>
                       <w:strike w:val="false"/>
-                      <w:sz w:val="16"/>
-                      <w:szCs w:val="16"/>
-                      <w:color w:val="000000"/>
-                    </w:rPr>
-                  </w:pPr>
-                  <w:r xmlns:w="http://schemas.openxmlformats.org/wordprocessingml/2006/main" xmlns:wp="http://schemas.openxmlformats.org/drawingml/2006/wordprocessingDrawing" xmlns:r="http://schemas.openxmlformats.org/officeDocument/2006/relationships" xmlns:w14="http://schemas.microsoft.com/office/word/2010/wordml">
-                    <w:rPr>
-                      <w:rFonts w:ascii="Aptos" w:hAnsi="Aptos" w:eastAsia="Aptos" w:cs="Aptos"/>
-                      <w:i w:val="false"/>
-                      <w:b w:val="false"/>
-                      <w:u w:val="none"/>
-                      <w:strike w:val="false"/>
-                      <w:sz w:val="16"/>
-                      <w:szCs w:val="16"/>
-                      <w:color w:val="000000"/>
-                    </w:rPr>
-                    <w:t xml:space="preserve">Asystent</w:t>
+                      <w:sz w:val="18"/>
+                      <w:szCs w:val="18"/>
+                      <w:color w:val="000000"/>
+                    </w:rPr>
+                  </w:pPr>
+                  <w:r xmlns:w="http://schemas.openxmlformats.org/wordprocessingml/2006/main" xmlns:wp="http://schemas.openxmlformats.org/drawingml/2006/wordprocessingDrawing" xmlns:r="http://schemas.openxmlformats.org/officeDocument/2006/relationships" xmlns:w14="http://schemas.microsoft.com/office/word/2010/wordml">
+                    <w:rPr>
+                      <w:rFonts w:ascii="Aptos" w:hAnsi="Aptos" w:eastAsia="Aptos" w:cs="Aptos"/>
+                      <w:i w:val="false"/>
+                      <w:b w:val="false"/>
+                      <w:u w:val="none"/>
+                      <w:strike w:val="false"/>
+                      <w:sz w:val="18"/>
+                      <w:szCs w:val="18"/>
+                      <w:color w:val="000000"/>
+                    </w:rPr>
+                    <w:t xml:space="preserve">Profesor</w:t>
                   </w:r>
                 </w:p>
               </w:tc>
@@ -1606,20 +1655,20 @@
                       <w:b w:val="false"/>
                       <w:u w:val="none"/>
                       <w:strike w:val="false"/>
-                      <w:sz w:val="16"/>
-                      <w:szCs w:val="16"/>
-                      <w:color w:val="000000"/>
-                    </w:rPr>
-                  </w:pPr>
-                  <w:r xmlns:w="http://schemas.openxmlformats.org/wordprocessingml/2006/main" xmlns:wp="http://schemas.openxmlformats.org/drawingml/2006/wordprocessingDrawing" xmlns:r="http://schemas.openxmlformats.org/officeDocument/2006/relationships" xmlns:w14="http://schemas.microsoft.com/office/word/2010/wordml">
-                    <w:rPr>
-                      <w:rFonts w:ascii="Aptos" w:hAnsi="Aptos" w:eastAsia="Aptos" w:cs="Aptos"/>
-                      <w:i w:val="false"/>
-                      <w:b w:val="false"/>
-                      <w:u w:val="none"/>
-                      <w:strike w:val="false"/>
-                      <w:sz w:val="16"/>
-                      <w:szCs w:val="16"/>
+                      <w:sz w:val="18"/>
+                      <w:szCs w:val="18"/>
+                      <w:color w:val="000000"/>
+                    </w:rPr>
+                  </w:pPr>
+                  <w:r xmlns:w="http://schemas.openxmlformats.org/wordprocessingml/2006/main" xmlns:wp="http://schemas.openxmlformats.org/drawingml/2006/wordprocessingDrawing" xmlns:r="http://schemas.openxmlformats.org/officeDocument/2006/relationships" xmlns:w14="http://schemas.microsoft.com/office/word/2010/wordml">
+                    <w:rPr>
+                      <w:rFonts w:ascii="Aptos" w:hAnsi="Aptos" w:eastAsia="Aptos" w:cs="Aptos"/>
+                      <w:i w:val="false"/>
+                      <w:b w:val="false"/>
+                      <w:u w:val="none"/>
+                      <w:strike w:val="false"/>
+                      <w:sz w:val="18"/>
+                      <w:szCs w:val="18"/>
                       <w:color w:val="000000"/>
                     </w:rPr>
                     <w:t xml:space="preserve">Dopasow. OpenAlex</w:t>
@@ -1660,20 +1709,20 @@
                       <w:b w:val="false"/>
                       <w:u w:val="none"/>
                       <w:strike w:val="false"/>
-                      <w:sz w:val="16"/>
-                      <w:szCs w:val="16"/>
-                      <w:color w:val="000000"/>
-                    </w:rPr>
-                  </w:pPr>
-                  <w:r xmlns:w="http://schemas.openxmlformats.org/wordprocessingml/2006/main" xmlns:wp="http://schemas.openxmlformats.org/drawingml/2006/wordprocessingDrawing" xmlns:r="http://schemas.openxmlformats.org/officeDocument/2006/relationships" xmlns:w14="http://schemas.microsoft.com/office/word/2010/wordml">
-                    <w:rPr>
-                      <w:rFonts w:ascii="Aptos" w:hAnsi="Aptos" w:eastAsia="Aptos" w:cs="Aptos"/>
-                      <w:i w:val="false"/>
-                      <w:b w:val="false"/>
-                      <w:u w:val="none"/>
-                      <w:strike w:val="false"/>
-                      <w:sz w:val="16"/>
-                      <w:szCs w:val="16"/>
+                      <w:sz w:val="18"/>
+                      <w:szCs w:val="18"/>
+                      <w:color w:val="000000"/>
+                    </w:rPr>
+                  </w:pPr>
+                  <w:r xmlns:w="http://schemas.openxmlformats.org/wordprocessingml/2006/main" xmlns:wp="http://schemas.openxmlformats.org/drawingml/2006/wordprocessingDrawing" xmlns:r="http://schemas.openxmlformats.org/officeDocument/2006/relationships" xmlns:w14="http://schemas.microsoft.com/office/word/2010/wordml">
+                    <w:rPr>
+                      <w:rFonts w:ascii="Aptos" w:hAnsi="Aptos" w:eastAsia="Aptos" w:cs="Aptos"/>
+                      <w:i w:val="false"/>
+                      <w:b w:val="false"/>
+                      <w:u w:val="none"/>
+                      <w:strike w:val="false"/>
+                      <w:sz w:val="18"/>
+                      <w:szCs w:val="18"/>
                       <w:color w:val="000000"/>
                     </w:rPr>
                     <w:t xml:space="preserve">Liczba publ.*</w:t>
@@ -1714,20 +1763,20 @@
                       <w:b w:val="false"/>
                       <w:u w:val="none"/>
                       <w:strike w:val="false"/>
-                      <w:sz w:val="16"/>
-                      <w:szCs w:val="16"/>
-                      <w:color w:val="000000"/>
-                    </w:rPr>
-                  </w:pPr>
-                  <w:r xmlns:w="http://schemas.openxmlformats.org/wordprocessingml/2006/main" xmlns:wp="http://schemas.openxmlformats.org/drawingml/2006/wordprocessingDrawing" xmlns:r="http://schemas.openxmlformats.org/officeDocument/2006/relationships" xmlns:w14="http://schemas.microsoft.com/office/word/2010/wordml">
-                    <w:rPr>
-                      <w:rFonts w:ascii="Aptos" w:hAnsi="Aptos" w:eastAsia="Aptos" w:cs="Aptos"/>
-                      <w:i w:val="false"/>
-                      <w:b w:val="false"/>
-                      <w:u w:val="none"/>
-                      <w:strike w:val="false"/>
-                      <w:sz w:val="16"/>
-                      <w:szCs w:val="16"/>
+                      <w:sz w:val="18"/>
+                      <w:szCs w:val="18"/>
+                      <w:color w:val="000000"/>
+                    </w:rPr>
+                  </w:pPr>
+                  <w:r xmlns:w="http://schemas.openxmlformats.org/wordprocessingml/2006/main" xmlns:wp="http://schemas.openxmlformats.org/drawingml/2006/wordprocessingDrawing" xmlns:r="http://schemas.openxmlformats.org/officeDocument/2006/relationships" xmlns:w14="http://schemas.microsoft.com/office/word/2010/wordml">
+                    <w:rPr>
+                      <w:rFonts w:ascii="Aptos" w:hAnsi="Aptos" w:eastAsia="Aptos" w:cs="Aptos"/>
+                      <w:i w:val="false"/>
+                      <w:b w:val="false"/>
+                      <w:u w:val="none"/>
+                      <w:strike w:val="false"/>
+                      <w:sz w:val="18"/>
+                      <w:szCs w:val="18"/>
                       <w:color w:val="000000"/>
                     </w:rPr>
                     <w:t xml:space="preserve">Sum. IF*</w:t>
@@ -1768,20 +1817,20 @@
                       <w:b w:val="false"/>
                       <w:u w:val="none"/>
                       <w:strike w:val="false"/>
-                      <w:sz w:val="16"/>
-                      <w:szCs w:val="16"/>
-                      <w:color w:val="000000"/>
-                    </w:rPr>
-                  </w:pPr>
-                  <w:r xmlns:w="http://schemas.openxmlformats.org/wordprocessingml/2006/main" xmlns:wp="http://schemas.openxmlformats.org/drawingml/2006/wordprocessingDrawing" xmlns:r="http://schemas.openxmlformats.org/officeDocument/2006/relationships" xmlns:w14="http://schemas.microsoft.com/office/word/2010/wordml">
-                    <w:rPr>
-                      <w:rFonts w:ascii="Aptos" w:hAnsi="Aptos" w:eastAsia="Aptos" w:cs="Aptos"/>
-                      <w:i w:val="false"/>
-                      <w:b w:val="false"/>
-                      <w:u w:val="none"/>
-                      <w:strike w:val="false"/>
-                      <w:sz w:val="16"/>
-                      <w:szCs w:val="16"/>
+                      <w:sz w:val="18"/>
+                      <w:szCs w:val="18"/>
+                      <w:color w:val="000000"/>
+                    </w:rPr>
+                  </w:pPr>
+                  <w:r xmlns:w="http://schemas.openxmlformats.org/wordprocessingml/2006/main" xmlns:wp="http://schemas.openxmlformats.org/drawingml/2006/wordprocessingDrawing" xmlns:r="http://schemas.openxmlformats.org/officeDocument/2006/relationships" xmlns:w14="http://schemas.microsoft.com/office/word/2010/wordml">
+                    <w:rPr>
+                      <w:rFonts w:ascii="Aptos" w:hAnsi="Aptos" w:eastAsia="Aptos" w:cs="Aptos"/>
+                      <w:i w:val="false"/>
+                      <w:b w:val="false"/>
+                      <w:u w:val="none"/>
+                      <w:strike w:val="false"/>
+                      <w:sz w:val="18"/>
+                      <w:szCs w:val="18"/>
                       <w:color w:val="000000"/>
                     </w:rPr>
                     <w:t xml:space="preserve">h-index*</w:t>
@@ -1827,20 +1876,20 @@
                       <w:b w:val="false"/>
                       <w:u w:val="none"/>
                       <w:strike w:val="false"/>
-                      <w:sz w:val="16"/>
-                      <w:szCs w:val="16"/>
-                      <w:color w:val="000000"/>
-                    </w:rPr>
-                  </w:pPr>
-                  <w:r xmlns:w="http://schemas.openxmlformats.org/wordprocessingml/2006/main" xmlns:wp="http://schemas.openxmlformats.org/drawingml/2006/wordprocessingDrawing" xmlns:r="http://schemas.openxmlformats.org/officeDocument/2006/relationships" xmlns:w14="http://schemas.microsoft.com/office/word/2010/wordml">
-                    <w:rPr>
-                      <w:rFonts w:ascii="Aptos" w:hAnsi="Aptos" w:eastAsia="Aptos" w:cs="Aptos"/>
-                      <w:i w:val="false"/>
-                      <w:b w:val="false"/>
-                      <w:u w:val="none"/>
-                      <w:strike w:val="false"/>
-                      <w:sz w:val="16"/>
-                      <w:szCs w:val="16"/>
+                      <w:sz w:val="18"/>
+                      <w:szCs w:val="18"/>
+                      <w:color w:val="000000"/>
+                    </w:rPr>
+                  </w:pPr>
+                  <w:r xmlns:w="http://schemas.openxmlformats.org/wordprocessingml/2006/main" xmlns:wp="http://schemas.openxmlformats.org/drawingml/2006/wordprocessingDrawing" xmlns:r="http://schemas.openxmlformats.org/officeDocument/2006/relationships" xmlns:w14="http://schemas.microsoft.com/office/word/2010/wordml">
+                    <w:rPr>
+                      <w:rFonts w:ascii="Aptos" w:hAnsi="Aptos" w:eastAsia="Aptos" w:cs="Aptos"/>
+                      <w:i w:val="false"/>
+                      <w:b w:val="false"/>
+                      <w:u w:val="none"/>
+                      <w:strike w:val="false"/>
+                      <w:sz w:val="18"/>
+                      <w:szCs w:val="18"/>
                       <w:color w:val="000000"/>
                     </w:rPr>
                     <w:t xml:space="preserve">UPWr</w:t>
@@ -1881,20 +1930,20 @@
                       <w:b w:val="false"/>
                       <w:u w:val="none"/>
                       <w:strike w:val="false"/>
-                      <w:sz w:val="16"/>
-                      <w:szCs w:val="16"/>
-                      <w:color w:val="000000"/>
-                    </w:rPr>
-                  </w:pPr>
-                  <w:r xmlns:w="http://schemas.openxmlformats.org/wordprocessingml/2006/main" xmlns:wp="http://schemas.openxmlformats.org/drawingml/2006/wordprocessingDrawing" xmlns:r="http://schemas.openxmlformats.org/officeDocument/2006/relationships" xmlns:w14="http://schemas.microsoft.com/office/word/2010/wordml">
-                    <w:rPr>
-                      <w:rFonts w:ascii="Aptos" w:hAnsi="Aptos" w:eastAsia="Aptos" w:cs="Aptos"/>
-                      <w:i w:val="false"/>
-                      <w:b w:val="false"/>
-                      <w:u w:val="none"/>
-                      <w:strike w:val="false"/>
-                      <w:sz w:val="16"/>
-                      <w:szCs w:val="16"/>
+                      <w:sz w:val="18"/>
+                      <w:szCs w:val="18"/>
+                      <w:color w:val="000000"/>
+                    </w:rPr>
+                  </w:pPr>
+                  <w:r xmlns:w="http://schemas.openxmlformats.org/wordprocessingml/2006/main" xmlns:wp="http://schemas.openxmlformats.org/drawingml/2006/wordprocessingDrawing" xmlns:r="http://schemas.openxmlformats.org/officeDocument/2006/relationships" xmlns:w14="http://schemas.microsoft.com/office/word/2010/wordml">
+                    <w:rPr>
+                      <w:rFonts w:ascii="Aptos" w:hAnsi="Aptos" w:eastAsia="Aptos" w:cs="Aptos"/>
+                      <w:i w:val="false"/>
+                      <w:b w:val="false"/>
+                      <w:u w:val="none"/>
+                      <w:strike w:val="false"/>
+                      <w:sz w:val="18"/>
+                      <w:szCs w:val="18"/>
                       <w:color w:val="000000"/>
                     </w:rPr>
                     <w:t xml:space="preserve">A</w:t>
@@ -1935,20 +1984,20 @@
                       <w:b w:val="false"/>
                       <w:u w:val="none"/>
                       <w:strike w:val="false"/>
-                      <w:sz w:val="16"/>
-                      <w:szCs w:val="16"/>
-                      <w:color w:val="000000"/>
-                    </w:rPr>
-                  </w:pPr>
-                  <w:r xmlns:w="http://schemas.openxmlformats.org/wordprocessingml/2006/main" xmlns:wp="http://schemas.openxmlformats.org/drawingml/2006/wordprocessingDrawing" xmlns:r="http://schemas.openxmlformats.org/officeDocument/2006/relationships" xmlns:w14="http://schemas.microsoft.com/office/word/2010/wordml">
-                    <w:rPr>
-                      <w:rFonts w:ascii="Aptos" w:hAnsi="Aptos" w:eastAsia="Aptos" w:cs="Aptos"/>
-                      <w:i w:val="false"/>
-                      <w:b w:val="false"/>
-                      <w:u w:val="none"/>
-                      <w:strike w:val="false"/>
-                      <w:sz w:val="16"/>
-                      <w:szCs w:val="16"/>
+                      <w:sz w:val="18"/>
+                      <w:szCs w:val="18"/>
+                      <w:color w:val="000000"/>
+                    </w:rPr>
+                  </w:pPr>
+                  <w:r xmlns:w="http://schemas.openxmlformats.org/wordprocessingml/2006/main" xmlns:wp="http://schemas.openxmlformats.org/drawingml/2006/wordprocessingDrawing" xmlns:r="http://schemas.openxmlformats.org/officeDocument/2006/relationships" xmlns:w14="http://schemas.microsoft.com/office/word/2010/wordml">
+                    <w:rPr>
+                      <w:rFonts w:ascii="Aptos" w:hAnsi="Aptos" w:eastAsia="Aptos" w:cs="Aptos"/>
+                      <w:i w:val="false"/>
+                      <w:b w:val="false"/>
+                      <w:u w:val="none"/>
+                      <w:strike w:val="false"/>
+                      <w:sz w:val="18"/>
+                      <w:szCs w:val="18"/>
                       <w:color w:val="000000"/>
                     </w:rPr>
                     <w:t xml:space="preserve">118</w:t>
@@ -1989,23 +2038,23 @@
                       <w:b w:val="false"/>
                       <w:u w:val="none"/>
                       <w:strike w:val="false"/>
-                      <w:sz w:val="16"/>
-                      <w:szCs w:val="16"/>
-                      <w:color w:val="000000"/>
-                    </w:rPr>
-                  </w:pPr>
-                  <w:r xmlns:w="http://schemas.openxmlformats.org/wordprocessingml/2006/main" xmlns:wp="http://schemas.openxmlformats.org/drawingml/2006/wordprocessingDrawing" xmlns:r="http://schemas.openxmlformats.org/officeDocument/2006/relationships" xmlns:w14="http://schemas.microsoft.com/office/word/2010/wordml">
-                    <w:rPr>
-                      <w:rFonts w:ascii="Aptos" w:hAnsi="Aptos" w:eastAsia="Aptos" w:cs="Aptos"/>
-                      <w:i w:val="false"/>
-                      <w:b w:val="false"/>
-                      <w:u w:val="none"/>
-                      <w:strike w:val="false"/>
-                      <w:sz w:val="16"/>
-                      <w:szCs w:val="16"/>
-                      <w:color w:val="000000"/>
-                    </w:rPr>
-                    <w:t xml:space="preserve">47</w:t>
+                      <w:sz w:val="18"/>
+                      <w:szCs w:val="18"/>
+                      <w:color w:val="000000"/>
+                    </w:rPr>
+                  </w:pPr>
+                  <w:r xmlns:w="http://schemas.openxmlformats.org/wordprocessingml/2006/main" xmlns:wp="http://schemas.openxmlformats.org/drawingml/2006/wordprocessingDrawing" xmlns:r="http://schemas.openxmlformats.org/officeDocument/2006/relationships" xmlns:w14="http://schemas.microsoft.com/office/word/2010/wordml">
+                    <w:rPr>
+                      <w:rFonts w:ascii="Aptos" w:hAnsi="Aptos" w:eastAsia="Aptos" w:cs="Aptos"/>
+                      <w:i w:val="false"/>
+                      <w:b w:val="false"/>
+                      <w:u w:val="none"/>
+                      <w:strike w:val="false"/>
+                      <w:sz w:val="18"/>
+                      <w:szCs w:val="18"/>
+                      <w:color w:val="000000"/>
+                    </w:rPr>
+                    <w:t xml:space="preserve">1</w:t>
                   </w:r>
                 </w:p>
               </w:tc>
@@ -2043,23 +2092,23 @@
                       <w:b w:val="false"/>
                       <w:u w:val="none"/>
                       <w:strike w:val="false"/>
-                      <w:sz w:val="16"/>
-                      <w:szCs w:val="16"/>
-                      <w:color w:val="000000"/>
-                    </w:rPr>
-                  </w:pPr>
-                  <w:r xmlns:w="http://schemas.openxmlformats.org/wordprocessingml/2006/main" xmlns:wp="http://schemas.openxmlformats.org/drawingml/2006/wordprocessingDrawing" xmlns:r="http://schemas.openxmlformats.org/officeDocument/2006/relationships" xmlns:w14="http://schemas.microsoft.com/office/word/2010/wordml">
-                    <w:rPr>
-                      <w:rFonts w:ascii="Aptos" w:hAnsi="Aptos" w:eastAsia="Aptos" w:cs="Aptos"/>
-                      <w:i w:val="false"/>
-                      <w:b w:val="false"/>
-                      <w:u w:val="none"/>
-                      <w:strike w:val="false"/>
-                      <w:sz w:val="16"/>
-                      <w:szCs w:val="16"/>
-                      <w:color w:val="000000"/>
-                    </w:rPr>
-                    <w:t xml:space="preserve">30</w:t>
+                      <w:sz w:val="18"/>
+                      <w:szCs w:val="18"/>
+                      <w:color w:val="000000"/>
+                    </w:rPr>
+                  </w:pPr>
+                  <w:r xmlns:w="http://schemas.openxmlformats.org/wordprocessingml/2006/main" xmlns:wp="http://schemas.openxmlformats.org/drawingml/2006/wordprocessingDrawing" xmlns:r="http://schemas.openxmlformats.org/officeDocument/2006/relationships" xmlns:w14="http://schemas.microsoft.com/office/word/2010/wordml">
+                    <w:rPr>
+                      <w:rFonts w:ascii="Aptos" w:hAnsi="Aptos" w:eastAsia="Aptos" w:cs="Aptos"/>
+                      <w:i w:val="false"/>
+                      <w:b w:val="false"/>
+                      <w:u w:val="none"/>
+                      <w:strike w:val="false"/>
+                      <w:sz w:val="18"/>
+                      <w:szCs w:val="18"/>
+                      <w:color w:val="000000"/>
+                    </w:rPr>
+                    <w:t xml:space="preserve">47</w:t>
                   </w:r>
                 </w:p>
               </w:tc>
@@ -2097,23 +2146,23 @@
                       <w:b w:val="false"/>
                       <w:u w:val="none"/>
                       <w:strike w:val="false"/>
-                      <w:sz w:val="16"/>
-                      <w:szCs w:val="16"/>
-                      <w:color w:val="000000"/>
-                    </w:rPr>
-                  </w:pPr>
-                  <w:r xmlns:w="http://schemas.openxmlformats.org/wordprocessingml/2006/main" xmlns:wp="http://schemas.openxmlformats.org/drawingml/2006/wordprocessingDrawing" xmlns:r="http://schemas.openxmlformats.org/officeDocument/2006/relationships" xmlns:w14="http://schemas.microsoft.com/office/word/2010/wordml">
-                    <w:rPr>
-                      <w:rFonts w:ascii="Aptos" w:hAnsi="Aptos" w:eastAsia="Aptos" w:cs="Aptos"/>
-                      <w:i w:val="false"/>
-                      <w:b w:val="false"/>
-                      <w:u w:val="none"/>
-                      <w:strike w:val="false"/>
-                      <w:sz w:val="16"/>
-                      <w:szCs w:val="16"/>
-                      <w:color w:val="000000"/>
-                    </w:rPr>
-                    <w:t xml:space="preserve">27</w:t>
+                      <w:sz w:val="18"/>
+                      <w:szCs w:val="18"/>
+                      <w:color w:val="000000"/>
+                    </w:rPr>
+                  </w:pPr>
+                  <w:r xmlns:w="http://schemas.openxmlformats.org/wordprocessingml/2006/main" xmlns:wp="http://schemas.openxmlformats.org/drawingml/2006/wordprocessingDrawing" xmlns:r="http://schemas.openxmlformats.org/officeDocument/2006/relationships" xmlns:w14="http://schemas.microsoft.com/office/word/2010/wordml">
+                    <w:rPr>
+                      <w:rFonts w:ascii="Aptos" w:hAnsi="Aptos" w:eastAsia="Aptos" w:cs="Aptos"/>
+                      <w:i w:val="false"/>
+                      <w:b w:val="false"/>
+                      <w:u w:val="none"/>
+                      <w:strike w:val="false"/>
+                      <w:sz w:val="18"/>
+                      <w:szCs w:val="18"/>
+                      <w:color w:val="000000"/>
+                    </w:rPr>
+                    <w:t xml:space="preserve">30</w:t>
                   </w:r>
                 </w:p>
               </w:tc>
@@ -2151,23 +2200,23 @@
                       <w:b w:val="false"/>
                       <w:u w:val="none"/>
                       <w:strike w:val="false"/>
-                      <w:sz w:val="16"/>
-                      <w:szCs w:val="16"/>
-                      <w:color w:val="000000"/>
-                    </w:rPr>
-                  </w:pPr>
-                  <w:r xmlns:w="http://schemas.openxmlformats.org/wordprocessingml/2006/main" xmlns:wp="http://schemas.openxmlformats.org/drawingml/2006/wordprocessingDrawing" xmlns:r="http://schemas.openxmlformats.org/officeDocument/2006/relationships" xmlns:w14="http://schemas.microsoft.com/office/word/2010/wordml">
-                    <w:rPr>
-                      <w:rFonts w:ascii="Aptos" w:hAnsi="Aptos" w:eastAsia="Aptos" w:cs="Aptos"/>
-                      <w:i w:val="false"/>
-                      <w:b w:val="false"/>
-                      <w:u w:val="none"/>
-                      <w:strike w:val="false"/>
-                      <w:sz w:val="16"/>
-                      <w:szCs w:val="16"/>
-                      <w:color w:val="000000"/>
-                    </w:rPr>
-                    <w:t xml:space="preserve">1</w:t>
+                      <w:sz w:val="18"/>
+                      <w:szCs w:val="18"/>
+                      <w:color w:val="000000"/>
+                    </w:rPr>
+                  </w:pPr>
+                  <w:r xmlns:w="http://schemas.openxmlformats.org/wordprocessingml/2006/main" xmlns:wp="http://schemas.openxmlformats.org/drawingml/2006/wordprocessingDrawing" xmlns:r="http://schemas.openxmlformats.org/officeDocument/2006/relationships" xmlns:w14="http://schemas.microsoft.com/office/word/2010/wordml">
+                    <w:rPr>
+                      <w:rFonts w:ascii="Aptos" w:hAnsi="Aptos" w:eastAsia="Aptos" w:cs="Aptos"/>
+                      <w:i w:val="false"/>
+                      <w:b w:val="false"/>
+                      <w:u w:val="none"/>
+                      <w:strike w:val="false"/>
+                      <w:sz w:val="18"/>
+                      <w:szCs w:val="18"/>
+                      <w:color w:val="000000"/>
+                    </w:rPr>
+                    <w:t xml:space="preserve">27</w:t>
                   </w:r>
                 </w:p>
               </w:tc>
@@ -2205,20 +2254,20 @@
                       <w:b w:val="false"/>
                       <w:u w:val="none"/>
                       <w:strike w:val="false"/>
-                      <w:sz w:val="16"/>
-                      <w:szCs w:val="16"/>
-                      <w:color w:val="000000"/>
-                    </w:rPr>
-                  </w:pPr>
-                  <w:r xmlns:w="http://schemas.openxmlformats.org/wordprocessingml/2006/main" xmlns:wp="http://schemas.openxmlformats.org/drawingml/2006/wordprocessingDrawing" xmlns:r="http://schemas.openxmlformats.org/officeDocument/2006/relationships" xmlns:w14="http://schemas.microsoft.com/office/word/2010/wordml">
-                    <w:rPr>
-                      <w:rFonts w:ascii="Aptos" w:hAnsi="Aptos" w:eastAsia="Aptos" w:cs="Aptos"/>
-                      <w:i w:val="false"/>
-                      <w:b w:val="false"/>
-                      <w:u w:val="none"/>
-                      <w:strike w:val="false"/>
-                      <w:sz w:val="16"/>
-                      <w:szCs w:val="16"/>
+                      <w:sz w:val="18"/>
+                      <w:szCs w:val="18"/>
+                      <w:color w:val="000000"/>
+                    </w:rPr>
+                  </w:pPr>
+                  <w:r xmlns:w="http://schemas.openxmlformats.org/wordprocessingml/2006/main" xmlns:wp="http://schemas.openxmlformats.org/drawingml/2006/wordprocessingDrawing" xmlns:r="http://schemas.openxmlformats.org/officeDocument/2006/relationships" xmlns:w14="http://schemas.microsoft.com/office/word/2010/wordml">
+                    <w:rPr>
+                      <w:rFonts w:ascii="Aptos" w:hAnsi="Aptos" w:eastAsia="Aptos" w:cs="Aptos"/>
+                      <w:i w:val="false"/>
+                      <w:b w:val="false"/>
+                      <w:u w:val="none"/>
+                      <w:strike w:val="false"/>
+                      <w:sz w:val="18"/>
+                      <w:szCs w:val="18"/>
                       <w:color w:val="000000"/>
                     </w:rPr>
                     <w:t xml:space="preserve">79,7 %</w:t>
@@ -2259,20 +2308,20 @@
                       <w:b w:val="false"/>
                       <w:u w:val="none"/>
                       <w:strike w:val="false"/>
-                      <w:sz w:val="16"/>
-                      <w:szCs w:val="16"/>
-                      <w:color w:val="000000"/>
-                    </w:rPr>
-                  </w:pPr>
-                  <w:r xmlns:w="http://schemas.openxmlformats.org/wordprocessingml/2006/main" xmlns:wp="http://schemas.openxmlformats.org/drawingml/2006/wordprocessingDrawing" xmlns:r="http://schemas.openxmlformats.org/officeDocument/2006/relationships" xmlns:w14="http://schemas.microsoft.com/office/word/2010/wordml">
-                    <w:rPr>
-                      <w:rFonts w:ascii="Aptos" w:hAnsi="Aptos" w:eastAsia="Aptos" w:cs="Aptos"/>
-                      <w:i w:val="false"/>
-                      <w:b w:val="false"/>
-                      <w:u w:val="none"/>
-                      <w:strike w:val="false"/>
-                      <w:sz w:val="16"/>
-                      <w:szCs w:val="16"/>
+                      <w:sz w:val="18"/>
+                      <w:szCs w:val="18"/>
+                      <w:color w:val="000000"/>
+                    </w:rPr>
+                  </w:pPr>
+                  <w:r xmlns:w="http://schemas.openxmlformats.org/wordprocessingml/2006/main" xmlns:wp="http://schemas.openxmlformats.org/drawingml/2006/wordprocessingDrawing" xmlns:r="http://schemas.openxmlformats.org/officeDocument/2006/relationships" xmlns:w14="http://schemas.microsoft.com/office/word/2010/wordml">
+                    <w:rPr>
+                      <w:rFonts w:ascii="Aptos" w:hAnsi="Aptos" w:eastAsia="Aptos" w:cs="Aptos"/>
+                      <w:i w:val="false"/>
+                      <w:b w:val="false"/>
+                      <w:u w:val="none"/>
+                      <w:strike w:val="false"/>
+                      <w:sz w:val="18"/>
+                      <w:szCs w:val="18"/>
                       <w:color w:val="000000"/>
                     </w:rPr>
                     <w:t xml:space="preserve">99</w:t>
@@ -2313,20 +2362,20 @@
                       <w:b w:val="false"/>
                       <w:u w:val="none"/>
                       <w:strike w:val="false"/>
-                      <w:sz w:val="16"/>
-                      <w:szCs w:val="16"/>
-                      <w:color w:val="000000"/>
-                    </w:rPr>
-                  </w:pPr>
-                  <w:r xmlns:w="http://schemas.openxmlformats.org/wordprocessingml/2006/main" xmlns:wp="http://schemas.openxmlformats.org/drawingml/2006/wordprocessingDrawing" xmlns:r="http://schemas.openxmlformats.org/officeDocument/2006/relationships" xmlns:w14="http://schemas.microsoft.com/office/word/2010/wordml">
-                    <w:rPr>
-                      <w:rFonts w:ascii="Aptos" w:hAnsi="Aptos" w:eastAsia="Aptos" w:cs="Aptos"/>
-                      <w:i w:val="false"/>
-                      <w:b w:val="false"/>
-                      <w:u w:val="none"/>
-                      <w:strike w:val="false"/>
-                      <w:sz w:val="16"/>
-                      <w:szCs w:val="16"/>
+                      <w:sz w:val="18"/>
+                      <w:szCs w:val="18"/>
+                      <w:color w:val="000000"/>
+                    </w:rPr>
+                  </w:pPr>
+                  <w:r xmlns:w="http://schemas.openxmlformats.org/wordprocessingml/2006/main" xmlns:wp="http://schemas.openxmlformats.org/drawingml/2006/wordprocessingDrawing" xmlns:r="http://schemas.openxmlformats.org/officeDocument/2006/relationships" xmlns:w14="http://schemas.microsoft.com/office/word/2010/wordml">
+                    <w:rPr>
+                      <w:rFonts w:ascii="Aptos" w:hAnsi="Aptos" w:eastAsia="Aptos" w:cs="Aptos"/>
+                      <w:i w:val="false"/>
+                      <w:b w:val="false"/>
+                      <w:u w:val="none"/>
+                      <w:strike w:val="false"/>
+                      <w:sz w:val="18"/>
+                      <w:szCs w:val="18"/>
                       <w:color w:val="000000"/>
                     </w:rPr>
                     <w:t xml:space="preserve">46,1</w:t>
@@ -2367,20 +2416,20 @@
                       <w:b w:val="false"/>
                       <w:u w:val="none"/>
                       <w:strike w:val="false"/>
-                      <w:sz w:val="16"/>
-                      <w:szCs w:val="16"/>
-                      <w:color w:val="000000"/>
-                    </w:rPr>
-                  </w:pPr>
-                  <w:r xmlns:w="http://schemas.openxmlformats.org/wordprocessingml/2006/main" xmlns:wp="http://schemas.openxmlformats.org/drawingml/2006/wordprocessingDrawing" xmlns:r="http://schemas.openxmlformats.org/officeDocument/2006/relationships" xmlns:w14="http://schemas.microsoft.com/office/word/2010/wordml">
-                    <w:rPr>
-                      <w:rFonts w:ascii="Aptos" w:hAnsi="Aptos" w:eastAsia="Aptos" w:cs="Aptos"/>
-                      <w:i w:val="false"/>
-                      <w:b w:val="false"/>
-                      <w:u w:val="none"/>
-                      <w:strike w:val="false"/>
-                      <w:sz w:val="16"/>
-                      <w:szCs w:val="16"/>
+                      <w:sz w:val="18"/>
+                      <w:szCs w:val="18"/>
+                      <w:color w:val="000000"/>
+                    </w:rPr>
+                  </w:pPr>
+                  <w:r xmlns:w="http://schemas.openxmlformats.org/wordprocessingml/2006/main" xmlns:wp="http://schemas.openxmlformats.org/drawingml/2006/wordprocessingDrawing" xmlns:r="http://schemas.openxmlformats.org/officeDocument/2006/relationships" xmlns:w14="http://schemas.microsoft.com/office/word/2010/wordml">
+                    <w:rPr>
+                      <w:rFonts w:ascii="Aptos" w:hAnsi="Aptos" w:eastAsia="Aptos" w:cs="Aptos"/>
+                      <w:i w:val="false"/>
+                      <w:b w:val="false"/>
+                      <w:u w:val="none"/>
+                      <w:strike w:val="false"/>
+                      <w:sz w:val="18"/>
+                      <w:szCs w:val="18"/>
                       <w:color w:val="000000"/>
                     </w:rPr>
                     <w:t xml:space="preserve">8</w:t>
@@ -2426,20 +2475,20 @@
                       <w:b w:val="false"/>
                       <w:u w:val="none"/>
                       <w:strike w:val="false"/>
-                      <w:sz w:val="16"/>
-                      <w:szCs w:val="16"/>
-                      <w:color w:val="000000"/>
-                    </w:rPr>
-                  </w:pPr>
-                  <w:r xmlns:w="http://schemas.openxmlformats.org/wordprocessingml/2006/main" xmlns:wp="http://schemas.openxmlformats.org/drawingml/2006/wordprocessingDrawing" xmlns:r="http://schemas.openxmlformats.org/officeDocument/2006/relationships" xmlns:w14="http://schemas.microsoft.com/office/word/2010/wordml">
-                    <w:rPr>
-                      <w:rFonts w:ascii="Aptos" w:hAnsi="Aptos" w:eastAsia="Aptos" w:cs="Aptos"/>
-                      <w:i w:val="false"/>
-                      <w:b w:val="false"/>
-                      <w:u w:val="none"/>
-                      <w:strike w:val="false"/>
-                      <w:sz w:val="16"/>
-                      <w:szCs w:val="16"/>
+                      <w:sz w:val="18"/>
+                      <w:szCs w:val="18"/>
+                      <w:color w:val="000000"/>
+                    </w:rPr>
+                  </w:pPr>
+                  <w:r xmlns:w="http://schemas.openxmlformats.org/wordprocessingml/2006/main" xmlns:wp="http://schemas.openxmlformats.org/drawingml/2006/wordprocessingDrawing" xmlns:r="http://schemas.openxmlformats.org/officeDocument/2006/relationships" xmlns:w14="http://schemas.microsoft.com/office/word/2010/wordml">
+                    <w:rPr>
+                      <w:rFonts w:ascii="Aptos" w:hAnsi="Aptos" w:eastAsia="Aptos" w:cs="Aptos"/>
+                      <w:i w:val="false"/>
+                      <w:b w:val="false"/>
+                      <w:u w:val="none"/>
+                      <w:strike w:val="false"/>
+                      <w:sz w:val="18"/>
+                      <w:szCs w:val="18"/>
                       <w:color w:val="000000"/>
                     </w:rPr>
                     <w:t xml:space="preserve">SGGW</w:t>
@@ -2480,20 +2529,20 @@
                       <w:b w:val="false"/>
                       <w:u w:val="none"/>
                       <w:strike w:val="false"/>
-                      <w:sz w:val="16"/>
-                      <w:szCs w:val="16"/>
-                      <w:color w:val="000000"/>
-                    </w:rPr>
-                  </w:pPr>
-                  <w:r xmlns:w="http://schemas.openxmlformats.org/wordprocessingml/2006/main" xmlns:wp="http://schemas.openxmlformats.org/drawingml/2006/wordprocessingDrawing" xmlns:r="http://schemas.openxmlformats.org/officeDocument/2006/relationships" xmlns:w14="http://schemas.microsoft.com/office/word/2010/wordml">
-                    <w:rPr>
-                      <w:rFonts w:ascii="Aptos" w:hAnsi="Aptos" w:eastAsia="Aptos" w:cs="Aptos"/>
-                      <w:i w:val="false"/>
-                      <w:b w:val="false"/>
-                      <w:u w:val="none"/>
-                      <w:strike w:val="false"/>
-                      <w:sz w:val="16"/>
-                      <w:szCs w:val="16"/>
+                      <w:sz w:val="18"/>
+                      <w:szCs w:val="18"/>
+                      <w:color w:val="000000"/>
+                    </w:rPr>
+                  </w:pPr>
+                  <w:r xmlns:w="http://schemas.openxmlformats.org/wordprocessingml/2006/main" xmlns:wp="http://schemas.openxmlformats.org/drawingml/2006/wordprocessingDrawing" xmlns:r="http://schemas.openxmlformats.org/officeDocument/2006/relationships" xmlns:w14="http://schemas.microsoft.com/office/word/2010/wordml">
+                    <w:rPr>
+                      <w:rFonts w:ascii="Aptos" w:hAnsi="Aptos" w:eastAsia="Aptos" w:cs="Aptos"/>
+                      <w:i w:val="false"/>
+                      <w:b w:val="false"/>
+                      <w:u w:val="none"/>
+                      <w:strike w:val="false"/>
+                      <w:sz w:val="18"/>
+                      <w:szCs w:val="18"/>
                       <w:color w:val="000000"/>
                     </w:rPr>
                     <w:t xml:space="preserve">A</w:t>
@@ -2534,20 +2583,20 @@
                       <w:b w:val="false"/>
                       <w:u w:val="none"/>
                       <w:strike w:val="false"/>
-                      <w:sz w:val="16"/>
-                      <w:szCs w:val="16"/>
-                      <w:color w:val="000000"/>
-                    </w:rPr>
-                  </w:pPr>
-                  <w:r xmlns:w="http://schemas.openxmlformats.org/wordprocessingml/2006/main" xmlns:wp="http://schemas.openxmlformats.org/drawingml/2006/wordprocessingDrawing" xmlns:r="http://schemas.openxmlformats.org/officeDocument/2006/relationships" xmlns:w14="http://schemas.microsoft.com/office/word/2010/wordml">
-                    <w:rPr>
-                      <w:rFonts w:ascii="Aptos" w:hAnsi="Aptos" w:eastAsia="Aptos" w:cs="Aptos"/>
-                      <w:i w:val="false"/>
-                      <w:b w:val="false"/>
-                      <w:u w:val="none"/>
-                      <w:strike w:val="false"/>
-                      <w:sz w:val="16"/>
-                      <w:szCs w:val="16"/>
+                      <w:sz w:val="18"/>
+                      <w:szCs w:val="18"/>
+                      <w:color w:val="000000"/>
+                    </w:rPr>
+                  </w:pPr>
+                  <w:r xmlns:w="http://schemas.openxmlformats.org/wordprocessingml/2006/main" xmlns:wp="http://schemas.openxmlformats.org/drawingml/2006/wordprocessingDrawing" xmlns:r="http://schemas.openxmlformats.org/officeDocument/2006/relationships" xmlns:w14="http://schemas.microsoft.com/office/word/2010/wordml">
+                    <w:rPr>
+                      <w:rFonts w:ascii="Aptos" w:hAnsi="Aptos" w:eastAsia="Aptos" w:cs="Aptos"/>
+                      <w:i w:val="false"/>
+                      <w:b w:val="false"/>
+                      <w:u w:val="none"/>
+                      <w:strike w:val="false"/>
+                      <w:sz w:val="18"/>
+                      <w:szCs w:val="18"/>
                       <w:color w:val="000000"/>
                     </w:rPr>
                     <w:t xml:space="preserve">112</w:t>
@@ -2588,23 +2637,23 @@
                       <w:b w:val="false"/>
                       <w:u w:val="none"/>
                       <w:strike w:val="false"/>
-                      <w:sz w:val="16"/>
-                      <w:szCs w:val="16"/>
-                      <w:color w:val="000000"/>
-                    </w:rPr>
-                  </w:pPr>
-                  <w:r xmlns:w="http://schemas.openxmlformats.org/wordprocessingml/2006/main" xmlns:wp="http://schemas.openxmlformats.org/drawingml/2006/wordprocessingDrawing" xmlns:r="http://schemas.openxmlformats.org/officeDocument/2006/relationships" xmlns:w14="http://schemas.microsoft.com/office/word/2010/wordml">
-                    <w:rPr>
-                      <w:rFonts w:ascii="Aptos" w:hAnsi="Aptos" w:eastAsia="Aptos" w:cs="Aptos"/>
-                      <w:i w:val="false"/>
-                      <w:b w:val="false"/>
-                      <w:u w:val="none"/>
-                      <w:strike w:val="false"/>
-                      <w:sz w:val="16"/>
-                      <w:szCs w:val="16"/>
-                      <w:color w:val="000000"/>
-                    </w:rPr>
-                    <w:t xml:space="preserve">59</w:t>
+                      <w:sz w:val="18"/>
+                      <w:szCs w:val="18"/>
+                      <w:color w:val="000000"/>
+                    </w:rPr>
+                  </w:pPr>
+                  <w:r xmlns:w="http://schemas.openxmlformats.org/wordprocessingml/2006/main" xmlns:wp="http://schemas.openxmlformats.org/drawingml/2006/wordprocessingDrawing" xmlns:r="http://schemas.openxmlformats.org/officeDocument/2006/relationships" xmlns:w14="http://schemas.microsoft.com/office/word/2010/wordml">
+                    <w:rPr>
+                      <w:rFonts w:ascii="Aptos" w:hAnsi="Aptos" w:eastAsia="Aptos" w:cs="Aptos"/>
+                      <w:i w:val="false"/>
+                      <w:b w:val="false"/>
+                      <w:u w:val="none"/>
+                      <w:strike w:val="false"/>
+                      <w:sz w:val="18"/>
+                      <w:szCs w:val="18"/>
+                      <w:color w:val="000000"/>
+                    </w:rPr>
+                    <w:t xml:space="preserve">10</w:t>
                   </w:r>
                 </w:p>
               </w:tc>
@@ -2642,23 +2691,23 @@
                       <w:b w:val="false"/>
                       <w:u w:val="none"/>
                       <w:strike w:val="false"/>
-                      <w:sz w:val="16"/>
-                      <w:szCs w:val="16"/>
-                      <w:color w:val="000000"/>
-                    </w:rPr>
-                  </w:pPr>
-                  <w:r xmlns:w="http://schemas.openxmlformats.org/wordprocessingml/2006/main" xmlns:wp="http://schemas.openxmlformats.org/drawingml/2006/wordprocessingDrawing" xmlns:r="http://schemas.openxmlformats.org/officeDocument/2006/relationships" xmlns:w14="http://schemas.microsoft.com/office/word/2010/wordml">
-                    <w:rPr>
-                      <w:rFonts w:ascii="Aptos" w:hAnsi="Aptos" w:eastAsia="Aptos" w:cs="Aptos"/>
-                      <w:i w:val="false"/>
-                      <w:b w:val="false"/>
-                      <w:u w:val="none"/>
-                      <w:strike w:val="false"/>
-                      <w:sz w:val="16"/>
-                      <w:szCs w:val="16"/>
-                      <w:color w:val="000000"/>
-                    </w:rPr>
-                    <w:t xml:space="preserve">30</w:t>
+                      <w:sz w:val="18"/>
+                      <w:szCs w:val="18"/>
+                      <w:color w:val="000000"/>
+                    </w:rPr>
+                  </w:pPr>
+                  <w:r xmlns:w="http://schemas.openxmlformats.org/wordprocessingml/2006/main" xmlns:wp="http://schemas.openxmlformats.org/drawingml/2006/wordprocessingDrawing" xmlns:r="http://schemas.openxmlformats.org/officeDocument/2006/relationships" xmlns:w14="http://schemas.microsoft.com/office/word/2010/wordml">
+                    <w:rPr>
+                      <w:rFonts w:ascii="Aptos" w:hAnsi="Aptos" w:eastAsia="Aptos" w:cs="Aptos"/>
+                      <w:i w:val="false"/>
+                      <w:b w:val="false"/>
+                      <w:u w:val="none"/>
+                      <w:strike w:val="false"/>
+                      <w:sz w:val="18"/>
+                      <w:szCs w:val="18"/>
+                      <w:color w:val="000000"/>
+                    </w:rPr>
+                    <w:t xml:space="preserve">59</w:t>
                   </w:r>
                 </w:p>
               </w:tc>
@@ -2696,23 +2745,23 @@
                       <w:b w:val="false"/>
                       <w:u w:val="none"/>
                       <w:strike w:val="false"/>
-                      <w:sz w:val="16"/>
-                      <w:szCs w:val="16"/>
-                      <w:color w:val="000000"/>
-                    </w:rPr>
-                  </w:pPr>
-                  <w:r xmlns:w="http://schemas.openxmlformats.org/wordprocessingml/2006/main" xmlns:wp="http://schemas.openxmlformats.org/drawingml/2006/wordprocessingDrawing" xmlns:r="http://schemas.openxmlformats.org/officeDocument/2006/relationships" xmlns:w14="http://schemas.microsoft.com/office/word/2010/wordml">
-                    <w:rPr>
-                      <w:rFonts w:ascii="Aptos" w:hAnsi="Aptos" w:eastAsia="Aptos" w:cs="Aptos"/>
-                      <w:i w:val="false"/>
-                      <w:b w:val="false"/>
-                      <w:u w:val="none"/>
-                      <w:strike w:val="false"/>
-                      <w:sz w:val="16"/>
-                      <w:szCs w:val="16"/>
-                      <w:color w:val="000000"/>
-                    </w:rPr>
-                    <w:t xml:space="preserve">13</w:t>
+                      <w:sz w:val="18"/>
+                      <w:szCs w:val="18"/>
+                      <w:color w:val="000000"/>
+                    </w:rPr>
+                  </w:pPr>
+                  <w:r xmlns:w="http://schemas.openxmlformats.org/wordprocessingml/2006/main" xmlns:wp="http://schemas.openxmlformats.org/drawingml/2006/wordprocessingDrawing" xmlns:r="http://schemas.openxmlformats.org/officeDocument/2006/relationships" xmlns:w14="http://schemas.microsoft.com/office/word/2010/wordml">
+                    <w:rPr>
+                      <w:rFonts w:ascii="Aptos" w:hAnsi="Aptos" w:eastAsia="Aptos" w:cs="Aptos"/>
+                      <w:i w:val="false"/>
+                      <w:b w:val="false"/>
+                      <w:u w:val="none"/>
+                      <w:strike w:val="false"/>
+                      <w:sz w:val="18"/>
+                      <w:szCs w:val="18"/>
+                      <w:color w:val="000000"/>
+                    </w:rPr>
+                    <w:t xml:space="preserve">30</w:t>
                   </w:r>
                 </w:p>
               </w:tc>
@@ -2750,23 +2799,23 @@
                       <w:b w:val="false"/>
                       <w:u w:val="none"/>
                       <w:strike w:val="false"/>
-                      <w:sz w:val="16"/>
-                      <w:szCs w:val="16"/>
-                      <w:color w:val="000000"/>
-                    </w:rPr>
-                  </w:pPr>
-                  <w:r xmlns:w="http://schemas.openxmlformats.org/wordprocessingml/2006/main" xmlns:wp="http://schemas.openxmlformats.org/drawingml/2006/wordprocessingDrawing" xmlns:r="http://schemas.openxmlformats.org/officeDocument/2006/relationships" xmlns:w14="http://schemas.microsoft.com/office/word/2010/wordml">
-                    <w:rPr>
-                      <w:rFonts w:ascii="Aptos" w:hAnsi="Aptos" w:eastAsia="Aptos" w:cs="Aptos"/>
-                      <w:i w:val="false"/>
-                      <w:b w:val="false"/>
-                      <w:u w:val="none"/>
-                      <w:strike w:val="false"/>
-                      <w:sz w:val="16"/>
-                      <w:szCs w:val="16"/>
-                      <w:color w:val="000000"/>
-                    </w:rPr>
-                    <w:t xml:space="preserve">10</w:t>
+                      <w:sz w:val="18"/>
+                      <w:szCs w:val="18"/>
+                      <w:color w:val="000000"/>
+                    </w:rPr>
+                  </w:pPr>
+                  <w:r xmlns:w="http://schemas.openxmlformats.org/wordprocessingml/2006/main" xmlns:wp="http://schemas.openxmlformats.org/drawingml/2006/wordprocessingDrawing" xmlns:r="http://schemas.openxmlformats.org/officeDocument/2006/relationships" xmlns:w14="http://schemas.microsoft.com/office/word/2010/wordml">
+                    <w:rPr>
+                      <w:rFonts w:ascii="Aptos" w:hAnsi="Aptos" w:eastAsia="Aptos" w:cs="Aptos"/>
+                      <w:i w:val="false"/>
+                      <w:b w:val="false"/>
+                      <w:u w:val="none"/>
+                      <w:strike w:val="false"/>
+                      <w:sz w:val="18"/>
+                      <w:szCs w:val="18"/>
+                      <w:color w:val="000000"/>
+                    </w:rPr>
+                    <w:t xml:space="preserve">13</w:t>
                   </w:r>
                 </w:p>
               </w:tc>
@@ -2804,20 +2853,20 @@
                       <w:b w:val="false"/>
                       <w:u w:val="none"/>
                       <w:strike w:val="false"/>
-                      <w:sz w:val="16"/>
-                      <w:szCs w:val="16"/>
-                      <w:color w:val="000000"/>
-                    </w:rPr>
-                  </w:pPr>
-                  <w:r xmlns:w="http://schemas.openxmlformats.org/wordprocessingml/2006/main" xmlns:wp="http://schemas.openxmlformats.org/drawingml/2006/wordprocessingDrawing" xmlns:r="http://schemas.openxmlformats.org/officeDocument/2006/relationships" xmlns:w14="http://schemas.microsoft.com/office/word/2010/wordml">
-                    <w:rPr>
-                      <w:rFonts w:ascii="Aptos" w:hAnsi="Aptos" w:eastAsia="Aptos" w:cs="Aptos"/>
-                      <w:i w:val="false"/>
-                      <w:b w:val="false"/>
-                      <w:u w:val="none"/>
-                      <w:strike w:val="false"/>
-                      <w:sz w:val="16"/>
-                      <w:szCs w:val="16"/>
+                      <w:sz w:val="18"/>
+                      <w:szCs w:val="18"/>
+                      <w:color w:val="000000"/>
+                    </w:rPr>
+                  </w:pPr>
+                  <w:r xmlns:w="http://schemas.openxmlformats.org/wordprocessingml/2006/main" xmlns:wp="http://schemas.openxmlformats.org/drawingml/2006/wordprocessingDrawing" xmlns:r="http://schemas.openxmlformats.org/officeDocument/2006/relationships" xmlns:w14="http://schemas.microsoft.com/office/word/2010/wordml">
+                    <w:rPr>
+                      <w:rFonts w:ascii="Aptos" w:hAnsi="Aptos" w:eastAsia="Aptos" w:cs="Aptos"/>
+                      <w:i w:val="false"/>
+                      <w:b w:val="false"/>
+                      <w:u w:val="none"/>
+                      <w:strike w:val="false"/>
+                      <w:sz w:val="18"/>
+                      <w:szCs w:val="18"/>
                       <w:color w:val="000000"/>
                     </w:rPr>
                     <w:t xml:space="preserve">89,3 %</w:t>
@@ -2858,20 +2907,20 @@
                       <w:b w:val="false"/>
                       <w:u w:val="none"/>
                       <w:strike w:val="false"/>
-                      <w:sz w:val="16"/>
-                      <w:szCs w:val="16"/>
-                      <w:color w:val="000000"/>
-                    </w:rPr>
-                  </w:pPr>
-                  <w:r xmlns:w="http://schemas.openxmlformats.org/wordprocessingml/2006/main" xmlns:wp="http://schemas.openxmlformats.org/drawingml/2006/wordprocessingDrawing" xmlns:r="http://schemas.openxmlformats.org/officeDocument/2006/relationships" xmlns:w14="http://schemas.microsoft.com/office/word/2010/wordml">
-                    <w:rPr>
-                      <w:rFonts w:ascii="Aptos" w:hAnsi="Aptos" w:eastAsia="Aptos" w:cs="Aptos"/>
-                      <w:i w:val="false"/>
-                      <w:b w:val="false"/>
-                      <w:u w:val="none"/>
-                      <w:strike w:val="false"/>
-                      <w:sz w:val="16"/>
-                      <w:szCs w:val="16"/>
+                      <w:sz w:val="18"/>
+                      <w:szCs w:val="18"/>
+                      <w:color w:val="000000"/>
+                    </w:rPr>
+                  </w:pPr>
+                  <w:r xmlns:w="http://schemas.openxmlformats.org/wordprocessingml/2006/main" xmlns:wp="http://schemas.openxmlformats.org/drawingml/2006/wordprocessingDrawing" xmlns:r="http://schemas.openxmlformats.org/officeDocument/2006/relationships" xmlns:w14="http://schemas.microsoft.com/office/word/2010/wordml">
+                    <w:rPr>
+                      <w:rFonts w:ascii="Aptos" w:hAnsi="Aptos" w:eastAsia="Aptos" w:cs="Aptos"/>
+                      <w:i w:val="false"/>
+                      <w:b w:val="false"/>
+                      <w:u w:val="none"/>
+                      <w:strike w:val="false"/>
+                      <w:sz w:val="18"/>
+                      <w:szCs w:val="18"/>
                       <w:color w:val="000000"/>
                     </w:rPr>
                     <w:t xml:space="preserve">46</w:t>
@@ -2912,20 +2961,20 @@
                       <w:b w:val="false"/>
                       <w:u w:val="none"/>
                       <w:strike w:val="false"/>
-                      <w:sz w:val="16"/>
-                      <w:szCs w:val="16"/>
-                      <w:color w:val="000000"/>
-                    </w:rPr>
-                  </w:pPr>
-                  <w:r xmlns:w="http://schemas.openxmlformats.org/wordprocessingml/2006/main" xmlns:wp="http://schemas.openxmlformats.org/drawingml/2006/wordprocessingDrawing" xmlns:r="http://schemas.openxmlformats.org/officeDocument/2006/relationships" xmlns:w14="http://schemas.microsoft.com/office/word/2010/wordml">
-                    <w:rPr>
-                      <w:rFonts w:ascii="Aptos" w:hAnsi="Aptos" w:eastAsia="Aptos" w:cs="Aptos"/>
-                      <w:i w:val="false"/>
-                      <w:b w:val="false"/>
-                      <w:u w:val="none"/>
-                      <w:strike w:val="false"/>
-                      <w:sz w:val="16"/>
-                      <w:szCs w:val="16"/>
+                      <w:sz w:val="18"/>
+                      <w:szCs w:val="18"/>
+                      <w:color w:val="000000"/>
+                    </w:rPr>
+                  </w:pPr>
+                  <w:r xmlns:w="http://schemas.openxmlformats.org/wordprocessingml/2006/main" xmlns:wp="http://schemas.openxmlformats.org/drawingml/2006/wordprocessingDrawing" xmlns:r="http://schemas.openxmlformats.org/officeDocument/2006/relationships" xmlns:w14="http://schemas.microsoft.com/office/word/2010/wordml">
+                    <w:rPr>
+                      <w:rFonts w:ascii="Aptos" w:hAnsi="Aptos" w:eastAsia="Aptos" w:cs="Aptos"/>
+                      <w:i w:val="false"/>
+                      <w:b w:val="false"/>
+                      <w:u w:val="none"/>
+                      <w:strike w:val="false"/>
+                      <w:sz w:val="18"/>
+                      <w:szCs w:val="18"/>
                       <w:color w:val="000000"/>
                     </w:rPr>
                     <w:t xml:space="preserve">50,2</w:t>
@@ -2966,20 +3015,20 @@
                       <w:b w:val="false"/>
                       <w:u w:val="none"/>
                       <w:strike w:val="false"/>
-                      <w:sz w:val="16"/>
-                      <w:szCs w:val="16"/>
-                      <w:color w:val="000000"/>
-                    </w:rPr>
-                  </w:pPr>
-                  <w:r xmlns:w="http://schemas.openxmlformats.org/wordprocessingml/2006/main" xmlns:wp="http://schemas.openxmlformats.org/drawingml/2006/wordprocessingDrawing" xmlns:r="http://schemas.openxmlformats.org/officeDocument/2006/relationships" xmlns:w14="http://schemas.microsoft.com/office/word/2010/wordml">
-                    <w:rPr>
-                      <w:rFonts w:ascii="Aptos" w:hAnsi="Aptos" w:eastAsia="Aptos" w:cs="Aptos"/>
-                      <w:i w:val="false"/>
-                      <w:b w:val="false"/>
-                      <w:u w:val="none"/>
-                      <w:strike w:val="false"/>
-                      <w:sz w:val="16"/>
-                      <w:szCs w:val="16"/>
+                      <w:sz w:val="18"/>
+                      <w:szCs w:val="18"/>
+                      <w:color w:val="000000"/>
+                    </w:rPr>
+                  </w:pPr>
+                  <w:r xmlns:w="http://schemas.openxmlformats.org/wordprocessingml/2006/main" xmlns:wp="http://schemas.openxmlformats.org/drawingml/2006/wordprocessingDrawing" xmlns:r="http://schemas.openxmlformats.org/officeDocument/2006/relationships" xmlns:w14="http://schemas.microsoft.com/office/word/2010/wordml">
+                    <w:rPr>
+                      <w:rFonts w:ascii="Aptos" w:hAnsi="Aptos" w:eastAsia="Aptos" w:cs="Aptos"/>
+                      <w:i w:val="false"/>
+                      <w:b w:val="false"/>
+                      <w:u w:val="none"/>
+                      <w:strike w:val="false"/>
+                      <w:sz w:val="18"/>
+                      <w:szCs w:val="18"/>
                       <w:color w:val="000000"/>
                     </w:rPr>
                     <w:t xml:space="preserve">8</w:t>
@@ -3025,20 +3074,20 @@
                       <w:b w:val="false"/>
                       <w:u w:val="none"/>
                       <w:strike w:val="false"/>
-                      <w:sz w:val="16"/>
-                      <w:szCs w:val="16"/>
-                      <w:color w:val="000000"/>
-                    </w:rPr>
-                  </w:pPr>
-                  <w:r xmlns:w="http://schemas.openxmlformats.org/wordprocessingml/2006/main" xmlns:wp="http://schemas.openxmlformats.org/drawingml/2006/wordprocessingDrawing" xmlns:r="http://schemas.openxmlformats.org/officeDocument/2006/relationships" xmlns:w14="http://schemas.microsoft.com/office/word/2010/wordml">
-                    <w:rPr>
-                      <w:rFonts w:ascii="Aptos" w:hAnsi="Aptos" w:eastAsia="Aptos" w:cs="Aptos"/>
-                      <w:i w:val="false"/>
-                      <w:b w:val="false"/>
-                      <w:u w:val="none"/>
-                      <w:strike w:val="false"/>
-                      <w:sz w:val="16"/>
-                      <w:szCs w:val="16"/>
+                      <w:sz w:val="18"/>
+                      <w:szCs w:val="18"/>
+                      <w:color w:val="000000"/>
+                    </w:rPr>
+                  </w:pPr>
+                  <w:r xmlns:w="http://schemas.openxmlformats.org/wordprocessingml/2006/main" xmlns:wp="http://schemas.openxmlformats.org/drawingml/2006/wordprocessingDrawing" xmlns:r="http://schemas.openxmlformats.org/officeDocument/2006/relationships" xmlns:w14="http://schemas.microsoft.com/office/word/2010/wordml">
+                    <w:rPr>
+                      <w:rFonts w:ascii="Aptos" w:hAnsi="Aptos" w:eastAsia="Aptos" w:cs="Aptos"/>
+                      <w:i w:val="false"/>
+                      <w:b w:val="false"/>
+                      <w:u w:val="none"/>
+                      <w:strike w:val="false"/>
+                      <w:sz w:val="18"/>
+                      <w:szCs w:val="18"/>
                       <w:color w:val="000000"/>
                     </w:rPr>
                     <w:t xml:space="preserve">URK</w:t>
@@ -3079,20 +3128,20 @@
                       <w:b w:val="false"/>
                       <w:u w:val="none"/>
                       <w:strike w:val="false"/>
-                      <w:sz w:val="16"/>
-                      <w:szCs w:val="16"/>
-                      <w:color w:val="000000"/>
-                    </w:rPr>
-                  </w:pPr>
-                  <w:r xmlns:w="http://schemas.openxmlformats.org/wordprocessingml/2006/main" xmlns:wp="http://schemas.openxmlformats.org/drawingml/2006/wordprocessingDrawing" xmlns:r="http://schemas.openxmlformats.org/officeDocument/2006/relationships" xmlns:w14="http://schemas.microsoft.com/office/word/2010/wordml">
-                    <w:rPr>
-                      <w:rFonts w:ascii="Aptos" w:hAnsi="Aptos" w:eastAsia="Aptos" w:cs="Aptos"/>
-                      <w:i w:val="false"/>
-                      <w:b w:val="false"/>
-                      <w:u w:val="none"/>
-                      <w:strike w:val="false"/>
-                      <w:sz w:val="16"/>
-                      <w:szCs w:val="16"/>
+                      <w:sz w:val="18"/>
+                      <w:szCs w:val="18"/>
+                      <w:color w:val="000000"/>
+                    </w:rPr>
+                  </w:pPr>
+                  <w:r xmlns:w="http://schemas.openxmlformats.org/wordprocessingml/2006/main" xmlns:wp="http://schemas.openxmlformats.org/drawingml/2006/wordprocessingDrawing" xmlns:r="http://schemas.openxmlformats.org/officeDocument/2006/relationships" xmlns:w14="http://schemas.microsoft.com/office/word/2010/wordml">
+                    <w:rPr>
+                      <w:rFonts w:ascii="Aptos" w:hAnsi="Aptos" w:eastAsia="Aptos" w:cs="Aptos"/>
+                      <w:i w:val="false"/>
+                      <w:b w:val="false"/>
+                      <w:u w:val="none"/>
+                      <w:strike w:val="false"/>
+                      <w:sz w:val="18"/>
+                      <w:szCs w:val="18"/>
                       <w:color w:val="000000"/>
                     </w:rPr>
                     <w:t xml:space="preserve">A</w:t>
@@ -3133,20 +3182,20 @@
                       <w:b w:val="false"/>
                       <w:u w:val="none"/>
                       <w:strike w:val="false"/>
-                      <w:sz w:val="16"/>
-                      <w:szCs w:val="16"/>
-                      <w:color w:val="000000"/>
-                    </w:rPr>
-                  </w:pPr>
-                  <w:r xmlns:w="http://schemas.openxmlformats.org/wordprocessingml/2006/main" xmlns:wp="http://schemas.openxmlformats.org/drawingml/2006/wordprocessingDrawing" xmlns:r="http://schemas.openxmlformats.org/officeDocument/2006/relationships" xmlns:w14="http://schemas.microsoft.com/office/word/2010/wordml">
-                    <w:rPr>
-                      <w:rFonts w:ascii="Aptos" w:hAnsi="Aptos" w:eastAsia="Aptos" w:cs="Aptos"/>
-                      <w:i w:val="false"/>
-                      <w:b w:val="false"/>
-                      <w:u w:val="none"/>
-                      <w:strike w:val="false"/>
-                      <w:sz w:val="16"/>
-                      <w:szCs w:val="16"/>
+                      <w:sz w:val="18"/>
+                      <w:szCs w:val="18"/>
+                      <w:color w:val="000000"/>
+                    </w:rPr>
+                  </w:pPr>
+                  <w:r xmlns:w="http://schemas.openxmlformats.org/wordprocessingml/2006/main" xmlns:wp="http://schemas.openxmlformats.org/drawingml/2006/wordprocessingDrawing" xmlns:r="http://schemas.openxmlformats.org/officeDocument/2006/relationships" xmlns:w14="http://schemas.microsoft.com/office/word/2010/wordml">
+                    <w:rPr>
+                      <w:rFonts w:ascii="Aptos" w:hAnsi="Aptos" w:eastAsia="Aptos" w:cs="Aptos"/>
+                      <w:i w:val="false"/>
+                      <w:b w:val="false"/>
+                      <w:u w:val="none"/>
+                      <w:strike w:val="false"/>
+                      <w:sz w:val="18"/>
+                      <w:szCs w:val="18"/>
                       <w:color w:val="000000"/>
                     </w:rPr>
                     <w:t xml:space="preserve">162</w:t>
@@ -3187,23 +3236,23 @@
                       <w:b w:val="false"/>
                       <w:u w:val="none"/>
                       <w:strike w:val="false"/>
-                      <w:sz w:val="16"/>
-                      <w:szCs w:val="16"/>
-                      <w:color w:val="000000"/>
-                    </w:rPr>
-                  </w:pPr>
-                  <w:r xmlns:w="http://schemas.openxmlformats.org/wordprocessingml/2006/main" xmlns:wp="http://schemas.openxmlformats.org/drawingml/2006/wordprocessingDrawing" xmlns:r="http://schemas.openxmlformats.org/officeDocument/2006/relationships" xmlns:w14="http://schemas.microsoft.com/office/word/2010/wordml">
-                    <w:rPr>
-                      <w:rFonts w:ascii="Aptos" w:hAnsi="Aptos" w:eastAsia="Aptos" w:cs="Aptos"/>
-                      <w:i w:val="false"/>
-                      <w:b w:val="false"/>
-                      <w:u w:val="none"/>
-                      <w:strike w:val="false"/>
-                      <w:sz w:val="16"/>
-                      <w:szCs w:val="16"/>
-                      <w:color w:val="000000"/>
-                    </w:rPr>
-                    <w:t xml:space="preserve">47</w:t>
+                      <w:sz w:val="18"/>
+                      <w:szCs w:val="18"/>
+                      <w:color w:val="000000"/>
+                    </w:rPr>
+                  </w:pPr>
+                  <w:r xmlns:w="http://schemas.openxmlformats.org/wordprocessingml/2006/main" xmlns:wp="http://schemas.openxmlformats.org/drawingml/2006/wordprocessingDrawing" xmlns:r="http://schemas.openxmlformats.org/officeDocument/2006/relationships" xmlns:w14="http://schemas.microsoft.com/office/word/2010/wordml">
+                    <w:rPr>
+                      <w:rFonts w:ascii="Aptos" w:hAnsi="Aptos" w:eastAsia="Aptos" w:cs="Aptos"/>
+                      <w:i w:val="false"/>
+                      <w:b w:val="false"/>
+                      <w:u w:val="none"/>
+                      <w:strike w:val="false"/>
+                      <w:sz w:val="18"/>
+                      <w:szCs w:val="18"/>
+                      <w:color w:val="000000"/>
+                    </w:rPr>
+                    <w:t xml:space="preserve">15</w:t>
                   </w:r>
                 </w:p>
               </w:tc>
@@ -3241,23 +3290,23 @@
                       <w:b w:val="false"/>
                       <w:u w:val="none"/>
                       <w:strike w:val="false"/>
-                      <w:sz w:val="16"/>
-                      <w:szCs w:val="16"/>
-                      <w:color w:val="000000"/>
-                    </w:rPr>
-                  </w:pPr>
-                  <w:r xmlns:w="http://schemas.openxmlformats.org/wordprocessingml/2006/main" xmlns:wp="http://schemas.openxmlformats.org/drawingml/2006/wordprocessingDrawing" xmlns:r="http://schemas.openxmlformats.org/officeDocument/2006/relationships" xmlns:w14="http://schemas.microsoft.com/office/word/2010/wordml">
-                    <w:rPr>
-                      <w:rFonts w:ascii="Aptos" w:hAnsi="Aptos" w:eastAsia="Aptos" w:cs="Aptos"/>
-                      <w:i w:val="false"/>
-                      <w:b w:val="false"/>
-                      <w:u w:val="none"/>
-                      <w:strike w:val="false"/>
-                      <w:sz w:val="16"/>
-                      <w:szCs w:val="16"/>
-                      <w:color w:val="000000"/>
-                    </w:rPr>
-                    <w:t xml:space="preserve">59</w:t>
+                      <w:sz w:val="18"/>
+                      <w:szCs w:val="18"/>
+                      <w:color w:val="000000"/>
+                    </w:rPr>
+                  </w:pPr>
+                  <w:r xmlns:w="http://schemas.openxmlformats.org/wordprocessingml/2006/main" xmlns:wp="http://schemas.openxmlformats.org/drawingml/2006/wordprocessingDrawing" xmlns:r="http://schemas.openxmlformats.org/officeDocument/2006/relationships" xmlns:w14="http://schemas.microsoft.com/office/word/2010/wordml">
+                    <w:rPr>
+                      <w:rFonts w:ascii="Aptos" w:hAnsi="Aptos" w:eastAsia="Aptos" w:cs="Aptos"/>
+                      <w:i w:val="false"/>
+                      <w:b w:val="false"/>
+                      <w:u w:val="none"/>
+                      <w:strike w:val="false"/>
+                      <w:sz w:val="18"/>
+                      <w:szCs w:val="18"/>
+                      <w:color w:val="000000"/>
+                    </w:rPr>
+                    <w:t xml:space="preserve">47</w:t>
                   </w:r>
                 </w:p>
               </w:tc>
@@ -3295,23 +3344,23 @@
                       <w:b w:val="false"/>
                       <w:u w:val="none"/>
                       <w:strike w:val="false"/>
-                      <w:sz w:val="16"/>
-                      <w:szCs w:val="16"/>
-                      <w:color w:val="000000"/>
-                    </w:rPr>
-                  </w:pPr>
-                  <w:r xmlns:w="http://schemas.openxmlformats.org/wordprocessingml/2006/main" xmlns:wp="http://schemas.openxmlformats.org/drawingml/2006/wordprocessingDrawing" xmlns:r="http://schemas.openxmlformats.org/officeDocument/2006/relationships" xmlns:w14="http://schemas.microsoft.com/office/word/2010/wordml">
-                    <w:rPr>
-                      <w:rFonts w:ascii="Aptos" w:hAnsi="Aptos" w:eastAsia="Aptos" w:cs="Aptos"/>
-                      <w:i w:val="false"/>
-                      <w:b w:val="false"/>
-                      <w:u w:val="none"/>
-                      <w:strike w:val="false"/>
-                      <w:sz w:val="16"/>
-                      <w:szCs w:val="16"/>
-                      <w:color w:val="000000"/>
-                    </w:rPr>
-                    <w:t xml:space="preserve">38</w:t>
+                      <w:sz w:val="18"/>
+                      <w:szCs w:val="18"/>
+                      <w:color w:val="000000"/>
+                    </w:rPr>
+                  </w:pPr>
+                  <w:r xmlns:w="http://schemas.openxmlformats.org/wordprocessingml/2006/main" xmlns:wp="http://schemas.openxmlformats.org/drawingml/2006/wordprocessingDrawing" xmlns:r="http://schemas.openxmlformats.org/officeDocument/2006/relationships" xmlns:w14="http://schemas.microsoft.com/office/word/2010/wordml">
+                    <w:rPr>
+                      <w:rFonts w:ascii="Aptos" w:hAnsi="Aptos" w:eastAsia="Aptos" w:cs="Aptos"/>
+                      <w:i w:val="false"/>
+                      <w:b w:val="false"/>
+                      <w:u w:val="none"/>
+                      <w:strike w:val="false"/>
+                      <w:sz w:val="18"/>
+                      <w:szCs w:val="18"/>
+                      <w:color w:val="000000"/>
+                    </w:rPr>
+                    <w:t xml:space="preserve">59</w:t>
                   </w:r>
                 </w:p>
               </w:tc>
@@ -3349,23 +3398,23 @@
                       <w:b w:val="false"/>
                       <w:u w:val="none"/>
                       <w:strike w:val="false"/>
-                      <w:sz w:val="16"/>
-                      <w:szCs w:val="16"/>
-                      <w:color w:val="000000"/>
-                    </w:rPr>
-                  </w:pPr>
-                  <w:r xmlns:w="http://schemas.openxmlformats.org/wordprocessingml/2006/main" xmlns:wp="http://schemas.openxmlformats.org/drawingml/2006/wordprocessingDrawing" xmlns:r="http://schemas.openxmlformats.org/officeDocument/2006/relationships" xmlns:w14="http://schemas.microsoft.com/office/word/2010/wordml">
-                    <w:rPr>
-                      <w:rFonts w:ascii="Aptos" w:hAnsi="Aptos" w:eastAsia="Aptos" w:cs="Aptos"/>
-                      <w:i w:val="false"/>
-                      <w:b w:val="false"/>
-                      <w:u w:val="none"/>
-                      <w:strike w:val="false"/>
-                      <w:sz w:val="16"/>
-                      <w:szCs w:val="16"/>
-                      <w:color w:val="000000"/>
-                    </w:rPr>
-                    <w:t xml:space="preserve">15</w:t>
+                      <w:sz w:val="18"/>
+                      <w:szCs w:val="18"/>
+                      <w:color w:val="000000"/>
+                    </w:rPr>
+                  </w:pPr>
+                  <w:r xmlns:w="http://schemas.openxmlformats.org/wordprocessingml/2006/main" xmlns:wp="http://schemas.openxmlformats.org/drawingml/2006/wordprocessingDrawing" xmlns:r="http://schemas.openxmlformats.org/officeDocument/2006/relationships" xmlns:w14="http://schemas.microsoft.com/office/word/2010/wordml">
+                    <w:rPr>
+                      <w:rFonts w:ascii="Aptos" w:hAnsi="Aptos" w:eastAsia="Aptos" w:cs="Aptos"/>
+                      <w:i w:val="false"/>
+                      <w:b w:val="false"/>
+                      <w:u w:val="none"/>
+                      <w:strike w:val="false"/>
+                      <w:sz w:val="18"/>
+                      <w:szCs w:val="18"/>
+                      <w:color w:val="000000"/>
+                    </w:rPr>
+                    <w:t xml:space="preserve">38</w:t>
                   </w:r>
                 </w:p>
               </w:tc>
@@ -3403,20 +3452,20 @@
                       <w:b w:val="false"/>
                       <w:u w:val="none"/>
                       <w:strike w:val="false"/>
-                      <w:sz w:val="16"/>
-                      <w:szCs w:val="16"/>
-                      <w:color w:val="000000"/>
-                    </w:rPr>
-                  </w:pPr>
-                  <w:r xmlns:w="http://schemas.openxmlformats.org/wordprocessingml/2006/main" xmlns:wp="http://schemas.openxmlformats.org/drawingml/2006/wordprocessingDrawing" xmlns:r="http://schemas.openxmlformats.org/officeDocument/2006/relationships" xmlns:w14="http://schemas.microsoft.com/office/word/2010/wordml">
-                    <w:rPr>
-                      <w:rFonts w:ascii="Aptos" w:hAnsi="Aptos" w:eastAsia="Aptos" w:cs="Aptos"/>
-                      <w:i w:val="false"/>
-                      <w:b w:val="false"/>
-                      <w:u w:val="none"/>
-                      <w:strike w:val="false"/>
-                      <w:sz w:val="16"/>
-                      <w:szCs w:val="16"/>
+                      <w:sz w:val="18"/>
+                      <w:szCs w:val="18"/>
+                      <w:color w:val="000000"/>
+                    </w:rPr>
+                  </w:pPr>
+                  <w:r xmlns:w="http://schemas.openxmlformats.org/wordprocessingml/2006/main" xmlns:wp="http://schemas.openxmlformats.org/drawingml/2006/wordprocessingDrawing" xmlns:r="http://schemas.openxmlformats.org/officeDocument/2006/relationships" xmlns:w14="http://schemas.microsoft.com/office/word/2010/wordml">
+                    <w:rPr>
+                      <w:rFonts w:ascii="Aptos" w:hAnsi="Aptos" w:eastAsia="Aptos" w:cs="Aptos"/>
+                      <w:i w:val="false"/>
+                      <w:b w:val="false"/>
+                      <w:u w:val="none"/>
+                      <w:strike w:val="false"/>
+                      <w:sz w:val="18"/>
+                      <w:szCs w:val="18"/>
                       <w:color w:val="000000"/>
                     </w:rPr>
                     <w:t xml:space="preserve">77,8 %</w:t>
@@ -3457,20 +3506,20 @@
                       <w:b w:val="false"/>
                       <w:u w:val="none"/>
                       <w:strike w:val="false"/>
-                      <w:sz w:val="16"/>
-                      <w:szCs w:val="16"/>
-                      <w:color w:val="000000"/>
-                    </w:rPr>
-                  </w:pPr>
-                  <w:r xmlns:w="http://schemas.openxmlformats.org/wordprocessingml/2006/main" xmlns:wp="http://schemas.openxmlformats.org/drawingml/2006/wordprocessingDrawing" xmlns:r="http://schemas.openxmlformats.org/officeDocument/2006/relationships" xmlns:w14="http://schemas.microsoft.com/office/word/2010/wordml">
-                    <w:rPr>
-                      <w:rFonts w:ascii="Aptos" w:hAnsi="Aptos" w:eastAsia="Aptos" w:cs="Aptos"/>
-                      <w:i w:val="false"/>
-                      <w:b w:val="false"/>
-                      <w:u w:val="none"/>
-                      <w:strike w:val="false"/>
-                      <w:sz w:val="16"/>
-                      <w:szCs w:val="16"/>
+                      <w:sz w:val="18"/>
+                      <w:szCs w:val="18"/>
+                      <w:color w:val="000000"/>
+                    </w:rPr>
+                  </w:pPr>
+                  <w:r xmlns:w="http://schemas.openxmlformats.org/wordprocessingml/2006/main" xmlns:wp="http://schemas.openxmlformats.org/drawingml/2006/wordprocessingDrawing" xmlns:r="http://schemas.openxmlformats.org/officeDocument/2006/relationships" xmlns:w14="http://schemas.microsoft.com/office/word/2010/wordml">
+                    <w:rPr>
+                      <w:rFonts w:ascii="Aptos" w:hAnsi="Aptos" w:eastAsia="Aptos" w:cs="Aptos"/>
+                      <w:i w:val="false"/>
+                      <w:b w:val="false"/>
+                      <w:u w:val="none"/>
+                      <w:strike w:val="false"/>
+                      <w:sz w:val="18"/>
+                      <w:szCs w:val="18"/>
                       <w:color w:val="000000"/>
                     </w:rPr>
                     <w:t xml:space="preserve">54</w:t>
@@ -3511,20 +3560,20 @@
                       <w:b w:val="false"/>
                       <w:u w:val="none"/>
                       <w:strike w:val="false"/>
-                      <w:sz w:val="16"/>
-                      <w:szCs w:val="16"/>
-                      <w:color w:val="000000"/>
-                    </w:rPr>
-                  </w:pPr>
-                  <w:r xmlns:w="http://schemas.openxmlformats.org/wordprocessingml/2006/main" xmlns:wp="http://schemas.openxmlformats.org/drawingml/2006/wordprocessingDrawing" xmlns:r="http://schemas.openxmlformats.org/officeDocument/2006/relationships" xmlns:w14="http://schemas.microsoft.com/office/word/2010/wordml">
-                    <w:rPr>
-                      <w:rFonts w:ascii="Aptos" w:hAnsi="Aptos" w:eastAsia="Aptos" w:cs="Aptos"/>
-                      <w:i w:val="false"/>
-                      <w:b w:val="false"/>
-                      <w:u w:val="none"/>
-                      <w:strike w:val="false"/>
-                      <w:sz w:val="16"/>
-                      <w:szCs w:val="16"/>
+                      <w:sz w:val="18"/>
+                      <w:szCs w:val="18"/>
+                      <w:color w:val="000000"/>
+                    </w:rPr>
+                  </w:pPr>
+                  <w:r xmlns:w="http://schemas.openxmlformats.org/wordprocessingml/2006/main" xmlns:wp="http://schemas.openxmlformats.org/drawingml/2006/wordprocessingDrawing" xmlns:r="http://schemas.openxmlformats.org/officeDocument/2006/relationships" xmlns:w14="http://schemas.microsoft.com/office/word/2010/wordml">
+                    <w:rPr>
+                      <w:rFonts w:ascii="Aptos" w:hAnsi="Aptos" w:eastAsia="Aptos" w:cs="Aptos"/>
+                      <w:i w:val="false"/>
+                      <w:b w:val="false"/>
+                      <w:u w:val="none"/>
+                      <w:strike w:val="false"/>
+                      <w:sz w:val="18"/>
+                      <w:szCs w:val="18"/>
                       <w:color w:val="000000"/>
                     </w:rPr>
                     <w:t xml:space="preserve">46,1</w:t>
@@ -3565,20 +3614,20 @@
                       <w:b w:val="false"/>
                       <w:u w:val="none"/>
                       <w:strike w:val="false"/>
-                      <w:sz w:val="16"/>
-                      <w:szCs w:val="16"/>
-                      <w:color w:val="000000"/>
-                    </w:rPr>
-                  </w:pPr>
-                  <w:r xmlns:w="http://schemas.openxmlformats.org/wordprocessingml/2006/main" xmlns:wp="http://schemas.openxmlformats.org/drawingml/2006/wordprocessingDrawing" xmlns:r="http://schemas.openxmlformats.org/officeDocument/2006/relationships" xmlns:w14="http://schemas.microsoft.com/office/word/2010/wordml">
-                    <w:rPr>
-                      <w:rFonts w:ascii="Aptos" w:hAnsi="Aptos" w:eastAsia="Aptos" w:cs="Aptos"/>
-                      <w:i w:val="false"/>
-                      <w:b w:val="false"/>
-                      <w:u w:val="none"/>
-                      <w:strike w:val="false"/>
-                      <w:sz w:val="16"/>
-                      <w:szCs w:val="16"/>
+                      <w:sz w:val="18"/>
+                      <w:szCs w:val="18"/>
+                      <w:color w:val="000000"/>
+                    </w:rPr>
+                  </w:pPr>
+                  <w:r xmlns:w="http://schemas.openxmlformats.org/wordprocessingml/2006/main" xmlns:wp="http://schemas.openxmlformats.org/drawingml/2006/wordprocessingDrawing" xmlns:r="http://schemas.openxmlformats.org/officeDocument/2006/relationships" xmlns:w14="http://schemas.microsoft.com/office/word/2010/wordml">
+                    <w:rPr>
+                      <w:rFonts w:ascii="Aptos" w:hAnsi="Aptos" w:eastAsia="Aptos" w:cs="Aptos"/>
+                      <w:i w:val="false"/>
+                      <w:b w:val="false"/>
+                      <w:u w:val="none"/>
+                      <w:strike w:val="false"/>
+                      <w:sz w:val="18"/>
+                      <w:szCs w:val="18"/>
                       <w:color w:val="000000"/>
                     </w:rPr>
                     <w:t xml:space="preserve">9</w:t>
@@ -3624,20 +3673,20 @@
                       <w:b w:val="false"/>
                       <w:u w:val="none"/>
                       <w:strike w:val="false"/>
-                      <w:sz w:val="16"/>
-                      <w:szCs w:val="16"/>
-                      <w:color w:val="000000"/>
-                    </w:rPr>
-                  </w:pPr>
-                  <w:r xmlns:w="http://schemas.openxmlformats.org/wordprocessingml/2006/main" xmlns:wp="http://schemas.openxmlformats.org/drawingml/2006/wordprocessingDrawing" xmlns:r="http://schemas.openxmlformats.org/officeDocument/2006/relationships" xmlns:w14="http://schemas.microsoft.com/office/word/2010/wordml">
-                    <w:rPr>
-                      <w:rFonts w:ascii="Aptos" w:hAnsi="Aptos" w:eastAsia="Aptos" w:cs="Aptos"/>
-                      <w:i w:val="false"/>
-                      <w:b w:val="false"/>
-                      <w:u w:val="none"/>
-                      <w:strike w:val="false"/>
-                      <w:sz w:val="16"/>
-                      <w:szCs w:val="16"/>
+                      <w:sz w:val="18"/>
+                      <w:szCs w:val="18"/>
+                      <w:color w:val="000000"/>
+                    </w:rPr>
+                  </w:pPr>
+                  <w:r xmlns:w="http://schemas.openxmlformats.org/wordprocessingml/2006/main" xmlns:wp="http://schemas.openxmlformats.org/drawingml/2006/wordprocessingDrawing" xmlns:r="http://schemas.openxmlformats.org/officeDocument/2006/relationships" xmlns:w14="http://schemas.microsoft.com/office/word/2010/wordml">
+                    <w:rPr>
+                      <w:rFonts w:ascii="Aptos" w:hAnsi="Aptos" w:eastAsia="Aptos" w:cs="Aptos"/>
+                      <w:i w:val="false"/>
+                      <w:b w:val="false"/>
+                      <w:u w:val="none"/>
+                      <w:strike w:val="false"/>
+                      <w:sz w:val="18"/>
+                      <w:szCs w:val="18"/>
                       <w:color w:val="000000"/>
                     </w:rPr>
                     <w:t xml:space="preserve">UWM</w:t>
@@ -3678,20 +3727,20 @@
                       <w:b w:val="false"/>
                       <w:u w:val="none"/>
                       <w:strike w:val="false"/>
-                      <w:sz w:val="16"/>
-                      <w:szCs w:val="16"/>
-                      <w:color w:val="000000"/>
-                    </w:rPr>
-                  </w:pPr>
-                  <w:r xmlns:w="http://schemas.openxmlformats.org/wordprocessingml/2006/main" xmlns:wp="http://schemas.openxmlformats.org/drawingml/2006/wordprocessingDrawing" xmlns:r="http://schemas.openxmlformats.org/officeDocument/2006/relationships" xmlns:w14="http://schemas.microsoft.com/office/word/2010/wordml">
-                    <w:rPr>
-                      <w:rFonts w:ascii="Aptos" w:hAnsi="Aptos" w:eastAsia="Aptos" w:cs="Aptos"/>
-                      <w:i w:val="false"/>
-                      <w:b w:val="false"/>
-                      <w:u w:val="none"/>
-                      <w:strike w:val="false"/>
-                      <w:sz w:val="16"/>
-                      <w:szCs w:val="16"/>
+                      <w:sz w:val="18"/>
+                      <w:szCs w:val="18"/>
+                      <w:color w:val="000000"/>
+                    </w:rPr>
+                  </w:pPr>
+                  <w:r xmlns:w="http://schemas.openxmlformats.org/wordprocessingml/2006/main" xmlns:wp="http://schemas.openxmlformats.org/drawingml/2006/wordprocessingDrawing" xmlns:r="http://schemas.openxmlformats.org/officeDocument/2006/relationships" xmlns:w14="http://schemas.microsoft.com/office/word/2010/wordml">
+                    <w:rPr>
+                      <w:rFonts w:ascii="Aptos" w:hAnsi="Aptos" w:eastAsia="Aptos" w:cs="Aptos"/>
+                      <w:i w:val="false"/>
+                      <w:b w:val="false"/>
+                      <w:u w:val="none"/>
+                      <w:strike w:val="false"/>
+                      <w:sz w:val="18"/>
+                      <w:szCs w:val="18"/>
                       <w:color w:val="000000"/>
                     </w:rPr>
                     <w:t xml:space="preserve">B+</w:t>
@@ -3732,20 +3781,20 @@
                       <w:b w:val="false"/>
                       <w:u w:val="none"/>
                       <w:strike w:val="false"/>
-                      <w:sz w:val="16"/>
-                      <w:szCs w:val="16"/>
-                      <w:color w:val="000000"/>
-                    </w:rPr>
-                  </w:pPr>
-                  <w:r xmlns:w="http://schemas.openxmlformats.org/wordprocessingml/2006/main" xmlns:wp="http://schemas.openxmlformats.org/drawingml/2006/wordprocessingDrawing" xmlns:r="http://schemas.openxmlformats.org/officeDocument/2006/relationships" xmlns:w14="http://schemas.microsoft.com/office/word/2010/wordml">
-                    <w:rPr>
-                      <w:rFonts w:ascii="Aptos" w:hAnsi="Aptos" w:eastAsia="Aptos" w:cs="Aptos"/>
-                      <w:i w:val="false"/>
-                      <w:b w:val="false"/>
-                      <w:u w:val="none"/>
-                      <w:strike w:val="false"/>
-                      <w:sz w:val="16"/>
-                      <w:szCs w:val="16"/>
+                      <w:sz w:val="18"/>
+                      <w:szCs w:val="18"/>
+                      <w:color w:val="000000"/>
+                    </w:rPr>
+                  </w:pPr>
+                  <w:r xmlns:w="http://schemas.openxmlformats.org/wordprocessingml/2006/main" xmlns:wp="http://schemas.openxmlformats.org/drawingml/2006/wordprocessingDrawing" xmlns:r="http://schemas.openxmlformats.org/officeDocument/2006/relationships" xmlns:w14="http://schemas.microsoft.com/office/word/2010/wordml">
+                    <w:rPr>
+                      <w:rFonts w:ascii="Aptos" w:hAnsi="Aptos" w:eastAsia="Aptos" w:cs="Aptos"/>
+                      <w:i w:val="false"/>
+                      <w:b w:val="false"/>
+                      <w:u w:val="none"/>
+                      <w:strike w:val="false"/>
+                      <w:sz w:val="18"/>
+                      <w:szCs w:val="18"/>
                       <w:color w:val="000000"/>
                     </w:rPr>
                     <w:t xml:space="preserve">70</w:t>
@@ -3786,23 +3835,23 @@
                       <w:b w:val="false"/>
                       <w:u w:val="none"/>
                       <w:strike w:val="false"/>
-                      <w:sz w:val="16"/>
-                      <w:szCs w:val="16"/>
-                      <w:color w:val="000000"/>
-                    </w:rPr>
-                  </w:pPr>
-                  <w:r xmlns:w="http://schemas.openxmlformats.org/wordprocessingml/2006/main" xmlns:wp="http://schemas.openxmlformats.org/drawingml/2006/wordprocessingDrawing" xmlns:r="http://schemas.openxmlformats.org/officeDocument/2006/relationships" xmlns:w14="http://schemas.microsoft.com/office/word/2010/wordml">
-                    <w:rPr>
-                      <w:rFonts w:ascii="Aptos" w:hAnsi="Aptos" w:eastAsia="Aptos" w:cs="Aptos"/>
-                      <w:i w:val="false"/>
-                      <w:b w:val="false"/>
-                      <w:u w:val="none"/>
-                      <w:strike w:val="false"/>
-                      <w:sz w:val="16"/>
-                      <w:szCs w:val="16"/>
-                      <w:color w:val="000000"/>
-                    </w:rPr>
-                    <w:t xml:space="preserve">17</w:t>
+                      <w:sz w:val="18"/>
+                      <w:szCs w:val="18"/>
+                      <w:color w:val="000000"/>
+                    </w:rPr>
+                  </w:pPr>
+                  <w:r xmlns:w="http://schemas.openxmlformats.org/wordprocessingml/2006/main" xmlns:wp="http://schemas.openxmlformats.org/drawingml/2006/wordprocessingDrawing" xmlns:r="http://schemas.openxmlformats.org/officeDocument/2006/relationships" xmlns:w14="http://schemas.microsoft.com/office/word/2010/wordml">
+                    <w:rPr>
+                      <w:rFonts w:ascii="Aptos" w:hAnsi="Aptos" w:eastAsia="Aptos" w:cs="Aptos"/>
+                      <w:i w:val="false"/>
+                      <w:b w:val="false"/>
+                      <w:u w:val="none"/>
+                      <w:strike w:val="false"/>
+                      <w:sz w:val="18"/>
+                      <w:szCs w:val="18"/>
+                      <w:color w:val="000000"/>
+                    </w:rPr>
+                    <w:t xml:space="preserve">0</w:t>
                   </w:r>
                 </w:p>
               </w:tc>
@@ -3840,23 +3889,23 @@
                       <w:b w:val="false"/>
                       <w:u w:val="none"/>
                       <w:strike w:val="false"/>
-                      <w:sz w:val="16"/>
-                      <w:szCs w:val="16"/>
-                      <w:color w:val="000000"/>
-                    </w:rPr>
-                  </w:pPr>
-                  <w:r xmlns:w="http://schemas.openxmlformats.org/wordprocessingml/2006/main" xmlns:wp="http://schemas.openxmlformats.org/drawingml/2006/wordprocessingDrawing" xmlns:r="http://schemas.openxmlformats.org/officeDocument/2006/relationships" xmlns:w14="http://schemas.microsoft.com/office/word/2010/wordml">
-                    <w:rPr>
-                      <w:rFonts w:ascii="Aptos" w:hAnsi="Aptos" w:eastAsia="Aptos" w:cs="Aptos"/>
-                      <w:i w:val="false"/>
-                      <w:b w:val="false"/>
-                      <w:u w:val="none"/>
-                      <w:strike w:val="false"/>
-                      <w:sz w:val="16"/>
-                      <w:szCs w:val="16"/>
-                      <w:color w:val="000000"/>
-                    </w:rPr>
-                    <w:t xml:space="preserve">34</w:t>
+                      <w:sz w:val="18"/>
+                      <w:szCs w:val="18"/>
+                      <w:color w:val="000000"/>
+                    </w:rPr>
+                  </w:pPr>
+                  <w:r xmlns:w="http://schemas.openxmlformats.org/wordprocessingml/2006/main" xmlns:wp="http://schemas.openxmlformats.org/drawingml/2006/wordprocessingDrawing" xmlns:r="http://schemas.openxmlformats.org/officeDocument/2006/relationships" xmlns:w14="http://schemas.microsoft.com/office/word/2010/wordml">
+                    <w:rPr>
+                      <w:rFonts w:ascii="Aptos" w:hAnsi="Aptos" w:eastAsia="Aptos" w:cs="Aptos"/>
+                      <w:i w:val="false"/>
+                      <w:b w:val="false"/>
+                      <w:u w:val="none"/>
+                      <w:strike w:val="false"/>
+                      <w:sz w:val="18"/>
+                      <w:szCs w:val="18"/>
+                      <w:color w:val="000000"/>
+                    </w:rPr>
+                    <w:t xml:space="preserve">17</w:t>
                   </w:r>
                 </w:p>
               </w:tc>
@@ -3894,23 +3943,23 @@
                       <w:b w:val="false"/>
                       <w:u w:val="none"/>
                       <w:strike w:val="false"/>
-                      <w:sz w:val="16"/>
-                      <w:szCs w:val="16"/>
-                      <w:color w:val="000000"/>
-                    </w:rPr>
-                  </w:pPr>
-                  <w:r xmlns:w="http://schemas.openxmlformats.org/wordprocessingml/2006/main" xmlns:wp="http://schemas.openxmlformats.org/drawingml/2006/wordprocessingDrawing" xmlns:r="http://schemas.openxmlformats.org/officeDocument/2006/relationships" xmlns:w14="http://schemas.microsoft.com/office/word/2010/wordml">
-                    <w:rPr>
-                      <w:rFonts w:ascii="Aptos" w:hAnsi="Aptos" w:eastAsia="Aptos" w:cs="Aptos"/>
-                      <w:i w:val="false"/>
-                      <w:b w:val="false"/>
-                      <w:u w:val="none"/>
-                      <w:strike w:val="false"/>
-                      <w:sz w:val="16"/>
-                      <w:szCs w:val="16"/>
-                      <w:color w:val="000000"/>
-                    </w:rPr>
-                    <w:t xml:space="preserve">19</w:t>
+                      <w:sz w:val="18"/>
+                      <w:szCs w:val="18"/>
+                      <w:color w:val="000000"/>
+                    </w:rPr>
+                  </w:pPr>
+                  <w:r xmlns:w="http://schemas.openxmlformats.org/wordprocessingml/2006/main" xmlns:wp="http://schemas.openxmlformats.org/drawingml/2006/wordprocessingDrawing" xmlns:r="http://schemas.openxmlformats.org/officeDocument/2006/relationships" xmlns:w14="http://schemas.microsoft.com/office/word/2010/wordml">
+                    <w:rPr>
+                      <w:rFonts w:ascii="Aptos" w:hAnsi="Aptos" w:eastAsia="Aptos" w:cs="Aptos"/>
+                      <w:i w:val="false"/>
+                      <w:b w:val="false"/>
+                      <w:u w:val="none"/>
+                      <w:strike w:val="false"/>
+                      <w:sz w:val="18"/>
+                      <w:szCs w:val="18"/>
+                      <w:color w:val="000000"/>
+                    </w:rPr>
+                    <w:t xml:space="preserve">34</w:t>
                   </w:r>
                 </w:p>
               </w:tc>
@@ -3948,23 +3997,23 @@
                       <w:b w:val="false"/>
                       <w:u w:val="none"/>
                       <w:strike w:val="false"/>
-                      <w:sz w:val="16"/>
-                      <w:szCs w:val="16"/>
-                      <w:color w:val="000000"/>
-                    </w:rPr>
-                  </w:pPr>
-                  <w:r xmlns:w="http://schemas.openxmlformats.org/wordprocessingml/2006/main" xmlns:wp="http://schemas.openxmlformats.org/drawingml/2006/wordprocessingDrawing" xmlns:r="http://schemas.openxmlformats.org/officeDocument/2006/relationships" xmlns:w14="http://schemas.microsoft.com/office/word/2010/wordml">
-                    <w:rPr>
-                      <w:rFonts w:ascii="Aptos" w:hAnsi="Aptos" w:eastAsia="Aptos" w:cs="Aptos"/>
-                      <w:i w:val="false"/>
-                      <w:b w:val="false"/>
-                      <w:u w:val="none"/>
-                      <w:strike w:val="false"/>
-                      <w:sz w:val="16"/>
-                      <w:szCs w:val="16"/>
-                      <w:color w:val="000000"/>
-                    </w:rPr>
-                    <w:t xml:space="preserve">0</w:t>
+                      <w:sz w:val="18"/>
+                      <w:szCs w:val="18"/>
+                      <w:color w:val="000000"/>
+                    </w:rPr>
+                  </w:pPr>
+                  <w:r xmlns:w="http://schemas.openxmlformats.org/wordprocessingml/2006/main" xmlns:wp="http://schemas.openxmlformats.org/drawingml/2006/wordprocessingDrawing" xmlns:r="http://schemas.openxmlformats.org/officeDocument/2006/relationships" xmlns:w14="http://schemas.microsoft.com/office/word/2010/wordml">
+                    <w:rPr>
+                      <w:rFonts w:ascii="Aptos" w:hAnsi="Aptos" w:eastAsia="Aptos" w:cs="Aptos"/>
+                      <w:i w:val="false"/>
+                      <w:b w:val="false"/>
+                      <w:u w:val="none"/>
+                      <w:strike w:val="false"/>
+                      <w:sz w:val="18"/>
+                      <w:szCs w:val="18"/>
+                      <w:color w:val="000000"/>
+                    </w:rPr>
+                    <w:t xml:space="preserve">19</w:t>
                   </w:r>
                 </w:p>
               </w:tc>
@@ -4002,20 +4051,20 @@
                       <w:b w:val="false"/>
                       <w:u w:val="none"/>
                       <w:strike w:val="false"/>
-                      <w:sz w:val="16"/>
-                      <w:szCs w:val="16"/>
-                      <w:color w:val="000000"/>
-                    </w:rPr>
-                  </w:pPr>
-                  <w:r xmlns:w="http://schemas.openxmlformats.org/wordprocessingml/2006/main" xmlns:wp="http://schemas.openxmlformats.org/drawingml/2006/wordprocessingDrawing" xmlns:r="http://schemas.openxmlformats.org/officeDocument/2006/relationships" xmlns:w14="http://schemas.microsoft.com/office/word/2010/wordml">
-                    <w:rPr>
-                      <w:rFonts w:ascii="Aptos" w:hAnsi="Aptos" w:eastAsia="Aptos" w:cs="Aptos"/>
-                      <w:i w:val="false"/>
-                      <w:b w:val="false"/>
-                      <w:u w:val="none"/>
-                      <w:strike w:val="false"/>
-                      <w:sz w:val="16"/>
-                      <w:szCs w:val="16"/>
+                      <w:sz w:val="18"/>
+                      <w:szCs w:val="18"/>
+                      <w:color w:val="000000"/>
+                    </w:rPr>
+                  </w:pPr>
+                  <w:r xmlns:w="http://schemas.openxmlformats.org/wordprocessingml/2006/main" xmlns:wp="http://schemas.openxmlformats.org/drawingml/2006/wordprocessingDrawing" xmlns:r="http://schemas.openxmlformats.org/officeDocument/2006/relationships" xmlns:w14="http://schemas.microsoft.com/office/word/2010/wordml">
+                    <w:rPr>
+                      <w:rFonts w:ascii="Aptos" w:hAnsi="Aptos" w:eastAsia="Aptos" w:cs="Aptos"/>
+                      <w:i w:val="false"/>
+                      <w:b w:val="false"/>
+                      <w:u w:val="none"/>
+                      <w:strike w:val="false"/>
+                      <w:sz w:val="18"/>
+                      <w:szCs w:val="18"/>
                       <w:color w:val="000000"/>
                     </w:rPr>
                     <w:t xml:space="preserve">67,1 %</w:t>
@@ -4056,20 +4105,20 @@
                       <w:b w:val="false"/>
                       <w:u w:val="none"/>
                       <w:strike w:val="false"/>
-                      <w:sz w:val="16"/>
-                      <w:szCs w:val="16"/>
-                      <w:color w:val="000000"/>
-                    </w:rPr>
-                  </w:pPr>
-                  <w:r xmlns:w="http://schemas.openxmlformats.org/wordprocessingml/2006/main" xmlns:wp="http://schemas.openxmlformats.org/drawingml/2006/wordprocessingDrawing" xmlns:r="http://schemas.openxmlformats.org/officeDocument/2006/relationships" xmlns:w14="http://schemas.microsoft.com/office/word/2010/wordml">
-                    <w:rPr>
-                      <w:rFonts w:ascii="Aptos" w:hAnsi="Aptos" w:eastAsia="Aptos" w:cs="Aptos"/>
-                      <w:i w:val="false"/>
-                      <w:b w:val="false"/>
-                      <w:u w:val="none"/>
-                      <w:strike w:val="false"/>
-                      <w:sz w:val="16"/>
-                      <w:szCs w:val="16"/>
+                      <w:sz w:val="18"/>
+                      <w:szCs w:val="18"/>
+                      <w:color w:val="000000"/>
+                    </w:rPr>
+                  </w:pPr>
+                  <w:r xmlns:w="http://schemas.openxmlformats.org/wordprocessingml/2006/main" xmlns:wp="http://schemas.openxmlformats.org/drawingml/2006/wordprocessingDrawing" xmlns:r="http://schemas.openxmlformats.org/officeDocument/2006/relationships" xmlns:w14="http://schemas.microsoft.com/office/word/2010/wordml">
+                    <w:rPr>
+                      <w:rFonts w:ascii="Aptos" w:hAnsi="Aptos" w:eastAsia="Aptos" w:cs="Aptos"/>
+                      <w:i w:val="false"/>
+                      <w:b w:val="false"/>
+                      <w:u w:val="none"/>
+                      <w:strike w:val="false"/>
+                      <w:sz w:val="18"/>
+                      <w:szCs w:val="18"/>
                       <w:color w:val="000000"/>
                     </w:rPr>
                     <w:t xml:space="preserve">82</w:t>
@@ -4110,20 +4159,20 @@
                       <w:b w:val="false"/>
                       <w:u w:val="none"/>
                       <w:strike w:val="false"/>
-                      <w:sz w:val="16"/>
-                      <w:szCs w:val="16"/>
-                      <w:color w:val="000000"/>
-                    </w:rPr>
-                  </w:pPr>
-                  <w:r xmlns:w="http://schemas.openxmlformats.org/wordprocessingml/2006/main" xmlns:wp="http://schemas.openxmlformats.org/drawingml/2006/wordprocessingDrawing" xmlns:r="http://schemas.openxmlformats.org/officeDocument/2006/relationships" xmlns:w14="http://schemas.microsoft.com/office/word/2010/wordml">
-                    <w:rPr>
-                      <w:rFonts w:ascii="Aptos" w:hAnsi="Aptos" w:eastAsia="Aptos" w:cs="Aptos"/>
-                      <w:i w:val="false"/>
-                      <w:b w:val="false"/>
-                      <w:u w:val="none"/>
-                      <w:strike w:val="false"/>
-                      <w:sz w:val="16"/>
-                      <w:szCs w:val="16"/>
+                      <w:sz w:val="18"/>
+                      <w:szCs w:val="18"/>
+                      <w:color w:val="000000"/>
+                    </w:rPr>
+                  </w:pPr>
+                  <w:r xmlns:w="http://schemas.openxmlformats.org/wordprocessingml/2006/main" xmlns:wp="http://schemas.openxmlformats.org/drawingml/2006/wordprocessingDrawing" xmlns:r="http://schemas.openxmlformats.org/officeDocument/2006/relationships" xmlns:w14="http://schemas.microsoft.com/office/word/2010/wordml">
+                    <w:rPr>
+                      <w:rFonts w:ascii="Aptos" w:hAnsi="Aptos" w:eastAsia="Aptos" w:cs="Aptos"/>
+                      <w:i w:val="false"/>
+                      <w:b w:val="false"/>
+                      <w:u w:val="none"/>
+                      <w:strike w:val="false"/>
+                      <w:sz w:val="18"/>
+                      <w:szCs w:val="18"/>
                       <w:color w:val="000000"/>
                     </w:rPr>
                     <w:t xml:space="preserve">68,8</w:t>
@@ -4164,20 +4213,20 @@
                       <w:b w:val="false"/>
                       <w:u w:val="none"/>
                       <w:strike w:val="false"/>
-                      <w:sz w:val="16"/>
-                      <w:szCs w:val="16"/>
-                      <w:color w:val="000000"/>
-                    </w:rPr>
-                  </w:pPr>
-                  <w:r xmlns:w="http://schemas.openxmlformats.org/wordprocessingml/2006/main" xmlns:wp="http://schemas.openxmlformats.org/drawingml/2006/wordprocessingDrawing" xmlns:r="http://schemas.openxmlformats.org/officeDocument/2006/relationships" xmlns:w14="http://schemas.microsoft.com/office/word/2010/wordml">
-                    <w:rPr>
-                      <w:rFonts w:ascii="Aptos" w:hAnsi="Aptos" w:eastAsia="Aptos" w:cs="Aptos"/>
-                      <w:i w:val="false"/>
-                      <w:b w:val="false"/>
-                      <w:u w:val="none"/>
-                      <w:strike w:val="false"/>
-                      <w:sz w:val="16"/>
-                      <w:szCs w:val="16"/>
+                      <w:sz w:val="18"/>
+                      <w:szCs w:val="18"/>
+                      <w:color w:val="000000"/>
+                    </w:rPr>
+                  </w:pPr>
+                  <w:r xmlns:w="http://schemas.openxmlformats.org/wordprocessingml/2006/main" xmlns:wp="http://schemas.openxmlformats.org/drawingml/2006/wordprocessingDrawing" xmlns:r="http://schemas.openxmlformats.org/officeDocument/2006/relationships" xmlns:w14="http://schemas.microsoft.com/office/word/2010/wordml">
+                    <w:rPr>
+                      <w:rFonts w:ascii="Aptos" w:hAnsi="Aptos" w:eastAsia="Aptos" w:cs="Aptos"/>
+                      <w:i w:val="false"/>
+                      <w:b w:val="false"/>
+                      <w:u w:val="none"/>
+                      <w:strike w:val="false"/>
+                      <w:sz w:val="18"/>
+                      <w:szCs w:val="18"/>
                       <w:color w:val="000000"/>
                     </w:rPr>
                     <w:t xml:space="preserve">10</w:t>
@@ -4223,20 +4272,20 @@
                       <w:b w:val="false"/>
                       <w:u w:val="none"/>
                       <w:strike w:val="false"/>
-                      <w:sz w:val="16"/>
-                      <w:szCs w:val="16"/>
-                      <w:color w:val="000000"/>
-                    </w:rPr>
-                  </w:pPr>
-                  <w:r xmlns:w="http://schemas.openxmlformats.org/wordprocessingml/2006/main" xmlns:wp="http://schemas.openxmlformats.org/drawingml/2006/wordprocessingDrawing" xmlns:r="http://schemas.openxmlformats.org/officeDocument/2006/relationships" xmlns:w14="http://schemas.microsoft.com/office/word/2010/wordml">
-                    <w:rPr>
-                      <w:rFonts w:ascii="Aptos" w:hAnsi="Aptos" w:eastAsia="Aptos" w:cs="Aptos"/>
-                      <w:i w:val="false"/>
-                      <w:b w:val="false"/>
-                      <w:u w:val="none"/>
-                      <w:strike w:val="false"/>
-                      <w:sz w:val="16"/>
-                      <w:szCs w:val="16"/>
+                      <w:sz w:val="18"/>
+                      <w:szCs w:val="18"/>
+                      <w:color w:val="000000"/>
+                    </w:rPr>
+                  </w:pPr>
+                  <w:r xmlns:w="http://schemas.openxmlformats.org/wordprocessingml/2006/main" xmlns:wp="http://schemas.openxmlformats.org/drawingml/2006/wordprocessingDrawing" xmlns:r="http://schemas.openxmlformats.org/officeDocument/2006/relationships" xmlns:w14="http://schemas.microsoft.com/office/word/2010/wordml">
+                    <w:rPr>
+                      <w:rFonts w:ascii="Aptos" w:hAnsi="Aptos" w:eastAsia="Aptos" w:cs="Aptos"/>
+                      <w:i w:val="false"/>
+                      <w:b w:val="false"/>
+                      <w:u w:val="none"/>
+                      <w:strike w:val="false"/>
+                      <w:sz w:val="18"/>
+                      <w:szCs w:val="18"/>
                       <w:color w:val="000000"/>
                     </w:rPr>
                     <w:t xml:space="preserve">Razem</w:t>
@@ -4277,20 +4326,20 @@
                       <w:b w:val="false"/>
                       <w:u w:val="none"/>
                       <w:strike w:val="false"/>
-                      <w:sz w:val="16"/>
-                      <w:szCs w:val="16"/>
-                      <w:color w:val="000000"/>
-                    </w:rPr>
-                  </w:pPr>
-                  <w:r xmlns:w="http://schemas.openxmlformats.org/wordprocessingml/2006/main" xmlns:wp="http://schemas.openxmlformats.org/drawingml/2006/wordprocessingDrawing" xmlns:r="http://schemas.openxmlformats.org/officeDocument/2006/relationships" xmlns:w14="http://schemas.microsoft.com/office/word/2010/wordml">
-                    <w:rPr>
-                      <w:rFonts w:ascii="Aptos" w:hAnsi="Aptos" w:eastAsia="Aptos" w:cs="Aptos"/>
-                      <w:i w:val="false"/>
-                      <w:b w:val="false"/>
-                      <w:u w:val="none"/>
-                      <w:strike w:val="false"/>
-                      <w:sz w:val="16"/>
-                      <w:szCs w:val="16"/>
+                      <w:sz w:val="18"/>
+                      <w:szCs w:val="18"/>
+                      <w:color w:val="000000"/>
+                    </w:rPr>
+                  </w:pPr>
+                  <w:r xmlns:w="http://schemas.openxmlformats.org/wordprocessingml/2006/main" xmlns:wp="http://schemas.openxmlformats.org/drawingml/2006/wordprocessingDrawing" xmlns:r="http://schemas.openxmlformats.org/officeDocument/2006/relationships" xmlns:w14="http://schemas.microsoft.com/office/word/2010/wordml">
+                    <w:rPr>
+                      <w:rFonts w:ascii="Aptos" w:hAnsi="Aptos" w:eastAsia="Aptos" w:cs="Aptos"/>
+                      <w:i w:val="false"/>
+                      <w:b w:val="false"/>
+                      <w:u w:val="none"/>
+                      <w:strike w:val="false"/>
+                      <w:sz w:val="18"/>
+                      <w:szCs w:val="18"/>
                       <w:color w:val="000000"/>
                     </w:rPr>
                     <w:t xml:space="preserve">A+B+</w:t>
@@ -4331,20 +4380,20 @@
                       <w:b w:val="false"/>
                       <w:u w:val="none"/>
                       <w:strike w:val="false"/>
-                      <w:sz w:val="16"/>
-                      <w:szCs w:val="16"/>
-                      <w:color w:val="000000"/>
-                    </w:rPr>
-                  </w:pPr>
-                  <w:r xmlns:w="http://schemas.openxmlformats.org/wordprocessingml/2006/main" xmlns:wp="http://schemas.openxmlformats.org/drawingml/2006/wordprocessingDrawing" xmlns:r="http://schemas.openxmlformats.org/officeDocument/2006/relationships" xmlns:w14="http://schemas.microsoft.com/office/word/2010/wordml">
-                    <w:rPr>
-                      <w:rFonts w:ascii="Aptos" w:hAnsi="Aptos" w:eastAsia="Aptos" w:cs="Aptos"/>
-                      <w:i w:val="false"/>
-                      <w:b w:val="false"/>
-                      <w:u w:val="none"/>
-                      <w:strike w:val="false"/>
-                      <w:sz w:val="16"/>
-                      <w:szCs w:val="16"/>
+                      <w:sz w:val="18"/>
+                      <w:szCs w:val="18"/>
+                      <w:color w:val="000000"/>
+                    </w:rPr>
+                  </w:pPr>
+                  <w:r xmlns:w="http://schemas.openxmlformats.org/wordprocessingml/2006/main" xmlns:wp="http://schemas.openxmlformats.org/drawingml/2006/wordprocessingDrawing" xmlns:r="http://schemas.openxmlformats.org/officeDocument/2006/relationships" xmlns:w14="http://schemas.microsoft.com/office/word/2010/wordml">
+                    <w:rPr>
+                      <w:rFonts w:ascii="Aptos" w:hAnsi="Aptos" w:eastAsia="Aptos" w:cs="Aptos"/>
+                      <w:i w:val="false"/>
+                      <w:b w:val="false"/>
+                      <w:u w:val="none"/>
+                      <w:strike w:val="false"/>
+                      <w:sz w:val="18"/>
+                      <w:szCs w:val="18"/>
                       <w:color w:val="000000"/>
                     </w:rPr>
                     <w:t xml:space="preserve">462</w:t>
@@ -4385,23 +4434,23 @@
                       <w:b w:val="false"/>
                       <w:u w:val="none"/>
                       <w:strike w:val="false"/>
-                      <w:sz w:val="16"/>
-                      <w:szCs w:val="16"/>
-                      <w:color w:val="000000"/>
-                    </w:rPr>
-                  </w:pPr>
-                  <w:r xmlns:w="http://schemas.openxmlformats.org/wordprocessingml/2006/main" xmlns:wp="http://schemas.openxmlformats.org/drawingml/2006/wordprocessingDrawing" xmlns:r="http://schemas.openxmlformats.org/officeDocument/2006/relationships" xmlns:w14="http://schemas.microsoft.com/office/word/2010/wordml">
-                    <w:rPr>
-                      <w:rFonts w:ascii="Aptos" w:hAnsi="Aptos" w:eastAsia="Aptos" w:cs="Aptos"/>
-                      <w:i w:val="false"/>
-                      <w:b w:val="false"/>
-                      <w:u w:val="none"/>
-                      <w:strike w:val="false"/>
-                      <w:sz w:val="16"/>
-                      <w:szCs w:val="16"/>
-                      <w:color w:val="000000"/>
-                    </w:rPr>
-                    <w:t xml:space="preserve">170</w:t>
+                      <w:sz w:val="18"/>
+                      <w:szCs w:val="18"/>
+                      <w:color w:val="000000"/>
+                    </w:rPr>
+                  </w:pPr>
+                  <w:r xmlns:w="http://schemas.openxmlformats.org/wordprocessingml/2006/main" xmlns:wp="http://schemas.openxmlformats.org/drawingml/2006/wordprocessingDrawing" xmlns:r="http://schemas.openxmlformats.org/officeDocument/2006/relationships" xmlns:w14="http://schemas.microsoft.com/office/word/2010/wordml">
+                    <w:rPr>
+                      <w:rFonts w:ascii="Aptos" w:hAnsi="Aptos" w:eastAsia="Aptos" w:cs="Aptos"/>
+                      <w:i w:val="false"/>
+                      <w:b w:val="false"/>
+                      <w:u w:val="none"/>
+                      <w:strike w:val="false"/>
+                      <w:sz w:val="18"/>
+                      <w:szCs w:val="18"/>
+                      <w:color w:val="000000"/>
+                    </w:rPr>
+                    <w:t xml:space="preserve">26</w:t>
                   </w:r>
                 </w:p>
               </w:tc>
@@ -4439,23 +4488,23 @@
                       <w:b w:val="false"/>
                       <w:u w:val="none"/>
                       <w:strike w:val="false"/>
-                      <w:sz w:val="16"/>
-                      <w:szCs w:val="16"/>
-                      <w:color w:val="000000"/>
-                    </w:rPr>
-                  </w:pPr>
-                  <w:r xmlns:w="http://schemas.openxmlformats.org/wordprocessingml/2006/main" xmlns:wp="http://schemas.openxmlformats.org/drawingml/2006/wordprocessingDrawing" xmlns:r="http://schemas.openxmlformats.org/officeDocument/2006/relationships" xmlns:w14="http://schemas.microsoft.com/office/word/2010/wordml">
-                    <w:rPr>
-                      <w:rFonts w:ascii="Aptos" w:hAnsi="Aptos" w:eastAsia="Aptos" w:cs="Aptos"/>
-                      <w:i w:val="false"/>
-                      <w:b w:val="false"/>
-                      <w:u w:val="none"/>
-                      <w:strike w:val="false"/>
-                      <w:sz w:val="16"/>
-                      <w:szCs w:val="16"/>
-                      <w:color w:val="000000"/>
-                    </w:rPr>
-                    <w:t xml:space="preserve">153</w:t>
+                      <w:sz w:val="18"/>
+                      <w:szCs w:val="18"/>
+                      <w:color w:val="000000"/>
+                    </w:rPr>
+                  </w:pPr>
+                  <w:r xmlns:w="http://schemas.openxmlformats.org/wordprocessingml/2006/main" xmlns:wp="http://schemas.openxmlformats.org/drawingml/2006/wordprocessingDrawing" xmlns:r="http://schemas.openxmlformats.org/officeDocument/2006/relationships" xmlns:w14="http://schemas.microsoft.com/office/word/2010/wordml">
+                    <w:rPr>
+                      <w:rFonts w:ascii="Aptos" w:hAnsi="Aptos" w:eastAsia="Aptos" w:cs="Aptos"/>
+                      <w:i w:val="false"/>
+                      <w:b w:val="false"/>
+                      <w:u w:val="none"/>
+                      <w:strike w:val="false"/>
+                      <w:sz w:val="18"/>
+                      <w:szCs w:val="18"/>
+                      <w:color w:val="000000"/>
+                    </w:rPr>
+                    <w:t xml:space="preserve">170</w:t>
                   </w:r>
                 </w:p>
               </w:tc>
@@ -4493,23 +4542,23 @@
                       <w:b w:val="false"/>
                       <w:u w:val="none"/>
                       <w:strike w:val="false"/>
-                      <w:sz w:val="16"/>
-                      <w:szCs w:val="16"/>
-                      <w:color w:val="000000"/>
-                    </w:rPr>
-                  </w:pPr>
-                  <w:r xmlns:w="http://schemas.openxmlformats.org/wordprocessingml/2006/main" xmlns:wp="http://schemas.openxmlformats.org/drawingml/2006/wordprocessingDrawing" xmlns:r="http://schemas.openxmlformats.org/officeDocument/2006/relationships" xmlns:w14="http://schemas.microsoft.com/office/word/2010/wordml">
-                    <w:rPr>
-                      <w:rFonts w:ascii="Aptos" w:hAnsi="Aptos" w:eastAsia="Aptos" w:cs="Aptos"/>
-                      <w:i w:val="false"/>
-                      <w:b w:val="false"/>
-                      <w:u w:val="none"/>
-                      <w:strike w:val="false"/>
-                      <w:sz w:val="16"/>
-                      <w:szCs w:val="16"/>
-                      <w:color w:val="000000"/>
-                    </w:rPr>
-                    <w:t xml:space="preserve">97</w:t>
+                      <w:sz w:val="18"/>
+                      <w:szCs w:val="18"/>
+                      <w:color w:val="000000"/>
+                    </w:rPr>
+                  </w:pPr>
+                  <w:r xmlns:w="http://schemas.openxmlformats.org/wordprocessingml/2006/main" xmlns:wp="http://schemas.openxmlformats.org/drawingml/2006/wordprocessingDrawing" xmlns:r="http://schemas.openxmlformats.org/officeDocument/2006/relationships" xmlns:w14="http://schemas.microsoft.com/office/word/2010/wordml">
+                    <w:rPr>
+                      <w:rFonts w:ascii="Aptos" w:hAnsi="Aptos" w:eastAsia="Aptos" w:cs="Aptos"/>
+                      <w:i w:val="false"/>
+                      <w:b w:val="false"/>
+                      <w:u w:val="none"/>
+                      <w:strike w:val="false"/>
+                      <w:sz w:val="18"/>
+                      <w:szCs w:val="18"/>
+                      <w:color w:val="000000"/>
+                    </w:rPr>
+                    <w:t xml:space="preserve">153</w:t>
                   </w:r>
                 </w:p>
               </w:tc>
@@ -4547,23 +4596,23 @@
                       <w:b w:val="false"/>
                       <w:u w:val="none"/>
                       <w:strike w:val="false"/>
-                      <w:sz w:val="16"/>
-                      <w:szCs w:val="16"/>
-                      <w:color w:val="000000"/>
-                    </w:rPr>
-                  </w:pPr>
-                  <w:r xmlns:w="http://schemas.openxmlformats.org/wordprocessingml/2006/main" xmlns:wp="http://schemas.openxmlformats.org/drawingml/2006/wordprocessingDrawing" xmlns:r="http://schemas.openxmlformats.org/officeDocument/2006/relationships" xmlns:w14="http://schemas.microsoft.com/office/word/2010/wordml">
-                    <w:rPr>
-                      <w:rFonts w:ascii="Aptos" w:hAnsi="Aptos" w:eastAsia="Aptos" w:cs="Aptos"/>
-                      <w:i w:val="false"/>
-                      <w:b w:val="false"/>
-                      <w:u w:val="none"/>
-                      <w:strike w:val="false"/>
-                      <w:sz w:val="16"/>
-                      <w:szCs w:val="16"/>
-                      <w:color w:val="000000"/>
-                    </w:rPr>
-                    <w:t xml:space="preserve">26</w:t>
+                      <w:sz w:val="18"/>
+                      <w:szCs w:val="18"/>
+                      <w:color w:val="000000"/>
+                    </w:rPr>
+                  </w:pPr>
+                  <w:r xmlns:w="http://schemas.openxmlformats.org/wordprocessingml/2006/main" xmlns:wp="http://schemas.openxmlformats.org/drawingml/2006/wordprocessingDrawing" xmlns:r="http://schemas.openxmlformats.org/officeDocument/2006/relationships" xmlns:w14="http://schemas.microsoft.com/office/word/2010/wordml">
+                    <w:rPr>
+                      <w:rFonts w:ascii="Aptos" w:hAnsi="Aptos" w:eastAsia="Aptos" w:cs="Aptos"/>
+                      <w:i w:val="false"/>
+                      <w:b w:val="false"/>
+                      <w:u w:val="none"/>
+                      <w:strike w:val="false"/>
+                      <w:sz w:val="18"/>
+                      <w:szCs w:val="18"/>
+                      <w:color w:val="000000"/>
+                    </w:rPr>
+                    <w:t xml:space="preserve">97</w:t>
                   </w:r>
                 </w:p>
               </w:tc>
@@ -4601,20 +4650,20 @@
                       <w:b w:val="false"/>
                       <w:u w:val="none"/>
                       <w:strike w:val="false"/>
-                      <w:sz w:val="16"/>
-                      <w:szCs w:val="16"/>
-                      <w:color w:val="000000"/>
-                    </w:rPr>
-                  </w:pPr>
-                  <w:r xmlns:w="http://schemas.openxmlformats.org/wordprocessingml/2006/main" xmlns:wp="http://schemas.openxmlformats.org/drawingml/2006/wordprocessingDrawing" xmlns:r="http://schemas.openxmlformats.org/officeDocument/2006/relationships" xmlns:w14="http://schemas.microsoft.com/office/word/2010/wordml">
-                    <w:rPr>
-                      <w:rFonts w:ascii="Aptos" w:hAnsi="Aptos" w:eastAsia="Aptos" w:cs="Aptos"/>
-                      <w:i w:val="false"/>
-                      <w:b w:val="false"/>
-                      <w:u w:val="none"/>
-                      <w:strike w:val="false"/>
-                      <w:sz w:val="16"/>
-                      <w:szCs w:val="16"/>
+                      <w:sz w:val="18"/>
+                      <w:szCs w:val="18"/>
+                      <w:color w:val="000000"/>
+                    </w:rPr>
+                  </w:pPr>
+                  <w:r xmlns:w="http://schemas.openxmlformats.org/wordprocessingml/2006/main" xmlns:wp="http://schemas.openxmlformats.org/drawingml/2006/wordprocessingDrawing" xmlns:r="http://schemas.openxmlformats.org/officeDocument/2006/relationships" xmlns:w14="http://schemas.microsoft.com/office/word/2010/wordml">
+                    <w:rPr>
+                      <w:rFonts w:ascii="Aptos" w:hAnsi="Aptos" w:eastAsia="Aptos" w:cs="Aptos"/>
+                      <w:i w:val="false"/>
+                      <w:b w:val="false"/>
+                      <w:u w:val="none"/>
+                      <w:strike w:val="false"/>
+                      <w:sz w:val="18"/>
+                      <w:szCs w:val="18"/>
                       <w:color w:val="000000"/>
                     </w:rPr>
                     <w:t xml:space="preserve">79,4 %</w:t>
@@ -4655,20 +4704,20 @@
                       <w:b w:val="false"/>
                       <w:u w:val="none"/>
                       <w:strike w:val="false"/>
-                      <w:sz w:val="16"/>
-                      <w:szCs w:val="16"/>
-                      <w:color w:val="000000"/>
-                    </w:rPr>
-                  </w:pPr>
-                  <w:r xmlns:w="http://schemas.openxmlformats.org/wordprocessingml/2006/main" xmlns:wp="http://schemas.openxmlformats.org/drawingml/2006/wordprocessingDrawing" xmlns:r="http://schemas.openxmlformats.org/officeDocument/2006/relationships" xmlns:w14="http://schemas.microsoft.com/office/word/2010/wordml">
-                    <w:rPr>
-                      <w:rFonts w:ascii="Aptos" w:hAnsi="Aptos" w:eastAsia="Aptos" w:cs="Aptos"/>
-                      <w:i w:val="false"/>
-                      <w:b w:val="false"/>
-                      <w:u w:val="none"/>
-                      <w:strike w:val="false"/>
-                      <w:sz w:val="16"/>
-                      <w:szCs w:val="16"/>
+                      <w:sz w:val="18"/>
+                      <w:szCs w:val="18"/>
+                      <w:color w:val="000000"/>
+                    </w:rPr>
+                  </w:pPr>
+                  <w:r xmlns:w="http://schemas.openxmlformats.org/wordprocessingml/2006/main" xmlns:wp="http://schemas.openxmlformats.org/drawingml/2006/wordprocessingDrawing" xmlns:r="http://schemas.openxmlformats.org/officeDocument/2006/relationships" xmlns:w14="http://schemas.microsoft.com/office/word/2010/wordml">
+                    <w:rPr>
+                      <w:rFonts w:ascii="Aptos" w:hAnsi="Aptos" w:eastAsia="Aptos" w:cs="Aptos"/>
+                      <w:i w:val="false"/>
+                      <w:b w:val="false"/>
+                      <w:u w:val="none"/>
+                      <w:strike w:val="false"/>
+                      <w:sz w:val="18"/>
+                      <w:szCs w:val="18"/>
                       <w:color w:val="000000"/>
                     </w:rPr>
                     <w:t xml:space="preserve">62</w:t>
@@ -4709,20 +4758,20 @@
                       <w:b w:val="false"/>
                       <w:u w:val="none"/>
                       <w:strike w:val="false"/>
-                      <w:sz w:val="16"/>
-                      <w:szCs w:val="16"/>
-                      <w:color w:val="000000"/>
-                    </w:rPr>
-                  </w:pPr>
-                  <w:r xmlns:w="http://schemas.openxmlformats.org/wordprocessingml/2006/main" xmlns:wp="http://schemas.openxmlformats.org/drawingml/2006/wordprocessingDrawing" xmlns:r="http://schemas.openxmlformats.org/officeDocument/2006/relationships" xmlns:w14="http://schemas.microsoft.com/office/word/2010/wordml">
-                    <w:rPr>
-                      <w:rFonts w:ascii="Aptos" w:hAnsi="Aptos" w:eastAsia="Aptos" w:cs="Aptos"/>
-                      <w:i w:val="false"/>
-                      <w:b w:val="false"/>
-                      <w:u w:val="none"/>
-                      <w:strike w:val="false"/>
-                      <w:sz w:val="16"/>
-                      <w:szCs w:val="16"/>
+                      <w:sz w:val="18"/>
+                      <w:szCs w:val="18"/>
+                      <w:color w:val="000000"/>
+                    </w:rPr>
+                  </w:pPr>
+                  <w:r xmlns:w="http://schemas.openxmlformats.org/wordprocessingml/2006/main" xmlns:wp="http://schemas.openxmlformats.org/drawingml/2006/wordprocessingDrawing" xmlns:r="http://schemas.openxmlformats.org/officeDocument/2006/relationships" xmlns:w14="http://schemas.microsoft.com/office/word/2010/wordml">
+                    <w:rPr>
+                      <w:rFonts w:ascii="Aptos" w:hAnsi="Aptos" w:eastAsia="Aptos" w:cs="Aptos"/>
+                      <w:i w:val="false"/>
+                      <w:b w:val="false"/>
+                      <w:u w:val="none"/>
+                      <w:strike w:val="false"/>
+                      <w:sz w:val="18"/>
+                      <w:szCs w:val="18"/>
                       <w:color w:val="000000"/>
                     </w:rPr>
                     <w:t xml:space="preserve">49,0</w:t>
@@ -4763,20 +4812,20 @@
                       <w:b w:val="false"/>
                       <w:u w:val="none"/>
                       <w:strike w:val="false"/>
-                      <w:sz w:val="16"/>
-                      <w:szCs w:val="16"/>
-                      <w:color w:val="000000"/>
-                    </w:rPr>
-                  </w:pPr>
-                  <w:r xmlns:w="http://schemas.openxmlformats.org/wordprocessingml/2006/main" xmlns:wp="http://schemas.openxmlformats.org/drawingml/2006/wordprocessingDrawing" xmlns:r="http://schemas.openxmlformats.org/officeDocument/2006/relationships" xmlns:w14="http://schemas.microsoft.com/office/word/2010/wordml">
-                    <w:rPr>
-                      <w:rFonts w:ascii="Aptos" w:hAnsi="Aptos" w:eastAsia="Aptos" w:cs="Aptos"/>
-                      <w:i w:val="false"/>
-                      <w:b w:val="false"/>
-                      <w:u w:val="none"/>
-                      <w:strike w:val="false"/>
-                      <w:sz w:val="16"/>
-                      <w:szCs w:val="16"/>
+                      <w:sz w:val="18"/>
+                      <w:szCs w:val="18"/>
+                      <w:color w:val="000000"/>
+                    </w:rPr>
+                  </w:pPr>
+                  <w:r xmlns:w="http://schemas.openxmlformats.org/wordprocessingml/2006/main" xmlns:wp="http://schemas.openxmlformats.org/drawingml/2006/wordprocessingDrawing" xmlns:r="http://schemas.openxmlformats.org/officeDocument/2006/relationships" xmlns:w14="http://schemas.microsoft.com/office/word/2010/wordml">
+                    <w:rPr>
+                      <w:rFonts w:ascii="Aptos" w:hAnsi="Aptos" w:eastAsia="Aptos" w:cs="Aptos"/>
+                      <w:i w:val="false"/>
+                      <w:b w:val="false"/>
+                      <w:u w:val="none"/>
+                      <w:strike w:val="false"/>
+                      <w:sz w:val="18"/>
+                      <w:szCs w:val="18"/>
                       <w:color w:val="000000"/>
                     </w:rPr>
                     <w:t xml:space="preserve">9</w:t>
@@ -4823,20 +4872,20 @@
                       <w:b w:val="false"/>
                       <w:u w:val="none"/>
                       <w:strike w:val="false"/>
-                      <w:sz w:val="14"/>
-                      <w:szCs w:val="14"/>
-                      <w:color w:val="000000"/>
-                    </w:rPr>
-                  </w:pPr>
-                  <w:r xmlns:w="http://schemas.openxmlformats.org/wordprocessingml/2006/main" xmlns:wp="http://schemas.openxmlformats.org/drawingml/2006/wordprocessingDrawing" xmlns:r="http://schemas.openxmlformats.org/officeDocument/2006/relationships" xmlns:w14="http://schemas.microsoft.com/office/word/2010/wordml">
-                    <w:rPr>
-                      <w:rFonts w:ascii="Aptos" w:hAnsi="Aptos" w:eastAsia="Aptos" w:cs="Aptos"/>
-                      <w:i w:val="false"/>
-                      <w:b w:val="false"/>
-                      <w:u w:val="none"/>
-                      <w:strike w:val="false"/>
-                      <w:sz w:val="14"/>
-                      <w:szCs w:val="14"/>
+                      <w:sz w:val="18"/>
+                      <w:szCs w:val="18"/>
+                      <w:color w:val="000000"/>
+                    </w:rPr>
+                  </w:pPr>
+                  <w:r xmlns:w="http://schemas.openxmlformats.org/wordprocessingml/2006/main" xmlns:wp="http://schemas.openxmlformats.org/drawingml/2006/wordprocessingDrawing" xmlns:r="http://schemas.openxmlformats.org/officeDocument/2006/relationships" xmlns:w14="http://schemas.microsoft.com/office/word/2010/wordml">
+                    <w:rPr>
+                      <w:rFonts w:ascii="Aptos" w:hAnsi="Aptos" w:eastAsia="Aptos" w:cs="Aptos"/>
+                      <w:i w:val="false"/>
+                      <w:b w:val="false"/>
+                      <w:u w:val="none"/>
+                      <w:strike w:val="false"/>
+                      <w:sz w:val="18"/>
+                      <w:szCs w:val="18"/>
                       <w:color w:val="000000"/>
                     </w:rPr>
                     <w:t xml:space="preserve">Dopasow. OpenAlex = odsetek osób uczelni powiązanych z rekordem autora w bazie OpenAlex (po identyfikatorze ROR i nazwisku).</w:t>
@@ -4883,20 +4932,20 @@
                       <w:b w:val="false"/>
                       <w:u w:val="none"/>
                       <w:strike w:val="false"/>
-                      <w:sz w:val="14"/>
-                      <w:szCs w:val="14"/>
-                      <w:color w:val="000000"/>
-                    </w:rPr>
-                  </w:pPr>
-                  <w:r xmlns:w="http://schemas.openxmlformats.org/wordprocessingml/2006/main" xmlns:wp="http://schemas.openxmlformats.org/drawingml/2006/wordprocessingDrawing" xmlns:r="http://schemas.openxmlformats.org/officeDocument/2006/relationships" xmlns:w14="http://schemas.microsoft.com/office/word/2010/wordml">
-                    <w:rPr>
-                      <w:rFonts w:ascii="Aptos" w:hAnsi="Aptos" w:eastAsia="Aptos" w:cs="Aptos"/>
-                      <w:i w:val="false"/>
-                      <w:b w:val="false"/>
-                      <w:u w:val="none"/>
-                      <w:strike w:val="false"/>
-                      <w:sz w:val="14"/>
-                      <w:szCs w:val="14"/>
+                      <w:sz w:val="18"/>
+                      <w:szCs w:val="18"/>
+                      <w:color w:val="000000"/>
+                    </w:rPr>
+                  </w:pPr>
+                  <w:r xmlns:w="http://schemas.openxmlformats.org/wordprocessingml/2006/main" xmlns:wp="http://schemas.openxmlformats.org/drawingml/2006/wordprocessingDrawing" xmlns:r="http://schemas.openxmlformats.org/officeDocument/2006/relationships" xmlns:w14="http://schemas.microsoft.com/office/word/2010/wordml">
+                    <w:rPr>
+                      <w:rFonts w:ascii="Aptos" w:hAnsi="Aptos" w:eastAsia="Aptos" w:cs="Aptos"/>
+                      <w:i w:val="false"/>
+                      <w:b w:val="false"/>
+                      <w:u w:val="none"/>
+                      <w:strike w:val="false"/>
+                      <w:sz w:val="18"/>
+                      <w:szCs w:val="18"/>
                       <w:color w:val="000000"/>
                     </w:rPr>
                     <w:t xml:space="preserve">* wartości podane jako mediany (na pełnej liczebności uczelni); h-index wg WoS.</w:t>
@@ -5011,12 +5060,12 @@
     <w:tbl>
       <w:tblPr>
         <w:tblStyle w:val="Table"/>
-        <w:tblW w:type="dxa" w:w="9638"/>
-        <w:tblLayout w:type="autofit"/>
+        <w:tblW w:type="pct" w:w="5000"/>
+        <w:tblLayout w:type="fixed"/>
         <w:tblLook w:firstRow="0" w:lastRow="0" w:firstColumn="0" w:lastColumn="0" w:noHBand="0" w:noVBand="0" w:val="0000"/>
       </w:tblPr>
       <w:tblGrid>
-        <w:gridCol w:w="9638"/>
+        <w:gridCol w:w="7920"/>
       </w:tblGrid>
       <w:tr>
         <w:tc>
@@ -5130,12 +5179,12 @@
     <w:tbl>
       <w:tblPr>
         <w:tblStyle w:val="Table"/>
-        <w:tblW w:type="dxa" w:w="9638"/>
-        <w:tblLayout w:type="autofit"/>
+        <w:tblW w:type="pct" w:w="5000"/>
+        <w:tblLayout w:type="fixed"/>
         <w:tblLook w:firstRow="0" w:lastRow="0" w:firstColumn="0" w:lastColumn="0" w:noHBand="0" w:noVBand="0" w:val="0000"/>
       </w:tblPr>
       <w:tblGrid>
-        <w:gridCol w:w="9638"/>
+        <w:gridCol w:w="7920"/>
       </w:tblGrid>
       <w:tr>
         <w:tc>
@@ -5297,12 +5346,12 @@
     <w:tbl>
       <w:tblPr>
         <w:tblStyle w:val="Table"/>
-        <w:tblW w:type="dxa" w:w="9638"/>
-        <w:tblLayout w:type="autofit"/>
+        <w:tblW w:type="pct" w:w="5000"/>
+        <w:tblLayout w:type="fixed"/>
         <w:tblLook w:firstRow="0" w:lastRow="0" w:firstColumn="0" w:lastColumn="0" w:noHBand="0" w:noVBand="0" w:val="0000"/>
       </w:tblPr>
       <w:tblGrid>
-        <w:gridCol w:w="9638"/>
+        <w:gridCol w:w="7920"/>
       </w:tblGrid>
       <w:tr>
         <w:tc>
@@ -5384,12 +5433,12 @@
     <w:tbl>
       <w:tblPr>
         <w:tblStyle w:val="Table"/>
-        <w:tblW w:type="dxa" w:w="9638"/>
-        <w:tblLayout w:type="autofit"/>
+        <w:tblW w:type="pct" w:w="5000"/>
+        <w:tblLayout w:type="fixed"/>
         <w:tblLook w:firstRow="0" w:lastRow="0" w:firstColumn="0" w:lastColumn="0" w:noHBand="0" w:noVBand="0" w:val="0000"/>
       </w:tblPr>
       <w:tblGrid>
-        <w:gridCol w:w="9638"/>
+        <w:gridCol w:w="7920"/>
       </w:tblGrid>
       <w:tr>
         <w:tc>
@@ -5485,12 +5534,12 @@
     <w:tbl>
       <w:tblPr>
         <w:tblStyle w:val="Table"/>
-        <w:tblW w:type="dxa" w:w="9638"/>
-        <w:tblLayout w:type="autofit"/>
+        <w:tblW w:type="pct" w:w="5000"/>
+        <w:tblLayout w:type="fixed"/>
         <w:tblLook w:firstRow="0" w:lastRow="0" w:firstColumn="0" w:lastColumn="0" w:noHBand="0" w:noVBand="0" w:val="0000"/>
       </w:tblPr>
       <w:tblGrid>
-        <w:gridCol w:w="9638"/>
+        <w:gridCol w:w="7920"/>
       </w:tblGrid>
       <w:tr>
         <w:tc>
@@ -5624,12 +5673,12 @@
     <w:tbl>
       <w:tblPr>
         <w:tblStyle w:val="Table"/>
-        <w:tblW w:type="dxa" w:w="9638"/>
-        <w:tblLayout w:type="autofit"/>
+        <w:tblW w:type="pct" w:w="5000"/>
+        <w:tblLayout w:type="fixed"/>
         <w:tblLook w:firstRow="0" w:lastRow="0" w:firstColumn="0" w:lastColumn="0" w:noHBand="0" w:noVBand="0" w:val="0000"/>
       </w:tblPr>
       <w:tblGrid>
-        <w:gridCol w:w="9638"/>
+        <w:gridCol w:w="7920"/>
       </w:tblGrid>
       <w:tr>
         <w:tc>
@@ -5650,16 +5699,16 @@
           </w:p>
           <w:tbl xmlns:w="http://schemas.openxmlformats.org/wordprocessingml/2006/main" xmlns:r="http://schemas.openxmlformats.org/officeDocument/2006/relationships" xmlns:w14="http://schemas.microsoft.com/office/word/2010/wordml" xmlns:wp="http://schemas.openxmlformats.org/drawingml/2006/wordprocessingDrawing" xmlns:a="http://schemas.openxmlformats.org/drawingml/2006/main" xmlns:pic="http://schemas.openxmlformats.org/drawingml/2006/picture">
             <w:tblPr>
-              <w:tblLayout w:type="autofit"/>
+              <w:tblLayout w:type="fixed"/>
               <w:jc w:val="center"/>
               <w:tblLook w:firstRow="1" w:lastRow="0" w:firstColumn="0" w:lastColumn="0" w:noHBand="0" w:noVBand="1"/>
             </w:tblPr>
             <w:tblGrid>
-              <w:gridCol w:w="3074"/>
-              <w:gridCol w:w="1579"/>
-              <w:gridCol w:w="1412"/>
-              <w:gridCol w:w="1828"/>
-              <w:gridCol w:w="1745"/>
+              <w:gridCol w:w="2664"/>
+              <w:gridCol w:w="1368"/>
+              <w:gridCol w:w="1224"/>
+              <w:gridCol w:w="1584"/>
+              <w:gridCol w:w="1512"/>
             </w:tblGrid>
             <w:tr>
               <w:trPr>
@@ -5770,7 +5819,7 @@
                       <w:szCs w:val="18"/>
                       <w:color w:val="000000"/>
                     </w:rPr>
-                    <w:t xml:space="preserve">H (df)</w:t>
+                    <w:t xml:space="preserve">H (df)*</w:t>
                   </w:r>
                 </w:p>
               </w:tc>
@@ -7642,7 +7691,7 @@
                       <w:szCs w:val="16"/>
                       <w:color w:val="000000"/>
                     </w:rPr>
-                    <w:t xml:space="preserve">H to statystyka Kruskala-Wallisa (rozkład chi-kwadrat o df stopniach swobody).</w:t>
+                    <w:t xml:space="preserve">* H to statystyka Kruskala-Wallisa (rozkład chi-kwadrat o df stopniach swobody).</w:t>
                   </w:r>
                 </w:p>
               </w:tc>
@@ -7657,17 +7706,33 @@
         <w:pStyle w:val="BodyText"/>
       </w:pPr>
       <w:r>
-        <w:t xml:space="preserve">Liczba grup jednorodnych jest najwyższa dla liczby publikacji (8 grup), co czyni ją metryką najsilniej różnicującą komórki, a wyraźne rozwarstwienie (6 grup) wykazują także h-index, sumaryczny IF i punktacja MEiN. Jedynym wskaźnikiem bez istotnych różnic pozostaje złożony IF / MEiN, nieistotny już na poziomie testu ogólnego (p = 0,075): jako iloraz dwóch silnie skorelowanych wielkości znosi on efekt skali dorobku i nie odróżnia komórek. Wzrost median z rangą stanowiska jest więc nie tylko kierunkowy, lecz osiąga istotność statystyczną dla pięciu z sześciu metryk mimo konserwatywnej korekty Bonferroniego na 12 komórkach.</w:t>
+        <w:t xml:space="preserve">Najwięcej różnic między grupami widać dla liczby publikacji. Ta metryka podzieliła badanych na 8 grup jednorodnych, czyli najlepiej odróżniała poszczególne kombinacje uczelni i stanowiska. Wyraźne różnice wystąpiły także dla h-index, sumarycznego IF i punktacji MEiN.</w:t>
+      </w:r>
+    </w:p>
+    <w:p>
+      <w:pPr>
+        <w:pStyle w:val="BodyText"/>
+      </w:pPr>
+      <w:r>
+        <w:t xml:space="preserve">Jedynym wskaźnikiem, dla którego nie stwierdzono istotnych różnic, był IF / MEiN (p = 0,075). Wynika to z jego konstrukcji: jako iloraz dwóch silnie skorelowanych wielkości znosi on efekt skali dorobku, więc nie różnicuje wyraźnie badanych grup.</w:t>
+      </w:r>
+    </w:p>
+    <w:p>
+      <w:pPr>
+        <w:pStyle w:val="BodyText"/>
+      </w:pPr>
+      <w:r>
+        <w:t xml:space="preserve">Podsumowując, wraz z wyższym stanowiskiem rosną wartości większości wskaźników bibliometrycznych. Zależność ta była istotna statystycznie dla pięciu z sześciu analizowanych metryk.</w:t>
       </w:r>
     </w:p>
     <w:bookmarkEnd w:id="47"/>
-    <w:bookmarkStart w:id="58" w:name="Xfa9455c5230fab5057550e2356fe6e7695b65cb"/>
+    <w:bookmarkStart w:id="58" w:name="X88ab428eb81e048ab5c69c902d08d12ccb60c6c"/>
     <w:p>
       <w:pPr>
         <w:pStyle w:val="Heading2"/>
       </w:pPr>
       <w:r>
-        <w:t xml:space="preserve">Typologia profili bibliometrycznych (pytanie 1)</w:t>
+        <w:t xml:space="preserve">Typy profili bibliometrycznych badaczy (pytanie 1)</w:t>
       </w:r>
     </w:p>
     <w:p>
@@ -7675,7 +7740,7 @@
         <w:pStyle w:val="FirstParagraph"/>
       </w:pPr>
       <w:r>
-        <w:t xml:space="preserve">Analiza głównych składowych na czterech standaryzowanych cechach pełnego pokrycia (n = 449) wykazała, że dwie pierwsze składowe wyjaśniają</w:t>
+        <w:t xml:space="preserve">Analiza głównych składowych na czterech standaryzowanych cechach pełnego pokrycia (h-index WoS, sumaryczny IF, IF na publikację, liczba publikacji; n = 449) wykazała, że dwie pierwsze składowe wyjaśniają</w:t>
       </w:r>
       <w:r>
         <w:t xml:space="preserve"> </w:t>
@@ -7691,7 +7756,7 @@
         <w:t xml:space="preserve"> </w:t>
       </w:r>
       <w:r>
-        <w:t xml:space="preserve">(PC1: 54,1 %, PC2: 33,8 %). Walidacja liczby klastrów metodą sylwetki wskazała rozwiązanie</w:t>
+        <w:t xml:space="preserve">(PC1: 54,1 %, PC2: 33,8 %). Liczbę klastrów dobrano metodą sylwetki, która dla każdego obiektu mierzy, jak dobrze pasuje on do własnego klastra w porównaniu z najbliższym sąsiednim; jako optymalną wybiera się liczbę klastrów o najwyższym średnim dopasowaniu. Wskazała ona rozwiązanie</w:t>
       </w:r>
       <w:r>
         <w:t xml:space="preserve"> </w:t>
@@ -7710,12 +7775,12 @@
     <w:tbl>
       <w:tblPr>
         <w:tblStyle w:val="Table"/>
-        <w:tblW w:type="dxa" w:w="9638"/>
-        <w:tblLayout w:type="autofit"/>
+        <w:tblW w:type="pct" w:w="5000"/>
+        <w:tblLayout w:type="fixed"/>
         <w:tblLook w:firstRow="0" w:lastRow="0" w:firstColumn="0" w:lastColumn="0" w:noHBand="0" w:noVBand="0" w:val="0000"/>
       </w:tblPr>
       <w:tblGrid>
-        <w:gridCol w:w="9638"/>
+        <w:gridCol w:w="7920"/>
       </w:tblGrid>
       <w:tr>
         <w:tc>
@@ -7840,12 +7905,12 @@
     <w:tbl>
       <w:tblPr>
         <w:tblStyle w:val="Table"/>
-        <w:tblW w:type="dxa" w:w="9638"/>
-        <w:tblLayout w:type="autofit"/>
+        <w:tblW w:type="pct" w:w="5000"/>
+        <w:tblLayout w:type="fixed"/>
         <w:tblLook w:firstRow="0" w:lastRow="0" w:firstColumn="0" w:lastColumn="0" w:noHBand="0" w:noVBand="0" w:val="0000"/>
       </w:tblPr>
       <w:tblGrid>
-        <w:gridCol w:w="9638"/>
+        <w:gridCol w:w="7920"/>
       </w:tblGrid>
       <w:tr>
         <w:tc>
@@ -7868,7 +7933,7 @@
             <w:tblPr>
               <w:tblLayout w:type="autofit"/>
               <w:jc w:val="center"/>
-              <w:tblW w:type="dxa" w:w="9638"/>
+              <w:tblW w:type="pct" w:w="5000"/>
               <w:tblLook w:firstRow="1" w:lastRow="0" w:firstColumn="0" w:lastColumn="0" w:noHBand="0" w:noVBand="1"/>
             </w:tblPr>
             <w:tr>
@@ -8918,12 +8983,12 @@
     <w:tbl>
       <w:tblPr>
         <w:tblStyle w:val="Table"/>
-        <w:tblW w:type="dxa" w:w="9638"/>
-        <w:tblLayout w:type="autofit"/>
+        <w:tblW w:type="pct" w:w="5000"/>
+        <w:tblLayout w:type="fixed"/>
         <w:tblLook w:firstRow="0" w:lastRow="0" w:firstColumn="0" w:lastColumn="0" w:noHBand="0" w:noVBand="0" w:val="0000"/>
       </w:tblPr>
       <w:tblGrid>
-        <w:gridCol w:w="9638"/>
+        <w:gridCol w:w="7920"/>
       </w:tblGrid>
       <w:tr>
         <w:tc>
@@ -9016,12 +9081,12 @@
     <w:tbl>
       <w:tblPr>
         <w:tblStyle w:val="Table"/>
-        <w:tblW w:type="dxa" w:w="9638"/>
-        <w:tblLayout w:type="autofit"/>
+        <w:tblW w:type="pct" w:w="5000"/>
+        <w:tblLayout w:type="fixed"/>
         <w:tblLook w:firstRow="0" w:lastRow="0" w:firstColumn="0" w:lastColumn="0" w:noHBand="0" w:noVBand="0" w:val="0000"/>
       </w:tblPr>
       <w:tblGrid>
-        <w:gridCol w:w="9638"/>
+        <w:gridCol w:w="7920"/>
       </w:tblGrid>
       <w:tr>
         <w:tc>
@@ -9042,17 +9107,17 @@
           </w:p>
           <w:tbl xmlns:w="http://schemas.openxmlformats.org/wordprocessingml/2006/main" xmlns:r="http://schemas.openxmlformats.org/officeDocument/2006/relationships" xmlns:w14="http://schemas.microsoft.com/office/word/2010/wordml" xmlns:wp="http://schemas.openxmlformats.org/drawingml/2006/wordprocessingDrawing" xmlns:a="http://schemas.openxmlformats.org/drawingml/2006/main" xmlns:pic="http://schemas.openxmlformats.org/drawingml/2006/picture">
             <w:tblPr>
-              <w:tblLayout w:type="autofit"/>
+              <w:tblLayout w:type="fixed"/>
               <w:jc w:val="center"/>
               <w:tblLook w:firstRow="1" w:lastRow="0" w:firstColumn="0" w:lastColumn="0" w:noHBand="0" w:noVBand="1"/>
             </w:tblPr>
             <w:tblGrid>
-              <w:gridCol w:w="2907"/>
-              <w:gridCol w:w="612"/>
-              <w:gridCol w:w="1377"/>
-              <w:gridCol w:w="1377"/>
-              <w:gridCol w:w="1224"/>
-              <w:gridCol w:w="2141"/>
+              <w:gridCol w:w="2736"/>
+              <w:gridCol w:w="576"/>
+              <w:gridCol w:w="1296"/>
+              <w:gridCol w:w="1296"/>
+              <w:gridCol w:w="1152"/>
+              <w:gridCol w:w="2016"/>
             </w:tblGrid>
             <w:tr>
               <w:trPr>
@@ -10445,12 +10510,12 @@
     <w:tbl>
       <w:tblPr>
         <w:tblStyle w:val="Table"/>
-        <w:tblW w:type="dxa" w:w="9638"/>
-        <w:tblLayout w:type="autofit"/>
+        <w:tblW w:type="pct" w:w="5000"/>
+        <w:tblLayout w:type="fixed"/>
         <w:tblLook w:firstRow="0" w:lastRow="0" w:firstColumn="0" w:lastColumn="0" w:noHBand="0" w:noVBand="0" w:val="0000"/>
       </w:tblPr>
       <w:tblGrid>
-        <w:gridCol w:w="9638"/>
+        <w:gridCol w:w="7920"/>
       </w:tblGrid>
       <w:tr>
         <w:tc>
@@ -10473,7 +10538,7 @@
             <w:tblPr>
               <w:tblLayout w:type="autofit"/>
               <w:jc w:val="center"/>
-              <w:tblW w:type="dxa" w:w="9638"/>
+              <w:tblW w:type="pct" w:w="5000"/>
               <w:tblLook w:firstRow="1" w:lastRow="0" w:firstColumn="0" w:lastColumn="0" w:noHBand="0" w:noVBand="1"/>
             </w:tblPr>
             <w:tr>
@@ -11404,12 +11469,12 @@
     <w:tbl>
       <w:tblPr>
         <w:tblStyle w:val="Table"/>
-        <w:tblW w:type="dxa" w:w="9638"/>
-        <w:tblLayout w:type="autofit"/>
+        <w:tblW w:type="pct" w:w="5000"/>
+        <w:tblLayout w:type="fixed"/>
         <w:tblLook w:firstRow="0" w:lastRow="0" w:firstColumn="0" w:lastColumn="0" w:noHBand="0" w:noVBand="0" w:val="0000"/>
       </w:tblPr>
       <w:tblGrid>
-        <w:gridCol w:w="9638"/>
+        <w:gridCol w:w="7920"/>
       </w:tblGrid>
       <w:tr>
         <w:tc>
@@ -11432,7 +11497,7 @@
             <w:tblPr>
               <w:tblLayout w:type="autofit"/>
               <w:jc w:val="center"/>
-              <w:tblW w:type="dxa" w:w="9638"/>
+              <w:tblW w:type="pct" w:w="5000"/>
               <w:tblLook w:firstRow="1" w:lastRow="0" w:firstColumn="0" w:lastColumn="0" w:noHBand="0" w:noVBand="1"/>
             </w:tblPr>
             <w:tr>
@@ -12307,12 +12372,12 @@
     <w:tbl>
       <w:tblPr>
         <w:tblStyle w:val="Table"/>
-        <w:tblW w:type="dxa" w:w="9638"/>
-        <w:tblLayout w:type="autofit"/>
+        <w:tblW w:type="pct" w:w="5000"/>
+        <w:tblLayout w:type="fixed"/>
         <w:tblLook w:firstRow="0" w:lastRow="0" w:firstColumn="0" w:lastColumn="0" w:noHBand="0" w:noVBand="0" w:val="0000"/>
       </w:tblPr>
       <w:tblGrid>
-        <w:gridCol w:w="9638"/>
+        <w:gridCol w:w="7920"/>
       </w:tblGrid>
       <w:tr>
         <w:tc>
@@ -12520,12 +12585,12 @@
     <w:tbl>
       <w:tblPr>
         <w:tblStyle w:val="Table"/>
-        <w:tblW w:type="dxa" w:w="9638"/>
-        <w:tblLayout w:type="autofit"/>
+        <w:tblW w:type="pct" w:w="5000"/>
+        <w:tblLayout w:type="fixed"/>
         <w:tblLook w:firstRow="0" w:lastRow="0" w:firstColumn="0" w:lastColumn="0" w:noHBand="0" w:noVBand="0" w:val="0000"/>
       </w:tblPr>
       <w:tblGrid>
-        <w:gridCol w:w="9638"/>
+        <w:gridCol w:w="7920"/>
       </w:tblGrid>
       <w:tr>
         <w:tc>
@@ -12643,12 +12708,12 @@
     <w:tbl>
       <w:tblPr>
         <w:tblStyle w:val="Table"/>
-        <w:tblW w:type="dxa" w:w="9638"/>
-        <w:tblLayout w:type="autofit"/>
+        <w:tblW w:type="pct" w:w="5000"/>
+        <w:tblLayout w:type="fixed"/>
         <w:tblLook w:firstRow="0" w:lastRow="0" w:firstColumn="0" w:lastColumn="0" w:noHBand="0" w:noVBand="0" w:val="0000"/>
       </w:tblPr>
       <w:tblGrid>
-        <w:gridCol w:w="9638"/>
+        <w:gridCol w:w="7920"/>
       </w:tblGrid>
       <w:tr>
         <w:tc>
@@ -12671,7 +12736,7 @@
             <w:tblPr>
               <w:tblLayout w:type="autofit"/>
               <w:jc w:val="center"/>
-              <w:tblW w:type="dxa" w:w="9638"/>
+              <w:tblW w:type="pct" w:w="5000"/>
               <w:tblLook w:firstRow="1" w:lastRow="0" w:firstColumn="0" w:lastColumn="0" w:noHBand="0" w:noVBand="1"/>
             </w:tblPr>
             <w:tr>
@@ -13585,12 +13650,12 @@
     <w:tbl>
       <w:tblPr>
         <w:tblStyle w:val="Table"/>
-        <w:tblW w:type="dxa" w:w="9638"/>
-        <w:tblLayout w:type="autofit"/>
+        <w:tblW w:type="pct" w:w="5000"/>
+        <w:tblLayout w:type="fixed"/>
         <w:tblLook w:firstRow="0" w:lastRow="0" w:firstColumn="0" w:lastColumn="0" w:noHBand="0" w:noVBand="0" w:val="0000"/>
       </w:tblPr>
       <w:tblGrid>
-        <w:gridCol w:w="9638"/>
+        <w:gridCol w:w="7920"/>
       </w:tblGrid>
       <w:tr>
         <w:tc>

</xml_diff>

<commit_message>
Auto sync z dom - 2026-06-20 17:37
</commit_message>
<xml_diff>
--- a/Praca/praca.docx
+++ b/Praca/praca.docx
@@ -31,7 +31,7 @@
         <w:pStyle w:val="Date"/>
       </w:pPr>
       <w:r>
-        <w:t xml:space="preserve">2026-06-19</w:t>
+        <w:t xml:space="preserve">2026-06-20</w:t>
       </w:r>
     </w:p>
     <w:p>
@@ -302,7 +302,81 @@
         <w:pStyle w:val="BodyText"/>
       </w:pPr>
       <w:r>
-        <w:t xml:space="preserve">Ponieważ ewaluacja nauki w dużej mierze opiera się na wskaźnikach bibliometrycznych, takich jak punktacja ministerialna, cytowania i liczba publikacji, indywidualne profile dorobku naukowców są ważnym przedmiotem analizy. Niniejsza praca nie odtwarza oficjalnego algorytmu ewaluacji, który działa na poziomie uczelni i dyscypliny. Analizuje natomiast zróżnicowanie indywidualnych profili bibliometrycznych pracowników prowadzących działalność naukową w tej samej dyscyplinie, a kategorię naukową uczelni traktuje jako zmienną opisową.</w:t>
+        <w:t xml:space="preserve">Ponieważ ewaluacja nauki w dużej mierze opiera się na wskaźnikach bibliometrycznych, takich jak punktacja ministerialna, cytowania i liczba publikacji, indywidualne profile dorobku naukowców są ważnym przedmiotem analizy. Analiza bibliometryczna jest w Polsce wykorzystywana zarówno w polityce naukowej i ewaluacji</w:t>
+      </w:r>
+      <w:r>
+        <w:t xml:space="preserve"> </w:t>
+      </w:r>
+      <w:r>
+        <w:t xml:space="preserve">(</w:t>
+      </w:r>
+      <w:hyperlink w:anchor="ref-Drabek2012">
+        <w:r>
+          <w:rPr>
+            <w:rStyle w:val="Hyperlink"/>
+          </w:rPr>
+          <w:t xml:space="preserve">Drabek 2012</w:t>
+        </w:r>
+      </w:hyperlink>
+      <w:r>
+        <w:t xml:space="preserve">;</w:t>
+      </w:r>
+      <w:r>
+        <w:t xml:space="preserve"> </w:t>
+      </w:r>
+      <w:hyperlink w:anchor="ref-Kulczycki2019">
+        <w:r>
+          <w:rPr>
+            <w:rStyle w:val="Hyperlink"/>
+          </w:rPr>
+          <w:t xml:space="preserve">Kulczycki 2019</w:t>
+        </w:r>
+      </w:hyperlink>
+      <w:r>
+        <w:t xml:space="preserve">)</w:t>
+      </w:r>
+      <w:r>
+        <w:t xml:space="preserve">, jak i do oceny dorobku pracowników poszczególnych uczelni</w:t>
+      </w:r>
+      <w:r>
+        <w:t xml:space="preserve"> </w:t>
+      </w:r>
+      <w:r>
+        <w:t xml:space="preserve">(</w:t>
+      </w:r>
+      <w:hyperlink w:anchor="ref-Grygiel2009">
+        <w:r>
+          <w:rPr>
+            <w:rStyle w:val="Hyperlink"/>
+          </w:rPr>
+          <w:t xml:space="preserve">Grygiel et al. 2009</w:t>
+        </w:r>
+      </w:hyperlink>
+      <w:r>
+        <w:t xml:space="preserve">)</w:t>
+      </w:r>
+      <w:r>
+        <w:t xml:space="preserve">; polskie piśmiennictwo dysponuje też przeglądami metod bibliometrycznych stosowanych do oceny i prognozowania rozwoju dyscyplin naukowych</w:t>
+      </w:r>
+      <w:r>
+        <w:t xml:space="preserve"> </w:t>
+      </w:r>
+      <w:r>
+        <w:t xml:space="preserve">(</w:t>
+      </w:r>
+      <w:hyperlink w:anchor="ref-Opalinski2017">
+        <w:r>
+          <w:rPr>
+            <w:rStyle w:val="Hyperlink"/>
+          </w:rPr>
+          <w:t xml:space="preserve">Opaliński 2017</w:t>
+        </w:r>
+      </w:hyperlink>
+      <w:r>
+        <w:t xml:space="preserve">)</w:t>
+      </w:r>
+      <w:r>
+        <w:t xml:space="preserve">. Niniejsza praca nie odtwarza oficjalnego algorytmu ewaluacji, który działa na poziomie uczelni i dyscypliny. Analizuje natomiast zróżnicowanie indywidualnych profili bibliometrycznych pracowników prowadzących działalność naukową w tej samej dyscyplinie, a kategorię naukową uczelni traktuje jako zmienną opisową.</w:t>
       </w:r>
     </w:p>
     <w:p>
@@ -363,7 +437,30 @@
         <w:t xml:space="preserve">)</w:t>
       </w:r>
       <w:r>
-        <w:t xml:space="preserve">. Pełni funkcję repozytorium instytucjonalnego oraz narzędzia wspierającego zarządzanie informacją o działalności naukowej uczelni: gromadzi dane o publikacjach, projektach, patentach, raportach, rozprawach doktorskich, metrykach bibliometrycznych i afiliacjach pracowników. Jest to jeden z najczęściej stosowanych systemów tego typu w polskim szkolnictwie wyższym, dostosowany do krajowego systemu ewaluacji nauki. Jego znaczenie dla niniejszej pracy polega na tym, że udostępnia porównywalne, uczelniane agregaty dorobku naukowego w jednolitej strukturze danych</w:t>
+        <w:t xml:space="preserve">. Pełni funkcję repozytorium instytucjonalnego oraz narzędzia wspierającego zarządzanie informacją o działalności naukowej uczelni: gromadzi dane o publikacjach, projektach, patentach, raportach, rozprawach doktorskich, metrykach bibliometrycznych i afiliacjach pracowników. Według stanu na 2018 r. system był wdrożony w kilkunastu polskich instytucjach naukowych (Politechnika Warszawska i jedenaście innych uczelni)</w:t>
+      </w:r>
+      <w:r>
+        <w:t xml:space="preserve"> </w:t>
+      </w:r>
+      <w:r>
+        <w:t xml:space="preserve">(</w:t>
+      </w:r>
+      <w:hyperlink w:anchor="Xfa806a68882317565cd91e2502e10e0c6dc8daa">
+        <w:r>
+          <w:rPr>
+            <w:rStyle w:val="Hyperlink"/>
+          </w:rPr>
+          <w:t xml:space="preserve">Rybiński et al. 2018</w:t>
+        </w:r>
+      </w:hyperlink>
+      <w:r>
+        <w:t xml:space="preserve">)</w:t>
+      </w:r>
+      <w:r>
+        <w:t xml:space="preserve"> </w:t>
+      </w:r>
+      <w:r>
+        <w:t xml:space="preserve">i jest dostosowany do krajowego systemu ewaluacji nauki. Jego znaczenie dla niniejszej pracy polega na tym, że udostępnia porównywalne, uczelniane agregaty dorobku naukowego w jednolitej strukturze danych</w:t>
       </w:r>
       <w:r>
         <w:t xml:space="preserve"> </w:t>
@@ -717,7 +814,39 @@
         <w:pStyle w:val="BodyText"/>
       </w:pPr>
       <w:r>
-        <w:t xml:space="preserve">Należy zaznaczyć, że wskaźniki te służą jako przybliżenie indywidualnego dorobku naukowego, a nie jako odtworzenie oficjalnej ewaluacji jakości działalności naukowej. Oficjalna ewaluacja prowadzona jest na poziomie uczelni i dyscypliny, uwzględnia udziały jednostkowe autorów oraz limity slotów publikacyjnych (3-krotność liczby N), a jej podstawą nie jest Impact Factor, lecz punktacja ministerialna czasopism</w:t>
+        <w:t xml:space="preserve">Należy zaznaczyć, że wskaźniki te służą jako przybliżenie indywidualnego dorobku naukowego, a nie jako odtworzenie oficjalnej ewaluacji jakości działalności naukowej; ostrożność w traktowaniu pojedynczych wskaźników jako miar jakości naukowej jest zgodna z zasadami odpowiedzialnej naukometrii</w:t>
+      </w:r>
+      <w:r>
+        <w:t xml:space="preserve"> </w:t>
+      </w:r>
+      <w:r>
+        <w:t xml:space="preserve">(</w:t>
+      </w:r>
+      <w:hyperlink w:anchor="X0b33f87ae5ad4597f5248ccd3781f8ded4d6a31">
+        <w:r>
+          <w:rPr>
+            <w:rStyle w:val="Hyperlink"/>
+          </w:rPr>
+          <w:t xml:space="preserve">Hicks et al.</w:t>
+        </w:r>
+        <w:r>
+          <w:rPr>
+            <w:rStyle w:val="Hyperlink"/>
+          </w:rPr>
+          <w:t xml:space="preserve"> </w:t>
+        </w:r>
+        <w:r>
+          <w:rPr>
+            <w:rStyle w:val="Hyperlink"/>
+          </w:rPr>
+          <w:t xml:space="preserve">2015</w:t>
+        </w:r>
+      </w:hyperlink>
+      <w:r>
+        <w:t xml:space="preserve">)</w:t>
+      </w:r>
+      <w:r>
+        <w:t xml:space="preserve">. Oficjalna ewaluacja prowadzona jest na poziomie uczelni i dyscypliny, uwzględnia udziały jednostkowe autorów oraz limity slotów publikacyjnych (3-krotność liczby N), a jej podstawą nie jest Impact Factor, lecz punktacja ministerialna czasopism</w:t>
       </w:r>
       <w:r>
         <w:t xml:space="preserve"> </w:t>
@@ -822,7 +951,27 @@
         <w:pStyle w:val="BodyText"/>
       </w:pPr>
       <w:r>
-        <w:t xml:space="preserve">Po oczyszczeniu danych z Omega-PSIR uzupełniono je informacjami z OpenAlex. Najpierw dopasowano autorów z badanej próby do rekordów w OpenAlex, wykorzystując identyfikator instytucji ROR oraz podobieństwo imienia i nazwiska. Następnie dla dopasowanych autorów pobrano informacje o publikacjach, cytowaniach, wskaźniku FWCI oraz współautorach. Zapytania do OpenAlex wykonywano z ograniczeniem tempa i identyfikacją użytkownika, zgodnie z zasadami korzystania z API.</w:t>
+        <w:t xml:space="preserve">Po oczyszczeniu danych z Omega-PSIR uzupełniono je informacjami z OpenAlex. Najpierw dopasowano autorów z badanej próby do rekordów w OpenAlex, wykorzystując identyfikator instytucji ROR oraz podobieństwo imienia i nazwiska. Oparcie powiązania na kanonicznych identyfikatorach (ROR dla instytucji, ORCID dla autorów) jest zgodne z podejściem stosowanym w dedykowanych narzędziach integracji danych OpenAlex w środowisku R</w:t>
+      </w:r>
+      <w:r>
+        <w:t xml:space="preserve"> </w:t>
+      </w:r>
+      <w:r>
+        <w:t xml:space="preserve">(</w:t>
+      </w:r>
+      <w:hyperlink w:anchor="ref-ariaOpenalexR2024">
+        <w:r>
+          <w:rPr>
+            <w:rStyle w:val="Hyperlink"/>
+          </w:rPr>
+          <w:t xml:space="preserve">Aria et al. 2024</w:t>
+        </w:r>
+      </w:hyperlink>
+      <w:r>
+        <w:t xml:space="preserve">)</w:t>
+      </w:r>
+      <w:r>
+        <w:t xml:space="preserve">. Następnie dla dopasowanych autorów pobrano informacje o publikacjach, cytowaniach, wskaźniku FWCI oraz współautorach. Zapytania do OpenAlex wykonywano z ograniczeniem tempa i identyfikacją użytkownika, zgodnie z zasadami korzystania z API.</w:t>
       </w:r>
     </w:p>
     <w:p>
@@ -933,6 +1082,34 @@
     </w:p>
     <w:p>
       <w:pPr>
+        <w:pStyle w:val="FirstParagraph"/>
+      </w:pPr>
+      <w:r>
+        <w:t xml:space="preserve">Całość analizy zorganizowano zgodnie z typowym dla badań bibliometrycznych przepływem pracy: projektowanie badania, gromadzenie i łączenie danych, analiza, wizualizacja oraz interpretacja</w:t>
+      </w:r>
+      <w:r>
+        <w:t xml:space="preserve"> </w:t>
+      </w:r>
+      <w:r>
+        <w:t xml:space="preserve">(</w:t>
+      </w:r>
+      <w:hyperlink w:anchor="ref-ariaBibliometrix2017">
+        <w:r>
+          <w:rPr>
+            <w:rStyle w:val="Hyperlink"/>
+          </w:rPr>
+          <w:t xml:space="preserve">Aria i Cuccurullo 2017</w:t>
+        </w:r>
+      </w:hyperlink>
+      <w:r>
+        <w:t xml:space="preserve">)</w:t>
+      </w:r>
+      <w:r>
+        <w:t xml:space="preserve">. Obliczenia zaimplementowano samodzielnie w językach Python i R (bez gotowych pakietów do mapowania nauki), korzystając z bibliotek ogólnego przeznaczenia opisanych niżej.</w:t>
+      </w:r>
+    </w:p>
+    <w:p>
+      <w:pPr>
         <w:pStyle w:val="Compact"/>
         <w:numPr>
           <w:ilvl w:val="0"/>
@@ -1171,7 +1348,27 @@
         <w:t xml:space="preserve"> </w:t>
       </w:r>
       <w:r>
-        <w:t xml:space="preserve">sprawdzono, którzy badacze publikują razem i czy tworzą większe grupy współpracy. Do wykrycia takich grup zastosowano algorytm Louvain</w:t>
+        <w:t xml:space="preserve">sprawdzono, którzy badacze publikują razem i czy tworzą większe grupy współpracy</w:t>
+      </w:r>
+      <w:r>
+        <w:t xml:space="preserve"> </w:t>
+      </w:r>
+      <w:r>
+        <w:t xml:space="preserve">(</w:t>
+      </w:r>
+      <w:hyperlink w:anchor="Xf57435758c1415795137dce9045dde0a68674c8">
+        <w:r>
+          <w:rPr>
+            <w:rStyle w:val="Hyperlink"/>
+          </w:rPr>
+          <w:t xml:space="preserve">Newman 2004</w:t>
+        </w:r>
+      </w:hyperlink>
+      <w:r>
+        <w:t xml:space="preserve">)</w:t>
+      </w:r>
+      <w:r>
+        <w:t xml:space="preserve">. Do wykrycia takich grup zastosowano algorytm Louvain</w:t>
       </w:r>
       <w:r>
         <w:t xml:space="preserve"> </w:t>
@@ -1240,7 +1437,7 @@
         <w:pStyle w:val="BodyText"/>
       </w:pPr>
       <w:r>
-        <w:t xml:space="preserve">W pracy pomocniczo wykorzystano duże modele językowe (LLM): Claude (Anthropic), Codex (OpenAI) oraz Gemini (Google). Posłużyły one jako narzędzia wsparcia technicznego i redakcyjnego: do przeglądu i porządkowania kodu, wykrywania niespójności w tekście i danych, redakcyjnego dopracowania języka oraz krytycznej rewizji fragmentów pracy. Modele nie były źródłem danych empirycznych ani nie prowadziły samodzielnego wnioskowania statystycznego; wszystkie obliczenia, decyzje metodyczne i interpretacje wyników pozostają autorskie i wykonano je opisanymi skryptami Python i R. Informacja odnosi się do stanu z okresu przygotowania pracy (2026); wykorzystano model Claude Opus 4.8 (środowisko Claude Code), Codex oparty na modelu GPT-5.5 (OpenAI) oraz model gemini-3-flash-preview (Gemini CLI w wersji 0.46.0, Google).</w:t>
+        <w:t xml:space="preserve">W pracy pomocniczo wykorzystano duże modele językowe (LLM): Claude (Anthropic), Codex (OpenAI) oraz Gemini (Google). Posłużyły one jako narzędzia wsparcia technicznego i redakcyjnego: do przeglądu i porządkowania kodu, wykrywania niespójności w tekście i danych, redakcyjnego dopracowania języka oraz krytycznej rewizji fragmentów pracy. Modele nie były źródłem danych empirycznych ani nie prowadziły samodzielnego wnioskowania statystycznego; wszystkie obliczenia, decyzje metodyczne i interpretacje wyników pozostają autorskie i wykonano je opisanymi skryptami Python i R. Informacja odnosi się do stanu z okresu przygotowania pracy (2026); wykorzystano model Claude Opus 4.8 (środowisko Claude Code), Codex oparty na modelu GPT-5.5 (OpenAI) oraz model Gemini 3.5 Flash (Gemini CLI, Google).</w:t>
       </w:r>
     </w:p>
     <w:bookmarkEnd w:id="21"/>
@@ -1314,7 +1511,7 @@
         <w:t xml:space="preserve">367 osób (79,4 %)</w:t>
       </w:r>
       <w:r>
-        <w:t xml:space="preserve">: UPWr 79,7 %, SGGW 89,3 %, URK 77,8 %, UWM 67,1 %. Dopasowanie wymagało normalizacji nazw uwzględniającej charakterystyczny dla URK sufiks afiliacyjny po przecinku (np. „Jan Kowalski, prof. URK”), którego nieusunięcie zaniżało początkowo dopasowanie tej uczelni do 47,5 %; po korekcie poziom URK zrównał się z pozostałymi. Najsłabiej dopasowany pozostaje UWM (67,1 %), co przekłada się na lekkie niedoreprezentowanie tej uczelni w analizach opartych na metrykach OpenAlex (FWCI, sieci współautorstwa).</w:t>
+        <w:t xml:space="preserve">: UPWr 79,7 %, SGGW 89,3 %, URK 77,8 %, UWM 67,1 %. Dopasowanie wymagało normalizacji nazw uwzględniającej charakterystyczny dla URK sufiks afiliacyjny po przecinku (np. „Jan Kowalski, prof. URK”), którego nieusunięcie zaniżało początkowo dopasowanie tej uczelni do 47,5 %; po korekcie poziom URK zrównał się z pozostałymi. Najsłabiej dopasowany pozostaje UWM (67,1 %), co przekłada się na lekkie niedoreprezentowanie tej uczelni w analizach opartych na metrykach OpenAlex (FWCI, sieci współautorstwa). Liczbę fałszywych dopasowań ograniczał filtr instytucjonalny: kandydatów z OpenAlex zawężano do autorów powiązanych z identyfikatorem ROR danej uczelni, więc dopasowanie nazwiska odbywało się wyłącznie w obrębie właściwej afiliacji.</w:t>
       </w:r>
     </w:p>
     <w:p>
@@ -4268,7 +4465,7 @@
                       <w:szCs w:val="20"/>
                       <w:color w:val="000000"/>
                     </w:rPr>
-                    <w:t xml:space="preserve">82</w:t>
+                    <w:t xml:space="preserve">82,5</w:t>
                   </w:r>
                 </w:p>
               </w:tc>
@@ -4867,7 +5064,7 @@
                       <w:szCs w:val="20"/>
                       <w:color w:val="000000"/>
                     </w:rPr>
-                    <w:t xml:space="preserve">62</w:t>
+                    <w:t xml:space="preserve">63</w:t>
                   </w:r>
                 </w:p>
               </w:tc>
@@ -4921,7 +5118,7 @@
                       <w:szCs w:val="20"/>
                       <w:color w:val="000000"/>
                     </w:rPr>
-                    <w:t xml:space="preserve">49,0</w:t>
+                    <w:t xml:space="preserve">52,6</w:t>
                   </w:r>
                 </w:p>
               </w:tc>
@@ -5306,7 +5503,7 @@
         <w:pStyle w:val="BodyText"/>
       </w:pPr>
       <w:r>
-        <w:t xml:space="preserve">Decyzję tę uzasadnia także kształt rozkładów pokazany na</w:t>
+        <w:t xml:space="preserve">Decyzję tę uzasadnia także kształt rozkładów, który przedstawia</w:t>
       </w:r>
       <w:r>
         <w:t xml:space="preserve"> </w:t>
@@ -5407,10 +5604,7 @@
         <w:pStyle w:val="BodyText"/>
       </w:pPr>
       <w:r>
-        <w:t xml:space="preserve">Wyniki tego porównania dla trzech metryk o pełnym pokryciu pokazano na</w:t>
-      </w:r>
-      <w:r>
-        <w:t xml:space="preserve"> </w:t>
+        <w:t xml:space="preserve">Wyniki tego porównania dla trzech metryk o pełnym pokryciu pokazano jako wykresy pudełkowe z oznaczeniami grup jednorodnych (</w:t>
       </w:r>
       <w:hyperlink w:anchor="fig-hindex">
         <w:r>
@@ -5435,10 +5629,7 @@
         </w:r>
       </w:hyperlink>
       <w:r>
-        <w:t xml:space="preserve"> </w:t>
-      </w:r>
-      <w:r>
-        <w:t xml:space="preserve">i</w:t>
+        <w:t xml:space="preserve">,</w:t>
       </w:r>
       <w:r>
         <w:t xml:space="preserve"> </w:t>
@@ -5452,10 +5643,7 @@
         </w:r>
       </w:hyperlink>
       <w:r>
-        <w:t xml:space="preserve"> </w:t>
-      </w:r>
-      <w:r>
-        <w:t xml:space="preserve">jako wykresy pudełkowe z oznaczeniami grup jednorodnych. Na każdym z nich naniesiono dwa niezależne zestawy grup jednorodnych (CLD):</w:t>
+        <w:t xml:space="preserve">). Na każdym z nich naniesiono dwa niezależne zestawy grup jednorodnych (CLD):</w:t>
       </w:r>
       <w:r>
         <w:t xml:space="preserve"> </w:t>
@@ -5649,21 +5837,7 @@
               <w:pStyle w:val="ImageCaption"/>
             </w:pPr>
             <w:r>
-              <w:t xml:space="preserve">Rysunek 5: Wykres pudełkowy sumarycznego Impact Factor w dwuczynnikowym układzie uczelnia × stanowisko; oznaczenia grup jednorodnych (CLD) jak na</w:t>
-            </w:r>
-            <w:r>
-              <w:t xml:space="preserve"> </w:t>
-            </w:r>
-            <w:hyperlink w:anchor="fig-hindex">
-              <w:r>
-                <w:rPr>
-                  <w:rStyle w:val="Hyperlink"/>
-                </w:rPr>
-                <w:t xml:space="preserve">Rysunek 4</w:t>
-              </w:r>
-            </w:hyperlink>
-            <w:r>
-              <w:t xml:space="preserve">.</w:t>
+              <w:t xml:space="preserve">Rysunek 5: Wykres pudełkowy sumarycznego Impact Factor w dwuczynnikowym układzie uczelnia × stanowisko; oznaczenia grup jednorodnych (CLD) opisano w tekście powyżej.</w:t>
             </w:r>
           </w:p>
           <w:bookmarkEnd w:id="41"/>
@@ -5750,21 +5924,7 @@
               <w:pStyle w:val="ImageCaption"/>
             </w:pPr>
             <w:r>
-              <w:t xml:space="preserve">Rysunek 6: Wykres pudełkowy liczby publikacji w dwuczynnikowym układzie uczelnia × stanowisko; oznaczenia grup jednorodnych (CLD) jak na</w:t>
-            </w:r>
-            <w:r>
-              <w:t xml:space="preserve"> </w:t>
-            </w:r>
-            <w:hyperlink w:anchor="fig-hindex">
-              <w:r>
-                <w:rPr>
-                  <w:rStyle w:val="Hyperlink"/>
-                </w:rPr>
-                <w:t xml:space="preserve">Rysunek 4</w:t>
-              </w:r>
-            </w:hyperlink>
-            <w:r>
-              <w:t xml:space="preserve">.</w:t>
+              <w:t xml:space="preserve">Rysunek 6: Wykres pudełkowy liczby publikacji w dwuczynnikowym układzie uczelnia × stanowisko; oznaczenia grup jednorodnych (CLD) opisano w tekście powyżej.</w:t>
             </w:r>
           </w:p>
           <w:bookmarkEnd w:id="45"/>
@@ -5784,7 +5944,7 @@
         <w:pStyle w:val="BodyText"/>
       </w:pPr>
       <w:r>
-        <w:t xml:space="preserve">Porównania post-hoc wykonane osobno w obrębie każdej uczelni pokazują, że adiunkci najczęściej różnią się istotnie od obu grup profesorskich. Natomiast profesorowie uczelni i profesorowie zwyczajni różnią się między sobą rzadziej.</w:t>
+        <w:t xml:space="preserve">Porównania post-hoc wykonane osobno w obrębie każdej uczelni pokazują, że adiunkci najczęściej różnią się istotnie od obu grup profesorskich. Natomiast profesorowie uczelni i profesorowie różnią się między sobą rzadziej.</w:t>
       </w:r>
     </w:p>
     <w:p>
@@ -6074,7 +6234,7 @@
                       <w:szCs w:val="20"/>
                       <w:color w:val="000000"/>
                     </w:rPr>
-                    <w:t xml:space="preserve">Grupy jednorodne</w:t>
+                    <w:t xml:space="preserve">Liczba grup CLD</w:t>
                   </w:r>
                 </w:p>
               </w:tc>
@@ -12931,7 +13091,7 @@
         <w:t xml:space="preserve">)</w:t>
       </w:r>
       <w:r>
-        <w:t xml:space="preserve">. Random Forest buduje wiele drzew decyzyjnych na losowych podpróbach danych i cech, a następnie łączy ich predykcje przez głosowanie, co ogranicza ryzyko przeuczenia pojedynczego drzewa. XGBoost tworzy drzewa sekwencyjnie, tak aby każde kolejne korygowało błędy poprzednich (technika gradient boosting), dzięki czemu często osiąga bardzo wysoką skuteczność predykcyjną. Oba modele dobrze radzą sobie z danymi tabelarycznymi, nieliniowymi zależnościami i interakcjami między cechami, bez potrzeby wcześniejszego skalowania zmiennych. Ich parametry dobrano z wykorzystaniem 5-krotnej walidacji krzyżowej, a wyniki na zbiorze testowym przedstawiono w</w:t>
+        <w:t xml:space="preserve">. Random Forest buduje wiele drzew decyzyjnych na losowych podpróbach danych i cech, a następnie łączy ich predykcje przez głosowanie, co ogranicza ryzyko przeuczenia pojedynczego drzewa. XGBoost tworzy drzewa sekwencyjnie, tak aby każde kolejne korygowało błędy poprzednich (technika gradient boosting), dzięki czemu często osiąga bardzo wysoką skuteczność predykcyjną. Oba modele dobrze radzą sobie z danymi tabelarycznymi, nieliniowymi zależnościami i interakcjami między cechami, bez potrzeby wcześniejszego skalowania zmiennych. Ich parametry dobrano z wykorzystaniem 5-krotnej walidacji krzyżowej, a wyniki na zbiorze testowym przedstawia</w:t>
       </w:r>
       <w:r>
         <w:t xml:space="preserve"> </w:t>
@@ -15001,6 +15161,14 @@
         </w:tc>
       </w:tr>
     </w:tbl>
+    <w:p>
+      <w:pPr>
+        <w:pStyle w:val="BodyText"/>
+      </w:pPr>
+      <w:r>
+        <w:t xml:space="preserve">Tak wysoka czułość wiąże się jednak z kosztem precyzji: spośród osób wskazanych przez model jako wysokiego wpływu znaczna część (21 z około 30 wskazań w zbiorze testowym) to wskazania fałszywie dodatnie. W zastosowaniach wymagających wąskiej, trafnej listy (np. typowanie kandydatów do wyróżnień) próg Youdena może być więc zbyt agresywny, a wybór progu powinien zależeć od tego, czy droższy jest błąd pominięcia, czy fałszywego wskazania.</w:t>
+      </w:r>
+    </w:p>
     <w:p>
       <w:pPr>
         <w:pStyle w:val="BodyText"/>
@@ -16236,6 +16404,14 @@
         <w:pStyle w:val="BodyText"/>
       </w:pPr>
       <w:r>
+        <w:t xml:space="preserve">Warto odnotować bardzo wysoką korelację sumarycznego IF z punktacją MEiN (r = 0,95, w trzech uczelniach udostępniających tę metrykę). Na poziomie zagregowanym polski system punktacji czasopism, mimo powszechnej krytyki jego stabilności, w analizowanej dyscyplinie silnie odzwierciedla międzynarodowy Impact Factor. Spójnie z tym wskaźnik IF / MEiN nie różnicował istotnie badanych grup (p = 0,075), co sugeruje, że relacja punktów do IF jest zbliżona niezależnie od uczelni i stanowiska, choć przy granicznej istotności wniosek ten wymaga ostrożności.</w:t>
+      </w:r>
+    </w:p>
+    <w:p>
+      <w:pPr>
+        <w:pStyle w:val="BodyText"/>
+      </w:pPr>
+      <w:r>
         <w:t xml:space="preserve">Inaczej wygląda sieć współautorstwa. Wspólnoty wykryte w sieci pokrywają się przede wszystkim z uczelnią, a nie ze stanowiskiem. Zgodność społeczności z uczelnią jest wyraźna (NMI = 0,58), natomiast zgodność ze stanowiskiem jest bardzo słaba (NMI = 0,09). Oznacza to, że badacze o podobnym poziomie dorobku mogą pracować w różnych uczelniach, ale faktyczna współpraca naukowa najczęściej przebiega wewnątrz instytucji.</w:t>
       </w:r>
     </w:p>
@@ -16295,6 +16471,14 @@
       </w:pPr>
       <w:r>
         <w:t xml:space="preserve">Oznacza to, że skumulowany wpływ publikacyjny jest silnie związany z wielkością dorobku, ale jakość pojedynczych publikacji zależy bardziej od sposobu współpracy naukowej niż od stażu czy formalnego stanowiska. Wynik ten pokazuje, że wysoki wpływ publikacyjny nie jest wyłącznie efektem długiego stażu akademickiego. Podobny wniosek wynikał już z analizy klastrów, w której wyróżniono profil jakościowy obejmujący wielu młodszych badaczy.</w:t>
+      </w:r>
+    </w:p>
+    <w:p>
+      <w:pPr>
+        <w:pStyle w:val="BodyText"/>
+      </w:pPr>
+      <w:r>
+        <w:t xml:space="preserve">Spójny obraz daje też wariant klastrowania k = 3, w którym wyodrębniono profil jakościowy zdominowany przez asystentów i adiunktów o wysokim FWCI i IF na publikację. Może to odzwierciedlać zmianę pokoleniową, w której młodsi badacze częściej publikują w prestiżowych czasopismach o szerokim zasięgu, w ramach większych zespołów współautorskich, zamiast budować dużą liczbę prac o niższym oddziaływaniu. Ponieważ dane mają charakter przekrojowy, interpretację tę należy traktować jako hipotezę: nie można odróżnić rzeczywistego efektu pokoleniowego od efektu etapu kariery ani od selekcji osób pozostających w nauce.</w:t>
       </w:r>
     </w:p>
     <w:bookmarkEnd w:id="80"/>
@@ -16582,7 +16766,7 @@
         </w:numPr>
       </w:pPr>
       <w:r>
-        <w:t xml:space="preserve">Dopasowanie do OpenAlex nie było pełne. Średnio do OpenAlex dopasowano 79,4 % badaczy. Najniższy poziom dopasowania wystąpił w UWM (67,1 %). Oznacza to, że metryki pochodzące z OpenAlex, takie jak FWCI i dane o współautorstwie, dotyczą tylko części próby i mogą być obciążone brakami danych.</w:t>
+        <w:t xml:space="preserve">Dopasowanie do OpenAlex nie było pełne. Średnio do OpenAlex dopasowano 79,4 % badaczy. Najniższy poziom dopasowania wystąpił w UWM (67,1 %). Oznacza to, że metryki pochodzące z OpenAlex, takie jak FWCI i dane o współautorstwie, dotyczą tylko części próby i mogą być obciążone brakami danych. Dopasowanie miało przy tym charakter automatyczny (filtr ROR + próg Jaro-Winklera), bez ręcznej weryfikacji każdego rekordu, co przy nazwiskach popularnych może być źródłem pojedynczych błędnych przypisań.</w:t>
       </w:r>
     </w:p>
     <w:p>
@@ -16642,7 +16826,27 @@
         </w:numPr>
       </w:pPr>
       <w:r>
-        <w:t xml:space="preserve">OpenAlex nie obejmuje pełnego polskiego dorobku. Część polskich czasopism, monografii i innych publikacji widocznych w Omega-PSIR może nie być indeksowana w OpenAlex. Dlatego Omega-PSIR przyjęto jako źródło podstawowe, a OpenAlex jako źródło uzupełniające.</w:t>
+        <w:t xml:space="preserve">OpenAlex nie obejmuje pełnego polskiego dorobku. Część polskich czasopism, monografii i innych publikacji widocznych w Omega-PSIR może nie być indeksowana w OpenAlex; pokrycie OpenAlex względem baz komercyjnych było przedmiotem osobnych analiz porównawczych</w:t>
+      </w:r>
+      <w:r>
+        <w:t xml:space="preserve"> </w:t>
+      </w:r>
+      <w:r>
+        <w:t xml:space="preserve">(</w:t>
+      </w:r>
+      <w:hyperlink w:anchor="ref-culbertReferenceCoverageAnalysis2025">
+        <w:r>
+          <w:rPr>
+            <w:rStyle w:val="Hyperlink"/>
+          </w:rPr>
+          <w:t xml:space="preserve">Culbert et al. 2025</w:t>
+        </w:r>
+      </w:hyperlink>
+      <w:r>
+        <w:t xml:space="preserve">)</w:t>
+      </w:r>
+      <w:r>
+        <w:t xml:space="preserve">. Dlatego Omega-PSIR przyjęto jako źródło podstawowe, a OpenAlex jako źródło uzupełniające.</w:t>
       </w:r>
     </w:p>
     <w:bookmarkEnd w:id="87"/>
@@ -16742,7 +16946,7 @@
         <w:pStyle w:val="BodyText"/>
       </w:pPr>
       <w:r>
-        <w:t xml:space="preserve">Po drugie, porównywalność danych utrudnia to, że poszczególne uczelnie nie udostępniają tych samych metryk w taki sam sposób. Brak zagregowanej punktacji MEiN w SGGW oraz brak wskaźnika SNIP w UWM ograniczyły część analiz. Dlatego przydatne byłoby udostępnianie podstawowych metryk, takich jak sumaryczny IF, SNIP, punktacja MEiN i h-index, w jednolitej oraz maszynowo dostępnej formie.</w:t>
+        <w:t xml:space="preserve">Po drugie, porównywalność danych utrudnia to, że poszczególne uczelnie nie udostępniają tych samych metryk w taki sam sposób. Brak zagregowanej punktacji MEiN w SGGW oraz brak wskaźnika SNIP w UWM ograniczyły część analiz. Dlatego przydatne byłoby udostępnianie podstawowych metryk, takich jak sumaryczny IF, SNIP, punktacja MEiN i h-index, w jednolitej oraz maszynowo dostępnej formie. Wskazuje to na potrzebę odgórnej standaryzacji struktur danych i interfejsów udostępniania wskaźników we wdrożeniach systemów klasy CRIS na polskich uczelniach, tak aby krajowa agregacja kluczowych metryk (w tym punktacji MEiN) nie wymagała tworzenia osobnych reguł mapowania dla poszczególnych jednostek.</w:t>
       </w:r>
     </w:p>
     <w:p>
@@ -16755,7 +16959,7 @@
     </w:p>
     <w:bookmarkEnd w:id="89"/>
     <w:bookmarkEnd w:id="90"/>
-    <w:bookmarkStart w:id="112" w:name="bibliografia"/>
+    <w:bookmarkStart w:id="128" w:name="bibliografia"/>
     <w:p>
       <w:pPr>
         <w:pStyle w:val="Heading1"/>
@@ -16764,8 +16968,139 @@
         <w:t xml:space="preserve">Bibliografia</w:t>
       </w:r>
     </w:p>
-    <w:bookmarkStart w:id="111" w:name="refs"/>
-    <w:bookmarkStart w:id="91" w:name="ref-blondel2008"/>
+    <w:bookmarkStart w:id="127" w:name="refs"/>
+    <w:bookmarkStart w:id="92" w:name="ref-ariaBibliometrix2017"/>
+    <w:p>
+      <w:pPr>
+        <w:pStyle w:val="Bibliography"/>
+      </w:pPr>
+      <w:r>
+        <w:t xml:space="preserve">Aria, Massimo, i Corrado Cuccurullo. 2017.</w:t>
+      </w:r>
+      <w:r>
+        <w:t xml:space="preserve"> </w:t>
+      </w:r>
+      <w:r>
+        <w:t xml:space="preserve">„bibliometrix: An</w:t>
+      </w:r>
+      <w:r>
+        <w:t xml:space="preserve"> </w:t>
+      </w:r>
+      <w:r>
+        <w:t xml:space="preserve">R</w:t>
+      </w:r>
+      <w:r>
+        <w:t xml:space="preserve">-tool for comprehensive science mapping analysis”</w:t>
+      </w:r>
+      <w:r>
+        <w:t xml:space="preserve">.</w:t>
+      </w:r>
+      <w:r>
+        <w:t xml:space="preserve"> </w:t>
+      </w:r>
+      <w:r>
+        <w:rPr>
+          <w:i/>
+          <w:iCs/>
+        </w:rPr>
+        <w:t xml:space="preserve">Journal of Informetrics</w:t>
+      </w:r>
+      <w:r>
+        <w:t xml:space="preserve"> </w:t>
+      </w:r>
+      <w:r>
+        <w:t xml:space="preserve">11 (4): 959–75.</w:t>
+      </w:r>
+      <w:r>
+        <w:t xml:space="preserve"> </w:t>
+      </w:r>
+      <w:hyperlink r:id="rId91">
+        <w:r>
+          <w:rPr>
+            <w:rStyle w:val="Hyperlink"/>
+          </w:rPr>
+          <w:t xml:space="preserve">https://doi.org/10.1016/j.joi.2017.08.007</w:t>
+        </w:r>
+      </w:hyperlink>
+      <w:r>
+        <w:t xml:space="preserve">.</w:t>
+      </w:r>
+    </w:p>
+    <w:bookmarkEnd w:id="92"/>
+    <w:bookmarkStart w:id="94" w:name="ref-ariaOpenalexR2024"/>
+    <w:p>
+      <w:pPr>
+        <w:pStyle w:val="Bibliography"/>
+      </w:pPr>
+      <w:r>
+        <w:t xml:space="preserve">Aria, Massimo, Trang Le, Corrado Cuccurullo, Alessandra Belfiore, i June Choe. 2024.</w:t>
+      </w:r>
+      <w:r>
+        <w:t xml:space="preserve"> </w:t>
+      </w:r>
+      <w:r>
+        <w:t xml:space="preserve">„</w:t>
+      </w:r>
+      <w:r>
+        <w:t xml:space="preserve">openalexR</w:t>
+      </w:r>
+      <w:r>
+        <w:t xml:space="preserve">: An</w:t>
+      </w:r>
+      <w:r>
+        <w:t xml:space="preserve"> </w:t>
+      </w:r>
+      <w:r>
+        <w:t xml:space="preserve">R</w:t>
+      </w:r>
+      <w:r>
+        <w:t xml:space="preserve">-Tool for Collecting Bibliometric Data from</w:t>
+      </w:r>
+      <w:r>
+        <w:t xml:space="preserve"> </w:t>
+      </w:r>
+      <w:r>
+        <w:t xml:space="preserve">OpenAlex</w:t>
+      </w:r>
+      <w:r>
+        <w:t xml:space="preserve">”</w:t>
+      </w:r>
+      <w:r>
+        <w:t xml:space="preserve">.</w:t>
+      </w:r>
+      <w:r>
+        <w:t xml:space="preserve"> </w:t>
+      </w:r>
+      <w:r>
+        <w:rPr>
+          <w:i/>
+          <w:iCs/>
+        </w:rPr>
+        <w:t xml:space="preserve">The R Journal</w:t>
+      </w:r>
+      <w:r>
+        <w:t xml:space="preserve"> </w:t>
+      </w:r>
+      <w:r>
+        <w:t xml:space="preserve">15 (4): 167–80.</w:t>
+      </w:r>
+      <w:r>
+        <w:t xml:space="preserve"> </w:t>
+      </w:r>
+      <w:hyperlink r:id="rId93">
+        <w:r>
+          <w:rPr>
+            <w:rStyle w:val="Hyperlink"/>
+          </w:rPr>
+          <w:t xml:space="preserve">https://doi.org/10.32614/RJ-2023-089</w:t>
+        </w:r>
+      </w:hyperlink>
+      <w:r>
+        <w:t xml:space="preserve">.</w:t>
+      </w:r>
+    </w:p>
+    <w:bookmarkEnd w:id="94"/>
+    <w:bookmarkStart w:id="95" w:name="ref-blondel2008"/>
     <w:p>
       <w:pPr>
         <w:pStyle w:val="Bibliography"/>
@@ -16799,8 +17134,8 @@
         <w:t xml:space="preserve">2008 (10): P10008.</w:t>
       </w:r>
     </w:p>
-    <w:bookmarkEnd w:id="91"/>
-    <w:bookmarkStart w:id="92" w:name="ref-breiman2001"/>
+    <w:bookmarkEnd w:id="95"/>
+    <w:bookmarkStart w:id="96" w:name="ref-breiman2001"/>
     <w:p>
       <w:pPr>
         <w:pStyle w:val="Bibliography"/>
@@ -16834,8 +17169,8 @@
         <w:t xml:space="preserve">45 (1): 5–32.</w:t>
       </w:r>
     </w:p>
-    <w:bookmarkEnd w:id="92"/>
-    <w:bookmarkStart w:id="93" w:name="ref-chen2016"/>
+    <w:bookmarkEnd w:id="96"/>
+    <w:bookmarkStart w:id="97" w:name="ref-chen2016"/>
     <w:p>
       <w:pPr>
         <w:pStyle w:val="Bibliography"/>
@@ -16872,8 +17207,125 @@
         <w:t xml:space="preserve">, 785–94.</w:t>
       </w:r>
     </w:p>
-    <w:bookmarkEnd w:id="93"/>
-    <w:bookmarkStart w:id="94" w:name="ref-garfield2006"/>
+    <w:bookmarkEnd w:id="97"/>
+    <w:bookmarkStart w:id="99" w:name="ref-culbertReferenceCoverageAnalysis2025"/>
+    <w:p>
+      <w:pPr>
+        <w:pStyle w:val="Bibliography"/>
+      </w:pPr>
+      <w:r>
+        <w:t xml:space="preserve">Culbert, Jack H., Anne Hobert, Najko Jahn, et al. 2025.</w:t>
+      </w:r>
+      <w:r>
+        <w:t xml:space="preserve"> </w:t>
+      </w:r>
+      <w:r>
+        <w:t xml:space="preserve">„Reference coverage analysis of</w:t>
+      </w:r>
+      <w:r>
+        <w:t xml:space="preserve"> </w:t>
+      </w:r>
+      <w:r>
+        <w:t xml:space="preserve">OpenAlex</w:t>
+      </w:r>
+      <w:r>
+        <w:t xml:space="preserve"> </w:t>
+      </w:r>
+      <w:r>
+        <w:t xml:space="preserve">compared to</w:t>
+      </w:r>
+      <w:r>
+        <w:t xml:space="preserve"> </w:t>
+      </w:r>
+      <w:r>
+        <w:t xml:space="preserve">Web of Science</w:t>
+      </w:r>
+      <w:r>
+        <w:t xml:space="preserve"> </w:t>
+      </w:r>
+      <w:r>
+        <w:t xml:space="preserve">and</w:t>
+      </w:r>
+      <w:r>
+        <w:t xml:space="preserve"> </w:t>
+      </w:r>
+      <w:r>
+        <w:t xml:space="preserve">Scopus</w:t>
+      </w:r>
+      <w:r>
+        <w:t xml:space="preserve">”</w:t>
+      </w:r>
+      <w:r>
+        <w:t xml:space="preserve">.</w:t>
+      </w:r>
+      <w:r>
+        <w:t xml:space="preserve"> </w:t>
+      </w:r>
+      <w:r>
+        <w:rPr>
+          <w:i/>
+          <w:iCs/>
+        </w:rPr>
+        <w:t xml:space="preserve">Scientometrics</w:t>
+      </w:r>
+      <w:r>
+        <w:t xml:space="preserve"> </w:t>
+      </w:r>
+      <w:r>
+        <w:t xml:space="preserve">130 (4): 2475–92.</w:t>
+      </w:r>
+      <w:r>
+        <w:t xml:space="preserve"> </w:t>
+      </w:r>
+      <w:hyperlink r:id="rId98">
+        <w:r>
+          <w:rPr>
+            <w:rStyle w:val="Hyperlink"/>
+          </w:rPr>
+          <w:t xml:space="preserve">https://doi.org/10.1007/s11192-025-05293-3</w:t>
+        </w:r>
+      </w:hyperlink>
+      <w:r>
+        <w:t xml:space="preserve">.</w:t>
+      </w:r>
+    </w:p>
+    <w:bookmarkEnd w:id="99"/>
+    <w:bookmarkStart w:id="100" w:name="ref-Drabek2012"/>
+    <w:p>
+      <w:pPr>
+        <w:pStyle w:val="Bibliography"/>
+      </w:pPr>
+      <w:r>
+        <w:t xml:space="preserve">Drabek, Aneta. 2012.</w:t>
+      </w:r>
+      <w:r>
+        <w:t xml:space="preserve"> </w:t>
+      </w:r>
+      <w:r>
+        <w:t xml:space="preserve">„Wykorzystanie bibliometrii w polityce naukowej”</w:t>
+      </w:r>
+      <w:r>
+        <w:t xml:space="preserve">.</w:t>
+      </w:r>
+      <w:r>
+        <w:t xml:space="preserve"> </w:t>
+      </w:r>
+      <w:r>
+        <w:rPr>
+          <w:i/>
+          <w:iCs/>
+        </w:rPr>
+        <w:t xml:space="preserve">Biuletyn EBIB</w:t>
+      </w:r>
+      <w:r>
+        <w:t xml:space="preserve"> </w:t>
+      </w:r>
+      <w:r>
+        <w:t xml:space="preserve">130 (3).</w:t>
+      </w:r>
+    </w:p>
+    <w:bookmarkEnd w:id="100"/>
+    <w:bookmarkStart w:id="101" w:name="ref-garfield2006"/>
     <w:p>
       <w:pPr>
         <w:pStyle w:val="Bibliography"/>
@@ -16907,8 +17359,116 @@
         <w:t xml:space="preserve">295 (1): 90–93.</w:t>
       </w:r>
     </w:p>
-    <w:bookmarkEnd w:id="94"/>
-    <w:bookmarkStart w:id="95" w:name="ref-hirsch2005"/>
+    <w:bookmarkEnd w:id="101"/>
+    <w:bookmarkStart w:id="102" w:name="ref-Grygiel2009"/>
+    <w:p>
+      <w:pPr>
+        <w:pStyle w:val="Bibliography"/>
+      </w:pPr>
+      <w:r>
+        <w:t xml:space="preserve">Grygiel, Paweł, Sławomir Rębisz, i Grzegorz Humenny. 2009.</w:t>
+      </w:r>
+      <w:r>
+        <w:t xml:space="preserve"> </w:t>
+      </w:r>
+      <w:r>
+        <w:t xml:space="preserve">„Analiza bibliometryczna jako narzędzie badania efektywności nauczycieli akademickich na przykładzie</w:t>
+      </w:r>
+      <w:r>
+        <w:t xml:space="preserve"> </w:t>
+      </w:r>
+      <w:r>
+        <w:t xml:space="preserve">Uniwersytetu Rzeszowskiego</w:t>
+      </w:r>
+      <w:r>
+        <w:t xml:space="preserve">”</w:t>
+      </w:r>
+      <w:r>
+        <w:t xml:space="preserve">.</w:t>
+      </w:r>
+      <w:r>
+        <w:t xml:space="preserve"> </w:t>
+      </w:r>
+      <w:r>
+        <w:rPr>
+          <w:i/>
+          <w:iCs/>
+        </w:rPr>
+        <w:t xml:space="preserve">Zarządzanie Publiczne</w:t>
+      </w:r>
+      <w:r>
+        <w:t xml:space="preserve"> </w:t>
+      </w:r>
+      <w:r>
+        <w:t xml:space="preserve">7 (3): 65–84.</w:t>
+      </w:r>
+    </w:p>
+    <w:bookmarkEnd w:id="102"/>
+    <w:bookmarkStart w:id="104" w:name="X0b33f87ae5ad4597f5248ccd3781f8ded4d6a31"/>
+    <w:p>
+      <w:pPr>
+        <w:pStyle w:val="Bibliography"/>
+      </w:pPr>
+      <w:r>
+        <w:t xml:space="preserve">Hicks, Diana, Paul Wouters, Ludo Waltman, Sarah de Rijcke, i Ismael Rafols</w:t>
+      </w:r>
+      <w:r>
+        <w:t xml:space="preserve">. 2015.</w:t>
+      </w:r>
+      <w:r>
+        <w:t xml:space="preserve"> </w:t>
+      </w:r>
+      <w:r>
+        <w:t xml:space="preserve">„Bibliometrics: The</w:t>
+      </w:r>
+      <w:r>
+        <w:t xml:space="preserve"> </w:t>
+      </w:r>
+      <w:r>
+        <w:t xml:space="preserve">Leiden Manifesto</w:t>
+      </w:r>
+      <w:r>
+        <w:t xml:space="preserve"> </w:t>
+      </w:r>
+      <w:r>
+        <w:t xml:space="preserve">for research metrics”</w:t>
+      </w:r>
+      <w:r>
+        <w:t xml:space="preserve">.</w:t>
+      </w:r>
+      <w:r>
+        <w:t xml:space="preserve"> </w:t>
+      </w:r>
+      <w:r>
+        <w:rPr>
+          <w:i/>
+          <w:iCs/>
+        </w:rPr>
+        <w:t xml:space="preserve">Nature</w:t>
+      </w:r>
+      <w:r>
+        <w:t xml:space="preserve"> </w:t>
+      </w:r>
+      <w:r>
+        <w:t xml:space="preserve">520 (7548): 429–31.</w:t>
+      </w:r>
+      <w:r>
+        <w:t xml:space="preserve"> </w:t>
+      </w:r>
+      <w:hyperlink r:id="rId103">
+        <w:r>
+          <w:rPr>
+            <w:rStyle w:val="Hyperlink"/>
+          </w:rPr>
+          <w:t xml:space="preserve">https://doi.org/10.1038/520429a</w:t>
+        </w:r>
+      </w:hyperlink>
+      <w:r>
+        <w:t xml:space="preserve">.</w:t>
+      </w:r>
+    </w:p>
+    <w:bookmarkEnd w:id="104"/>
+    <w:bookmarkStart w:id="105" w:name="ref-hirsch2005"/>
     <w:p>
       <w:pPr>
         <w:pStyle w:val="Bibliography"/>
@@ -16942,8 +17502,8 @@
         <w:t xml:space="preserve">102 (46): 16569–72.</w:t>
       </w:r>
     </w:p>
-    <w:bookmarkEnd w:id="95"/>
-    <w:bookmarkStart w:id="96" w:name="ref-hubert1985"/>
+    <w:bookmarkEnd w:id="105"/>
+    <w:bookmarkStart w:id="106" w:name="ref-hubert1985"/>
     <w:p>
       <w:pPr>
         <w:pStyle w:val="Bibliography"/>
@@ -16977,8 +17537,8 @@
         <w:t xml:space="preserve">2 (1): 193–218.</w:t>
       </w:r>
     </w:p>
-    <w:bookmarkEnd w:id="96"/>
-    <w:bookmarkStart w:id="98" w:name="ref-koperwas2015omega"/>
+    <w:bookmarkEnd w:id="106"/>
+    <w:bookmarkStart w:id="108" w:name="ref-koperwas2015omega"/>
     <w:p>
       <w:pPr>
         <w:pStyle w:val="Bibliography"/>
@@ -17023,7 +17583,7 @@
       <w:r>
         <w:t xml:space="preserve"> </w:t>
       </w:r>
-      <w:hyperlink r:id="rId97">
+      <w:hyperlink r:id="rId107">
         <w:r>
           <w:rPr>
             <w:rStyle w:val="Hyperlink"/>
@@ -17035,8 +17595,40 @@
         <w:t xml:space="preserve">.</w:t>
       </w:r>
     </w:p>
-    <w:bookmarkEnd w:id="98"/>
-    <w:bookmarkStart w:id="99" w:name="ref-lundberg2017"/>
+    <w:bookmarkEnd w:id="108"/>
+    <w:bookmarkStart w:id="109" w:name="ref-Kulczycki2019"/>
+    <w:p>
+      <w:pPr>
+        <w:pStyle w:val="Bibliography"/>
+      </w:pPr>
+      <w:r>
+        <w:t xml:space="preserve">Kulczycki, Emanuel. 2019.</w:t>
+      </w:r>
+      <w:r>
+        <w:t xml:space="preserve"> </w:t>
+      </w:r>
+      <w:r>
+        <w:t xml:space="preserve">„Tajemnice bibliometrii”</w:t>
+      </w:r>
+      <w:r>
+        <w:t xml:space="preserve">.</w:t>
+      </w:r>
+      <w:r>
+        <w:t xml:space="preserve"> </w:t>
+      </w:r>
+      <w:r>
+        <w:rPr>
+          <w:i/>
+          <w:iCs/>
+        </w:rPr>
+        <w:t xml:space="preserve">Forum Akademickie</w:t>
+      </w:r>
+      <w:r>
+        <w:t xml:space="preserve">, nr 6.</w:t>
+      </w:r>
+    </w:p>
+    <w:bookmarkEnd w:id="109"/>
+    <w:bookmarkStart w:id="110" w:name="ref-lundberg2017"/>
     <w:p>
       <w:pPr>
         <w:pStyle w:val="Bibliography"/>
@@ -17070,8 +17662,8 @@
         <w:t xml:space="preserve">30: 4765–74.</w:t>
       </w:r>
     </w:p>
-    <w:bookmarkEnd w:id="99"/>
-    <w:bookmarkStart w:id="100" w:name="ref-rozp_ewaluacja2022"/>
+    <w:bookmarkEnd w:id="110"/>
+    <w:bookmarkStart w:id="111" w:name="ref-rozp_ewaluacja2022"/>
     <w:p>
       <w:pPr>
         <w:pStyle w:val="Bibliography"/>
@@ -17093,8 +17685,8 @@
         <w:t xml:space="preserve">. Dz.U. 2022 poz. 661.</w:t>
       </w:r>
     </w:p>
-    <w:bookmarkEnd w:id="100"/>
-    <w:bookmarkStart w:id="101" w:name="ref-rozp_dyscypliny2025"/>
+    <w:bookmarkEnd w:id="111"/>
+    <w:bookmarkStart w:id="112" w:name="ref-rozp_dyscypliny2025"/>
     <w:p>
       <w:pPr>
         <w:pStyle w:val="Bibliography"/>
@@ -17116,8 +17708,8 @@
         <w:t xml:space="preserve">. Dz.U. 2025 poz. 211.</w:t>
       </w:r>
     </w:p>
-    <w:bookmarkEnd w:id="101"/>
-    <w:bookmarkStart w:id="102" w:name="ref-rozp_ewaluacja_nowela2025"/>
+    <w:bookmarkEnd w:id="112"/>
+    <w:bookmarkStart w:id="113" w:name="ref-rozp_ewaluacja_nowela2025"/>
     <w:p>
       <w:pPr>
         <w:pStyle w:val="Bibliography"/>
@@ -17139,8 +17731,8 @@
         <w:t xml:space="preserve">. Dz.U. 2025 poz. 1053.</w:t>
       </w:r>
     </w:p>
-    <w:bookmarkEnd w:id="102"/>
-    <w:bookmarkStart w:id="103" w:name="ref-moed2010snip"/>
+    <w:bookmarkEnd w:id="113"/>
+    <w:bookmarkStart w:id="114" w:name="ref-moed2010snip"/>
     <w:p>
       <w:pPr>
         <w:pStyle w:val="Bibliography"/>
@@ -17174,20 +17766,20 @@
         <w:t xml:space="preserve">4 (3): 265–77.</w:t>
       </w:r>
     </w:p>
-    <w:bookmarkEnd w:id="103"/>
-    <w:bookmarkStart w:id="104" w:name="ref-newman2006"/>
+    <w:bookmarkEnd w:id="114"/>
+    <w:bookmarkStart w:id="116" w:name="Xf57435758c1415795137dce9045dde0a68674c8"/>
     <w:p>
       <w:pPr>
         <w:pStyle w:val="Bibliography"/>
       </w:pPr>
       <w:r>
-        <w:t xml:space="preserve">Newman, Mark E. J. 2006.</w:t>
-      </w:r>
-      <w:r>
-        <w:t xml:space="preserve"> </w:t>
-      </w:r>
-      <w:r>
-        <w:t xml:space="preserve">„Modularity and community structure in networks”</w:t>
+        <w:t xml:space="preserve">Newman, Mark E. J. 2004.</w:t>
+      </w:r>
+      <w:r>
+        <w:t xml:space="preserve"> </w:t>
+      </w:r>
+      <w:r>
+        <w:t xml:space="preserve">„Coauthorship networks and patterns of scientific collaboration”</w:t>
       </w:r>
       <w:r>
         <w:t xml:space="preserve">.</w:t>
@@ -17206,11 +17798,95 @@
         <w:t xml:space="preserve"> </w:t>
       </w:r>
       <w:r>
+        <w:t xml:space="preserve">101 (suppl 1): 5200–5205.</w:t>
+      </w:r>
+      <w:r>
+        <w:t xml:space="preserve"> </w:t>
+      </w:r>
+      <w:hyperlink r:id="rId115">
+        <w:r>
+          <w:rPr>
+            <w:rStyle w:val="Hyperlink"/>
+          </w:rPr>
+          <w:t xml:space="preserve">https://doi.org/10.1073/pnas.0307545100</w:t>
+        </w:r>
+      </w:hyperlink>
+      <w:r>
+        <w:t xml:space="preserve">.</w:t>
+      </w:r>
+    </w:p>
+    <w:bookmarkEnd w:id="116"/>
+    <w:bookmarkStart w:id="117" w:name="ref-newman2006"/>
+    <w:p>
+      <w:pPr>
+        <w:pStyle w:val="Bibliography"/>
+      </w:pPr>
+      <w:r>
+        <w:t xml:space="preserve">Newman, Mark E. J. 2006.</w:t>
+      </w:r>
+      <w:r>
+        <w:t xml:space="preserve"> </w:t>
+      </w:r>
+      <w:r>
+        <w:t xml:space="preserve">„Modularity and community structure in networks”</w:t>
+      </w:r>
+      <w:r>
+        <w:t xml:space="preserve">.</w:t>
+      </w:r>
+      <w:r>
+        <w:t xml:space="preserve"> </w:t>
+      </w:r>
+      <w:r>
+        <w:rPr>
+          <w:i/>
+          <w:iCs/>
+        </w:rPr>
+        <w:t xml:space="preserve">Proceedings of the National Academy of Sciences</w:t>
+      </w:r>
+      <w:r>
+        <w:t xml:space="preserve"> </w:t>
+      </w:r>
+      <w:r>
         <w:t xml:space="preserve">103 (23): 8577–82.</w:t>
       </w:r>
     </w:p>
-    <w:bookmarkEnd w:id="104"/>
-    <w:bookmarkStart w:id="105" w:name="ref-openalex2022"/>
+    <w:bookmarkEnd w:id="117"/>
+    <w:bookmarkStart w:id="118" w:name="ref-Opalinski2017"/>
+    <w:p>
+      <w:pPr>
+        <w:pStyle w:val="Bibliography"/>
+      </w:pPr>
+      <w:r>
+        <w:t xml:space="preserve">Opaliński, Łukasz. 2017.</w:t>
+      </w:r>
+      <w:r>
+        <w:t xml:space="preserve"> </w:t>
+      </w:r>
+      <w:r>
+        <w:t xml:space="preserve">„Bibliometryczna metodologia prognozowania i oceny rozwoju dyscyplin naukowych. Analiza piśmiennictwa. Część 1”</w:t>
+      </w:r>
+      <w:r>
+        <w:t xml:space="preserve">.</w:t>
+      </w:r>
+      <w:r>
+        <w:t xml:space="preserve"> </w:t>
+      </w:r>
+      <w:r>
+        <w:rPr>
+          <w:i/>
+          <w:iCs/>
+        </w:rPr>
+        <w:t xml:space="preserve">Zagadnienia Informacji Naukowej</w:t>
+      </w:r>
+      <w:r>
+        <w:t xml:space="preserve"> </w:t>
+      </w:r>
+      <w:r>
+        <w:t xml:space="preserve">55 (1): 34–65.</w:t>
+      </w:r>
+    </w:p>
+    <w:bookmarkEnd w:id="118"/>
+    <w:bookmarkStart w:id="119" w:name="ref-openalex2022"/>
     <w:p>
       <w:pPr>
         <w:pStyle w:val="Bibliography"/>
@@ -17241,8 +17917,81 @@
         <w:t xml:space="preserve">.</w:t>
       </w:r>
     </w:p>
-    <w:bookmarkEnd w:id="105"/>
-    <w:bookmarkStart w:id="106" w:name="ref-waltman2016review"/>
+    <w:bookmarkEnd w:id="119"/>
+    <w:bookmarkStart w:id="121" w:name="Xfa806a68882317565cd91e2502e10e0c6dc8daa"/>
+    <w:p>
+      <w:pPr>
+        <w:pStyle w:val="Bibliography"/>
+      </w:pPr>
+      <w:r>
+        <w:t xml:space="preserve">Rybiński, Henryk, Weronika Kubrak, Łukasz Skonieczny, Jakub Koperwas, i Wacław Struk. 2018.</w:t>
+      </w:r>
+      <w:r>
+        <w:t xml:space="preserve"> </w:t>
+      </w:r>
+      <w:r>
+        <w:t xml:space="preserve">„Omega-</w:t>
+      </w:r>
+      <w:r>
+        <w:t xml:space="preserve">PSIR</w:t>
+      </w:r>
+      <w:r>
+        <w:t xml:space="preserve">:</w:t>
+      </w:r>
+      <w:r>
+        <w:t xml:space="preserve"> </w:t>
+      </w:r>
+      <w:r>
+        <w:t xml:space="preserve">Institutional CRIS</w:t>
+      </w:r>
+      <w:r>
+        <w:t xml:space="preserve"> </w:t>
+      </w:r>
+      <w:r>
+        <w:t xml:space="preserve">at</w:t>
+      </w:r>
+      <w:r>
+        <w:t xml:space="preserve"> </w:t>
+      </w:r>
+      <w:r>
+        <w:t xml:space="preserve">Polish Universities</w:t>
+      </w:r>
+      <w:r>
+        <w:t xml:space="preserve">”</w:t>
+      </w:r>
+      <w:r>
+        <w:t xml:space="preserve">.</w:t>
+      </w:r>
+      <w:r>
+        <w:t xml:space="preserve"> </w:t>
+      </w:r>
+      <w:r>
+        <w:rPr>
+          <w:i/>
+          <w:iCs/>
+        </w:rPr>
+        <w:t xml:space="preserve">ITlib. Informačné technológie a knižnice</w:t>
+      </w:r>
+      <w:r>
+        <w:t xml:space="preserve">, advance online publication.</w:t>
+      </w:r>
+      <w:r>
+        <w:t xml:space="preserve"> </w:t>
+      </w:r>
+      <w:hyperlink r:id="rId120">
+        <w:r>
+          <w:rPr>
+            <w:rStyle w:val="Hyperlink"/>
+          </w:rPr>
+          <w:t xml:space="preserve">https://doi.org/10.25610/itlib-2018-0005</w:t>
+        </w:r>
+      </w:hyperlink>
+      <w:r>
+        <w:t xml:space="preserve">.</w:t>
+      </w:r>
+    </w:p>
+    <w:bookmarkEnd w:id="121"/>
+    <w:bookmarkStart w:id="122" w:name="ref-waltman2016review"/>
     <w:p>
       <w:pPr>
         <w:pStyle w:val="Bibliography"/>
@@ -17276,8 +18025,8 @@
         <w:t xml:space="preserve">10 (2): 365–91.</w:t>
       </w:r>
     </w:p>
-    <w:bookmarkEnd w:id="106"/>
-    <w:bookmarkStart w:id="108" w:name="ref-omegapsir2024"/>
+    <w:bookmarkEnd w:id="122"/>
+    <w:bookmarkStart w:id="124" w:name="ref-omegapsir2024"/>
     <w:p>
       <w:pPr>
         <w:pStyle w:val="Bibliography"/>
@@ -17301,7 +18050,7 @@
       <w:r>
         <w:t xml:space="preserve"> </w:t>
       </w:r>
-      <w:hyperlink r:id="rId107">
+      <w:hyperlink r:id="rId123">
         <w:r>
           <w:rPr>
             <w:rStyle w:val="Hyperlink"/>
@@ -17313,8 +18062,8 @@
         <w:t xml:space="preserve">.</w:t>
       </w:r>
     </w:p>
-    <w:bookmarkEnd w:id="108"/>
-    <w:bookmarkStart w:id="109" w:name="ref-winkler1990"/>
+    <w:bookmarkEnd w:id="124"/>
+    <w:bookmarkStart w:id="125" w:name="ref-winkler1990"/>
     <w:p>
       <w:pPr>
         <w:pStyle w:val="Bibliography"/>
@@ -17357,8 +18106,8 @@
         <w:t xml:space="preserve">, 354–59.</w:t>
       </w:r>
     </w:p>
-    <w:bookmarkEnd w:id="109"/>
-    <w:bookmarkStart w:id="110" w:name="ref-youden1950"/>
+    <w:bookmarkEnd w:id="125"/>
+    <w:bookmarkStart w:id="126" w:name="ref-youden1950"/>
     <w:p>
       <w:pPr>
         <w:pStyle w:val="Bibliography"/>
@@ -17392,9 +18141,9 @@
         <w:t xml:space="preserve">3 (1): 32–35.</w:t>
       </w:r>
     </w:p>
-    <w:bookmarkEnd w:id="110"/>
-    <w:bookmarkEnd w:id="111"/>
-    <w:bookmarkEnd w:id="112"/>
+    <w:bookmarkEnd w:id="126"/>
+    <w:bookmarkEnd w:id="127"/>
+    <w:bookmarkEnd w:id="128"/>
     <w:sectPr>
       <w:footnotePr>
         <w:numRestart w:val="eachSect"/>

</xml_diff>

<commit_message>
Finalny szlif pod oddanie: Dostepnosc kodu i danych, fix parsera MEiN, czyszczenie renv
- praca.qmd: nowa sekcja "Dostepnosc kodu i danych" (link repo + nota RODO),
  doprecyzowanie definicji FWCI, korekta dat wdrozenia Omega-PSIR (2011-2013),
  pagebreak przed bibliografia
- base.py: fix parsowania MEiN (kotwica na pierwszej cyfrze \d[\d ]*, obsluga
  tekstu wiodacego "Liczba punktow 924")
- renv.lock: usuniecie 11 nieuzywanych pakietow (stos seriation/TSP po skasowanej
  heatmapie + dunn.test zastapiony rstatix); potwierdzone renv::snapshot (up to date)
- README: dopisek 491 zeskrapowanych vs 462 proba analityczna
- przegenerowane praca.pdf + praca.docx

Walidacja liczb: 9/9 OK. Bibliografia: 28 wpisow, 100% cytowanych.

Co-Authored-By: Claude Opus 4.8 (1M context) <noreply@anthropic.com>
</commit_message>
<xml_diff>
--- a/Praca/praca.docx
+++ b/Praca/praca.docx
@@ -39,7 +39,7 @@
         <w:br w:type="page"/>
       </w:r>
     </w:p>
-    <w:bookmarkStart w:id="9" w:name="streszczenie"/>
+    <w:bookmarkStart w:id="20" w:name="streszczenie"/>
     <w:p>
       <w:pPr>
         <w:pStyle w:val="Heading1"/>
@@ -121,8 +121,8 @@
         <w:br w:type="page"/>
       </w:r>
     </w:p>
-    <w:bookmarkEnd w:id="9"/>
-    <w:bookmarkStart w:id="13" w:name="wprowadzenie"/>
+    <w:bookmarkEnd w:id="20"/>
+    <w:bookmarkStart w:id="24" w:name="wprowadzenie"/>
     <w:p>
       <w:pPr>
         <w:pStyle w:val="Heading1"/>
@@ -131,7 +131,7 @@
         <w:t xml:space="preserve">Wprowadzenie</w:t>
       </w:r>
     </w:p>
-    <w:bookmarkStart w:id="10" w:name="Xbef39e353cf405a5f8b815f593e50b94b49cae3"/>
+    <w:bookmarkStart w:id="21" w:name="Xbef39e353cf405a5f8b815f593e50b94b49cae3"/>
     <w:p>
       <w:pPr>
         <w:pStyle w:val="Heading2"/>
@@ -349,7 +349,7 @@
           <w:rPr>
             <w:rStyle w:val="Hyperlink"/>
           </w:rPr>
-          <w:t xml:space="preserve">Grygiel et al. 2009</w:t>
+          <w:t xml:space="preserve">Grygiel, Rębisz, i Humenny 2009</w:t>
         </w:r>
       </w:hyperlink>
       <w:r>
@@ -384,8 +384,8 @@
         <w:br w:type="page"/>
       </w:r>
     </w:p>
-    <w:bookmarkEnd w:id="10"/>
-    <w:bookmarkStart w:id="11" w:name="cel-pracy"/>
+    <w:bookmarkEnd w:id="21"/>
+    <w:bookmarkStart w:id="22" w:name="cel-pracy"/>
     <w:p>
       <w:pPr>
         <w:pStyle w:val="Heading2"/>
@@ -417,7 +417,7 @@
         <w:t xml:space="preserve">Current Research Information System</w:t>
       </w:r>
       <w:r>
-        <w:t xml:space="preserve">), opracowanym na Politechnice Warszawskiej w ramach prac nad Bazą Wiedzy PW. System powstał w zespole Politechniki Warszawskiej w ramach projektu SYNAT (finansowanego przez NCBiR), którego celem było zbudowanie otwartej infrastruktury repozytoryjno-informacyjnej dla polskiej nauki; pierwsze wdrożenie produkcyjne uruchomiono na PW w 2012 roku</w:t>
+        <w:t xml:space="preserve">), opracowanym na Politechnice Warszawskiej w ramach prac nad Bazą Wiedzy PW. System powstał w zespole Politechniki Warszawskiej w ramach projektu SYNAT (finansowanego przez NCBiR), którego celem było zbudowanie otwartej infrastruktury repozytoryjno-informacyjnej dla polskiej nauki; pierwsze wdrożenia produkcyjne na Politechnice Warszawskiej uruchomiono w latach 2011–2013 (od 2013 r. system objął całą uczelnię)</w:t>
       </w:r>
       <w:r>
         <w:t xml:space="preserve"> </w:t>
@@ -430,7 +430,7 @@
           <w:rPr>
             <w:rStyle w:val="Hyperlink"/>
           </w:rPr>
-          <w:t xml:space="preserve">Koperwas et al. 2015</w:t>
+          <w:t xml:space="preserve">Koperwas i in. 2015</w:t>
         </w:r>
       </w:hyperlink>
       <w:r>
@@ -450,7 +450,7 @@
           <w:rPr>
             <w:rStyle w:val="Hyperlink"/>
           </w:rPr>
-          <w:t xml:space="preserve">Rybiński et al. 2018</w:t>
+          <w:t xml:space="preserve">Rybiński i in. 2018</w:t>
         </w:r>
       </w:hyperlink>
       <w:r>
@@ -549,8 +549,8 @@
         <w:br w:type="page"/>
       </w:r>
     </w:p>
-    <w:bookmarkEnd w:id="11"/>
-    <w:bookmarkStart w:id="12" w:name="pytania-badawcze"/>
+    <w:bookmarkEnd w:id="22"/>
+    <w:bookmarkStart w:id="23" w:name="pytania-badawcze"/>
     <w:p>
       <w:pPr>
         <w:pStyle w:val="Heading2"/>
@@ -631,9 +631,9 @@
         <w:t xml:space="preserve">Czy sieć współautorstwa ma charakter głównie wewnątrzuczelniany, czy widoczne są także wspólnoty międzyuczelniane?</w:t>
       </w:r>
     </w:p>
-    <w:bookmarkEnd w:id="12"/>
-    <w:bookmarkEnd w:id="13"/>
-    <w:bookmarkStart w:id="22" w:name="materiał-i-metodyka"/>
+    <w:bookmarkEnd w:id="23"/>
+    <w:bookmarkEnd w:id="24"/>
+    <w:bookmarkStart w:id="35" w:name="materiał-i-metodyka"/>
     <w:p>
       <w:pPr>
         <w:pStyle w:val="Heading1"/>
@@ -642,7 +642,7 @@
         <w:t xml:space="preserve">Materiał i metodyka</w:t>
       </w:r>
     </w:p>
-    <w:bookmarkStart w:id="14" w:name="źródła-danych"/>
+    <w:bookmarkStart w:id="25" w:name="źródła-danych"/>
     <w:p>
       <w:pPr>
         <w:pStyle w:val="Heading2"/>
@@ -771,14 +771,14 @@
           <w:rPr>
             <w:rStyle w:val="Hyperlink"/>
           </w:rPr>
-          <w:t xml:space="preserve">Priem et al. 2022</w:t>
+          <w:t xml:space="preserve">Priem, Piwowar, i Orr 2022</w:t>
         </w:r>
       </w:hyperlink>
       <w:r>
         <w:t xml:space="preserve">)</w:t>
       </w:r>
       <w:r>
-        <w:t xml:space="preserve">, źródło uzupełniające, dostarcza danych, których nie ma w Omega-PSIR: FWCI (Field-Weighted Citation Impact), czyli liczbę cytowań pracy porównaną ze światową średnią w jej dziedzinie (wartość 1,0 oznacza poziom średniej światowej, a wartości powyżej 1,0 wynik ją przewyższający), której nie da się policzyć z danych jednej uczelni</w:t>
+        <w:t xml:space="preserve">, źródło uzupełniające, dostarcza danych, których nie ma w Omega-PSIR: FWCI (Field-Weighted Citation Impact), czyli znormalizowany dziedzinowo wskaźnik cytowań odnoszący liczbę cytowań pracy do światowej średniej w jej dziedzinie (wartość 1,0 oznacza poziom średniej światowej, a wartości powyżej 1,0 wynik ją przewyższający), którego nie da się policzyć z danych jednej uczelni</w:t>
       </w:r>
       <w:r>
         <w:t xml:space="preserve"> </w:t>
@@ -827,19 +827,7 @@
           <w:rPr>
             <w:rStyle w:val="Hyperlink"/>
           </w:rPr>
-          <w:t xml:space="preserve">Hicks et al.</w:t>
-        </w:r>
-        <w:r>
-          <w:rPr>
-            <w:rStyle w:val="Hyperlink"/>
-          </w:rPr>
-          <w:t xml:space="preserve"> </w:t>
-        </w:r>
-        <w:r>
-          <w:rPr>
-            <w:rStyle w:val="Hyperlink"/>
-          </w:rPr>
-          <w:t xml:space="preserve">2015</w:t>
+          <w:t xml:space="preserve">Hicks i in. 2015</w:t>
         </w:r>
       </w:hyperlink>
       <w:r>
@@ -877,8 +865,8 @@
         <w:t xml:space="preserve">Wskaźniki wykorzystane w tej pracy wybrano dlatego, że są dostępne w porównywalnej formie dla badanych uczelni i pozwalają opisać profil bibliometryczny naukowca.</w:t>
       </w:r>
     </w:p>
-    <w:bookmarkEnd w:id="14"/>
-    <w:bookmarkStart w:id="19" w:name="procedura-pozyskania-danych"/>
+    <w:bookmarkEnd w:id="25"/>
+    <w:bookmarkStart w:id="30" w:name="procedura-pozyskania-danych"/>
     <w:p>
       <w:pPr>
         <w:pStyle w:val="Heading2"/>
@@ -964,7 +952,7 @@
           <w:rPr>
             <w:rStyle w:val="Hyperlink"/>
           </w:rPr>
-          <w:t xml:space="preserve">Aria et al. 2024</w:t>
+          <w:t xml:space="preserve">Aria i in. 2024</w:t>
         </w:r>
       </w:hyperlink>
       <w:r>
@@ -994,17 +982,17 @@
     <w:tbl>
       <w:tblPr>
         <w:tblStyle w:val="Table"/>
-        <w:tblW w:type="dxa" w:w="9638"/>
-        <w:tblLayout w:type="autofit"/>
+        <w:tblW w:type="pct" w:w="5000"/>
+        <w:tblLayout w:type="fixed"/>
         <w:tblLook w:firstRow="0" w:lastRow="0" w:firstColumn="0" w:lastColumn="0" w:noHBand="0" w:noVBand="0" w:val="0000"/>
       </w:tblPr>
       <w:tblGrid>
-        <w:gridCol w:w="9638"/>
+        <w:gridCol w:w="7920"/>
       </w:tblGrid>
       <w:tr>
         <w:tc>
           <w:tcPr/>
-          <w:bookmarkStart w:id="18" w:name="fig-pipeline"/>
+          <w:bookmarkStart w:id="29" w:name="fig-pipeline"/>
           <w:p>
             <w:pPr>
               <w:pStyle w:val="Compact"/>
@@ -1015,18 +1003,18 @@
                 <wp:inline>
                   <wp:extent cx="4480560" cy="7101092"/>
                   <wp:effectExtent b="0" l="0" r="0" t="0"/>
-                  <wp:docPr descr="" title="" id="16" name="Picture"/>
+                  <wp:docPr descr="" title="" id="27" name="Picture"/>
                   <a:graphic>
                     <a:graphicData uri="http://schemas.openxmlformats.org/drawingml/2006/picture">
                       <pic:pic>
                         <pic:nvPicPr>
-                          <pic:cNvPr descr="../Wykresy/praca/fig_00_pipeline.png" id="17" name="Picture"/>
+                          <pic:cNvPr descr="../Wykresy/praca/fig_00_pipeline.png" id="28" name="Picture"/>
                           <pic:cNvPicPr>
                             <a:picLocks noChangeArrowheads="1" noChangeAspect="1"/>
                           </pic:cNvPicPr>
                         </pic:nvPicPr>
                         <pic:blipFill>
-                          <a:blip r:embed="rId15"/>
+                          <a:blip r:embed="rId26"/>
                           <a:stretch>
                             <a:fillRect/>
                           </a:stretch>
@@ -1058,7 +1046,7 @@
               <w:jc w:val="center"/>
             </w:pPr>
             <w:pPr>
-              <w:jc w:val="left"/>
+              <w:jc w:val="start"/>
               <w:spacing w:before="200"/>
               <w:pStyle w:val="ImageCaption"/>
             </w:pPr>
@@ -1066,12 +1054,12 @@
               <w:t xml:space="preserve">Rysunek 1: Schemat przepływu danych: od czterech instancji Omega-PSIR przez scraping (Python) i przetwarzanie (R) z uzupełnieniem OpenAlex do zbioru analitycznego i warstw modelowania.</w:t>
             </w:r>
           </w:p>
-          <w:bookmarkEnd w:id="18"/>
+          <w:bookmarkEnd w:id="29"/>
         </w:tc>
       </w:tr>
     </w:tbl>
-    <w:bookmarkEnd w:id="19"/>
-    <w:bookmarkStart w:id="20" w:name="metody-analityczne"/>
+    <w:bookmarkEnd w:id="30"/>
+    <w:bookmarkStart w:id="31" w:name="metody-analityczne"/>
     <w:p>
       <w:pPr>
         <w:pStyle w:val="Heading2"/>
@@ -1381,7 +1369,7 @@
           <w:rPr>
             <w:rStyle w:val="Hyperlink"/>
           </w:rPr>
-          <w:t xml:space="preserve">Blondel et al. 2008</w:t>
+          <w:t xml:space="preserve">Blondel i in. 2008</w:t>
         </w:r>
       </w:hyperlink>
       <w:r>
@@ -1414,8 +1402,8 @@
         <w:t xml:space="preserve">wykorzystano do oceny, jak wyraźnie sieć dzieli się na wspólnoty. Dzięki temu można było sprawdzić, czy współpraca przebiega głównie w obrębie jednej uczelni, czy także między uczelniami.</w:t>
       </w:r>
     </w:p>
-    <w:bookmarkEnd w:id="20"/>
-    <w:bookmarkStart w:id="21" w:name="narzędzia-i-środowisko-obliczeniowe"/>
+    <w:bookmarkEnd w:id="31"/>
+    <w:bookmarkStart w:id="32" w:name="narzędzia-i-środowisko-obliczeniowe"/>
     <w:p>
       <w:pPr>
         <w:pStyle w:val="Heading2"/>
@@ -1440,18 +1428,58 @@
         <w:t xml:space="preserve">W pracy pomocniczo wykorzystano duże modele językowe (LLM): Claude (Anthropic), Codex (OpenAI) oraz Gemini (Google). Posłużyły one jako narzędzia wsparcia technicznego i redakcyjnego: do przeglądu i porządkowania kodu, wykrywania niespójności w tekście i danych, redakcyjnego dopracowania języka oraz krytycznej rewizji fragmentów pracy. Modele nie były źródłem danych empirycznych ani nie prowadziły samodzielnego wnioskowania statystycznego; wszystkie obliczenia, decyzje metodyczne i interpretacje wyników pozostają autorskie i wykonano je opisanymi skryptami Python i R. Informacja odnosi się do stanu z okresu przygotowania pracy (2026); wykorzystano model Claude Opus 4.8 (środowisko Claude Code), Codex oparty na modelu GPT-5.5 (OpenAI) oraz model Gemini 3.5 Flash (Gemini CLI, Google).</w:t>
       </w:r>
     </w:p>
-    <w:bookmarkEnd w:id="21"/>
-    <w:bookmarkEnd w:id="22"/>
-    <w:bookmarkStart w:id="78" w:name="wyniki"/>
+    <w:bookmarkEnd w:id="32"/>
+    <w:bookmarkStart w:id="34" w:name="dostępność-kodu-i-danych"/>
     <w:p>
       <w:pPr>
+        <w:pStyle w:val="Heading2"/>
+      </w:pPr>
+      <w:r>
+        <w:t xml:space="preserve">Dostępność kodu i danych</w:t>
+      </w:r>
+    </w:p>
+    <w:p>
+      <w:pPr>
+        <w:pStyle w:val="FirstParagraph"/>
+      </w:pPr>
+      <w:r>
+        <w:t xml:space="preserve">Pełny kod źródłowy, dane oraz wyniki pośrednie udostępniono w publicznym repozytorium GitHub:</w:t>
+      </w:r>
+      <w:r>
+        <w:t xml:space="preserve"> </w:t>
+      </w:r>
+      <w:hyperlink r:id="rId33">
+        <w:r>
+          <w:rPr>
+            <w:rStyle w:val="Hyperlink"/>
+          </w:rPr>
+          <w:t xml:space="preserve">https://github.com/Kulcz/PracaDyplomowa_DS_UEWr</w:t>
+        </w:r>
+      </w:hyperlink>
+      <w:r>
+        <w:t xml:space="preserve">. Repozytorium zawiera scrapery w języku Python (pobieranie danych z czterech instancji systemu Omega-PSIR oraz z API OpenAlex), kompletny pipeline analityczny w języku R (czyszczenie danych, analizy statystyczne, klastrowanie, modele predykcyjne, analizę sieci współautorstwa), zbiory danych analitycznych w formacie CSV, wyniki pośrednie oraz skrypty generujące wszystkie tabele i ryciny zamieszczone w pracy. Dołączony plik blokady pakietów (renv) rejestruje dokładne wersje bibliotek języka R, co umożliwia odtworzenie środowiska obliczeniowego i powtórzenie analiz.</w:t>
+      </w:r>
+    </w:p>
+    <w:p>
+      <w:pPr>
+        <w:pStyle w:val="BodyText"/>
+      </w:pPr>
+      <w:r>
+        <w:t xml:space="preserve">Wykorzystane dane pochodzą z publicznie dostępnych uczelnianych Baz Wiedzy (systemów CRIS Omega-PSIR) oraz z otwartej bazy OpenAlex i dotyczą wyłącznie działalności naukowej pracowników (dorobek publikacyjny, afiliacje, identyfikatory ORCID), czyli danych zawodowych jawnie udostępnionych przez same uczelnie. Nie obejmują one danych szczególnych kategorii w rozumieniu art. 9 RODO. Przetwarzania dokonano wyłącznie w celach naukowo-badawczych i w formie zagregowanej, w oparciu o prawnie uzasadniony interes administratora (art. 6 ust. 1 lit. f RODO) oraz z uwzględnieniem zasad przetwarzania danych do celów badań naukowych (art. 89 RODO); analiza nie służy ocenie ani profilowaniu poszczególnych osób.</w:t>
+      </w:r>
+    </w:p>
+    <w:bookmarkEnd w:id="34"/>
+    <w:bookmarkEnd w:id="35"/>
+    <w:bookmarkStart w:id="91" w:name="wyniki"/>
+    <w:p>
+      <w:pPr>
         <w:pStyle w:val="Heading1"/>
       </w:pPr>
       <w:r>
         <w:t xml:space="preserve">Wyniki</w:t>
       </w:r>
     </w:p>
-    <w:bookmarkStart w:id="24" w:name="charakterystyka-próby"/>
+    <w:bookmarkStart w:id="37" w:name="charakterystyka-próby"/>
     <w:p>
       <w:pPr>
         <w:pStyle w:val="Heading2"/>
@@ -1539,23 +1567,23 @@
     <w:tbl>
       <w:tblPr>
         <w:tblStyle w:val="Table"/>
-        <w:tblW w:type="dxa" w:w="9638"/>
-        <w:tblLayout w:type="autofit"/>
+        <w:tblW w:type="pct" w:w="5000"/>
+        <w:tblLayout w:type="fixed"/>
         <w:tblLook w:firstRow="0" w:lastRow="0" w:firstColumn="0" w:lastColumn="0" w:noHBand="0" w:noVBand="0" w:val="0000"/>
       </w:tblPr>
       <w:tblGrid>
-        <w:gridCol w:w="9638"/>
+        <w:gridCol w:w="7920"/>
       </w:tblGrid>
       <w:tr>
         <w:tc>
           <w:tcPr/>
-          <w:bookmarkStart w:id="23" w:name="tbl-proba"/>
+          <w:bookmarkStart w:id="36" w:name="tbl-proba"/>
           <w:p>
             <w:pPr>
               <w:jc w:val="center"/>
             </w:pPr>
             <w:pPr>
-              <w:jc w:val="left"/>
+              <w:jc w:val="start"/>
               <w:spacing w:before="200"/>
               <w:pStyle w:val="ImageCaption"/>
             </w:pPr>
@@ -1565,22 +1593,22 @@
           </w:p>
           <w:tbl xmlns:w="http://schemas.openxmlformats.org/wordprocessingml/2006/main" xmlns:r="http://schemas.openxmlformats.org/officeDocument/2006/relationships" xmlns:w14="http://schemas.microsoft.com/office/word/2010/wordml" xmlns:wp="http://schemas.openxmlformats.org/drawingml/2006/wordprocessingDrawing" xmlns:a="http://schemas.openxmlformats.org/drawingml/2006/main" xmlns:pic="http://schemas.openxmlformats.org/drawingml/2006/picture">
             <w:tblPr>
-              <w:tblLayout w:type="autofit"/>
+              <w:tblLayout w:type="fixed"/>
               <w:jc w:val="center"/>
               <w:tblLook w:firstRow="1" w:lastRow="0" w:firstColumn="0" w:lastColumn="0" w:noHBand="0" w:noVBand="1"/>
             </w:tblPr>
             <w:tblGrid>
-              <w:gridCol w:w="966"/>
-              <w:gridCol w:w="654"/>
-              <w:gridCol w:w="514"/>
-              <w:gridCol w:w="903"/>
-              <w:gridCol w:w="903"/>
-              <w:gridCol w:w="903"/>
-              <w:gridCol w:w="903"/>
-              <w:gridCol w:w="1183"/>
-              <w:gridCol w:w="997"/>
-              <w:gridCol w:w="810"/>
-              <w:gridCol w:w="902"/>
+              <w:gridCol w:w="893"/>
+              <w:gridCol w:w="605"/>
+              <w:gridCol w:w="475"/>
+              <w:gridCol w:w="835"/>
+              <w:gridCol w:w="835"/>
+              <w:gridCol w:w="835"/>
+              <w:gridCol w:w="835"/>
+              <w:gridCol w:w="1094"/>
+              <w:gridCol w:w="922"/>
+              <w:gridCol w:w="749"/>
+              <w:gridCol w:w="835"/>
             </w:tblGrid>
             <w:tr>
               <w:trPr>
@@ -5298,7 +5326,7 @@
               </w:tc>
             </w:tr>
           </w:tbl>
-          <w:bookmarkEnd w:id="23"/>
+          <w:bookmarkEnd w:id="36"/>
         </w:tc>
       </w:tr>
     </w:tbl>
@@ -5324,8 +5352,8 @@
         <w:t xml:space="preserve">, a najmniejsza komórka liczy 13 osób, co umożliwia estymację członu interakcji.</w:t>
       </w:r>
     </w:p>
-    <w:bookmarkEnd w:id="24"/>
-    <w:bookmarkStart w:id="29" w:name="X02db023cedd07580e5dfe409dd487ced35067e3"/>
+    <w:bookmarkEnd w:id="37"/>
+    <w:bookmarkStart w:id="42" w:name="X02db023cedd07580e5dfe409dd487ced35067e3"/>
     <w:p>
       <w:pPr>
         <w:pStyle w:val="Heading2"/>
@@ -5404,17 +5432,17 @@
     <w:tbl>
       <w:tblPr>
         <w:tblStyle w:val="Table"/>
-        <w:tblW w:type="dxa" w:w="9638"/>
-        <w:tblLayout w:type="autofit"/>
+        <w:tblW w:type="pct" w:w="5000"/>
+        <w:tblLayout w:type="fixed"/>
         <w:tblLook w:firstRow="0" w:lastRow="0" w:firstColumn="0" w:lastColumn="0" w:noHBand="0" w:noVBand="0" w:val="0000"/>
       </w:tblPr>
       <w:tblGrid>
-        <w:gridCol w:w="9638"/>
+        <w:gridCol w:w="7920"/>
       </w:tblGrid>
       <w:tr>
         <w:tc>
           <w:tcPr/>
-          <w:bookmarkStart w:id="28" w:name="fig-korelacje"/>
+          <w:bookmarkStart w:id="41" w:name="fig-korelacje"/>
           <w:p>
             <w:pPr>
               <w:pStyle w:val="Compact"/>
@@ -5425,18 +5453,18 @@
                 <wp:inline>
                   <wp:extent cx="5334000" cy="4533900"/>
                   <wp:effectExtent b="0" l="0" r="0" t="0"/>
-                  <wp:docPr descr="" title="" id="26" name="Picture"/>
+                  <wp:docPr descr="" title="" id="39" name="Picture"/>
                   <a:graphic>
                     <a:graphicData uri="http://schemas.openxmlformats.org/drawingml/2006/picture">
                       <pic:pic>
                         <pic:nvPicPr>
-                          <pic:cNvPr descr="../Wykresy/praca/fig_01b_korelacje.png" id="27" name="Picture"/>
+                          <pic:cNvPr descr="../Wykresy/praca/fig_01b_korelacje.png" id="40" name="Picture"/>
                           <pic:cNvPicPr>
                             <a:picLocks noChangeArrowheads="1" noChangeAspect="1"/>
                           </pic:cNvPicPr>
                         </pic:nvPicPr>
                         <pic:blipFill>
-                          <a:blip r:embed="rId25"/>
+                          <a:blip r:embed="rId38"/>
                           <a:stretch>
                             <a:fillRect/>
                           </a:stretch>
@@ -5468,7 +5496,7 @@
               <w:jc w:val="center"/>
             </w:pPr>
             <w:pPr>
-              <w:jc w:val="left"/>
+              <w:jc w:val="start"/>
               <w:spacing w:before="200"/>
               <w:pStyle w:val="ImageCaption"/>
             </w:pPr>
@@ -5476,12 +5504,12 @@
               <w:t xml:space="preserve">Rysunek 2: Macierz korelacji Pearsona sześciu wskaźników bibliometrycznych. Wyraźny blok metryk skumulowanego impactu (h-index, sumaryczny IF, punktacja MEiN; r 0,82–0,95) kontrastuje z liczbą publikacji, powiązaną z nim tylko umiarkowanie (r 0,36–0,44), oraz z IF na publikację, tworzącym odrębną oś jakości, ujemnie skorelowaną z liczbą publikacji.</w:t>
             </w:r>
           </w:p>
-          <w:bookmarkEnd w:id="28"/>
+          <w:bookmarkEnd w:id="41"/>
         </w:tc>
       </w:tr>
     </w:tbl>
-    <w:bookmarkEnd w:id="29"/>
-    <w:bookmarkStart w:id="47" w:name="X149f1659b4627f11ad84fb72c3cc10571fd0864"/>
+    <w:bookmarkEnd w:id="42"/>
+    <w:bookmarkStart w:id="60" w:name="X149f1659b4627f11ad84fb72c3cc10571fd0864"/>
     <w:p>
       <w:pPr>
         <w:pStyle w:val="Heading2"/>
@@ -5523,17 +5551,17 @@
     <w:tbl>
       <w:tblPr>
         <w:tblStyle w:val="Table"/>
-        <w:tblW w:type="dxa" w:w="9638"/>
-        <w:tblLayout w:type="autofit"/>
+        <w:tblW w:type="pct" w:w="5000"/>
+        <w:tblLayout w:type="fixed"/>
         <w:tblLook w:firstRow="0" w:lastRow="0" w:firstColumn="0" w:lastColumn="0" w:noHBand="0" w:noVBand="0" w:val="0000"/>
       </w:tblPr>
       <w:tblGrid>
-        <w:gridCol w:w="9638"/>
+        <w:gridCol w:w="7920"/>
       </w:tblGrid>
       <w:tr>
         <w:tc>
           <w:tcPr/>
-          <w:bookmarkStart w:id="33" w:name="fig-rozklady"/>
+          <w:bookmarkStart w:id="46" w:name="fig-rozklady"/>
           <w:p>
             <w:pPr>
               <w:pStyle w:val="Compact"/>
@@ -5544,18 +5572,18 @@
                 <wp:inline>
                   <wp:extent cx="5334000" cy="3081866"/>
                   <wp:effectExtent b="0" l="0" r="0" t="0"/>
-                  <wp:docPr descr="" title="" id="31" name="Picture"/>
+                  <wp:docPr descr="" title="" id="44" name="Picture"/>
                   <a:graphic>
                     <a:graphicData uri="http://schemas.openxmlformats.org/drawingml/2006/picture">
                       <pic:pic>
                         <pic:nvPicPr>
-                          <pic:cNvPr descr="../Wykresy/praca/fig_01c_rozklady.png" id="32" name="Picture"/>
+                          <pic:cNvPr descr="../Wykresy/praca/fig_01c_rozklady.png" id="45" name="Picture"/>
                           <pic:cNvPicPr>
                             <a:picLocks noChangeArrowheads="1" noChangeAspect="1"/>
                           </pic:cNvPicPr>
                         </pic:nvPicPr>
                         <pic:blipFill>
-                          <a:blip r:embed="rId30"/>
+                          <a:blip r:embed="rId43"/>
                           <a:stretch>
                             <a:fillRect/>
                           </a:stretch>
@@ -5587,7 +5615,7 @@
               <w:jc w:val="center"/>
             </w:pPr>
             <w:pPr>
-              <w:jc w:val="left"/>
+              <w:jc w:val="start"/>
               <w:spacing w:before="200"/>
               <w:pStyle w:val="ImageCaption"/>
             </w:pPr>
@@ -5595,7 +5623,7 @@
               <w:t xml:space="preserve">Rysunek 3: Rozkłady (gęstości jądrowe) sześciu wskaźników bibliometrycznych w całej próbie. Przewaga długich prawych ogonów i położenie mediany (czerwona linia przerywana) poniżej średniej potwierdzają silną prawoskośność, uzasadniającą wybór testów nieparametrycznych.</w:t>
             </w:r>
           </w:p>
-          <w:bookmarkEnd w:id="33"/>
+          <w:bookmarkEnd w:id="46"/>
         </w:tc>
       </w:tr>
     </w:tbl>
@@ -5681,17 +5709,17 @@
     <w:tbl>
       <w:tblPr>
         <w:tblStyle w:val="Table"/>
-        <w:tblW w:type="dxa" w:w="9638"/>
-        <w:tblLayout w:type="autofit"/>
+        <w:tblW w:type="pct" w:w="5000"/>
+        <w:tblLayout w:type="fixed"/>
         <w:tblLook w:firstRow="0" w:lastRow="0" w:firstColumn="0" w:lastColumn="0" w:noHBand="0" w:noVBand="0" w:val="0000"/>
       </w:tblPr>
       <w:tblGrid>
-        <w:gridCol w:w="9638"/>
+        <w:gridCol w:w="7920"/>
       </w:tblGrid>
       <w:tr>
         <w:tc>
           <w:tcPr/>
-          <w:bookmarkStart w:id="37" w:name="fig-hindex"/>
+          <w:bookmarkStart w:id="50" w:name="fig-hindex"/>
           <w:p>
             <w:pPr>
               <w:pStyle w:val="Compact"/>
@@ -5702,18 +5730,18 @@
                 <wp:inline>
                   <wp:extent cx="5334000" cy="3388658"/>
                   <wp:effectExtent b="0" l="0" r="0" t="0"/>
-                  <wp:docPr descr="" title="" id="35" name="Picture"/>
+                  <wp:docPr descr="" title="" id="48" name="Picture"/>
                   <a:graphic>
                     <a:graphicData uri="http://schemas.openxmlformats.org/drawingml/2006/picture">
                       <pic:pic>
                         <pic:nvPicPr>
-                          <pic:cNvPr descr="../Wykresy/praca/fig_02a_hindex.png" id="36" name="Picture"/>
+                          <pic:cNvPr descr="../Wykresy/praca/fig_02a_hindex.png" id="49" name="Picture"/>
                           <pic:cNvPicPr>
                             <a:picLocks noChangeArrowheads="1" noChangeAspect="1"/>
                           </pic:cNvPicPr>
                         </pic:nvPicPr>
                         <pic:blipFill>
-                          <a:blip r:embed="rId34"/>
+                          <a:blip r:embed="rId47"/>
                           <a:stretch>
                             <a:fillRect/>
                           </a:stretch>
@@ -5745,7 +5773,7 @@
               <w:jc w:val="center"/>
             </w:pPr>
             <w:pPr>
-              <w:jc w:val="left"/>
+              <w:jc w:val="start"/>
               <w:spacing w:before="200"/>
               <w:pStyle w:val="ImageCaption"/>
             </w:pPr>
@@ -5753,7 +5781,7 @@
               <w:t xml:space="preserve">Rysunek 4: Wykres pudełkowy h-index (WoS) w dwuczynnikowym układzie uczelnia × stanowisko; oznaczenia grup jednorodnych (CLD) opisano w tekście powyżej.</w:t>
             </w:r>
           </w:p>
-          <w:bookmarkEnd w:id="37"/>
+          <w:bookmarkEnd w:id="50"/>
         </w:tc>
       </w:tr>
     </w:tbl>
@@ -5768,17 +5796,17 @@
     <w:tbl>
       <w:tblPr>
         <w:tblStyle w:val="Table"/>
-        <w:tblW w:type="dxa" w:w="9638"/>
-        <w:tblLayout w:type="autofit"/>
+        <w:tblW w:type="pct" w:w="5000"/>
+        <w:tblLayout w:type="fixed"/>
         <w:tblLook w:firstRow="0" w:lastRow="0" w:firstColumn="0" w:lastColumn="0" w:noHBand="0" w:noVBand="0" w:val="0000"/>
       </w:tblPr>
       <w:tblGrid>
-        <w:gridCol w:w="9638"/>
+        <w:gridCol w:w="7920"/>
       </w:tblGrid>
       <w:tr>
         <w:tc>
           <w:tcPr/>
-          <w:bookmarkStart w:id="41" w:name="fig-sumif"/>
+          <w:bookmarkStart w:id="54" w:name="fig-sumif"/>
           <w:p>
             <w:pPr>
               <w:pStyle w:val="Compact"/>
@@ -5789,18 +5817,18 @@
                 <wp:inline>
                   <wp:extent cx="5334000" cy="3388658"/>
                   <wp:effectExtent b="0" l="0" r="0" t="0"/>
-                  <wp:docPr descr="" title="" id="39" name="Picture"/>
+                  <wp:docPr descr="" title="" id="52" name="Picture"/>
                   <a:graphic>
                     <a:graphicData uri="http://schemas.openxmlformats.org/drawingml/2006/picture">
                       <pic:pic>
                         <pic:nvPicPr>
-                          <pic:cNvPr descr="../Wykresy/praca/fig_02b_sumif.png" id="40" name="Picture"/>
+                          <pic:cNvPr descr="../Wykresy/praca/fig_02b_sumif.png" id="53" name="Picture"/>
                           <pic:cNvPicPr>
                             <a:picLocks noChangeArrowheads="1" noChangeAspect="1"/>
                           </pic:cNvPicPr>
                         </pic:nvPicPr>
                         <pic:blipFill>
-                          <a:blip r:embed="rId38"/>
+                          <a:blip r:embed="rId51"/>
                           <a:stretch>
                             <a:fillRect/>
                           </a:stretch>
@@ -5832,7 +5860,7 @@
               <w:jc w:val="center"/>
             </w:pPr>
             <w:pPr>
-              <w:jc w:val="left"/>
+              <w:jc w:val="start"/>
               <w:spacing w:before="200"/>
               <w:pStyle w:val="ImageCaption"/>
             </w:pPr>
@@ -5840,7 +5868,7 @@
               <w:t xml:space="preserve">Rysunek 5: Wykres pudełkowy sumarycznego Impact Factor w dwuczynnikowym układzie uczelnia × stanowisko; oznaczenia grup jednorodnych (CLD) opisano w tekście powyżej.</w:t>
             </w:r>
           </w:p>
-          <w:bookmarkEnd w:id="41"/>
+          <w:bookmarkEnd w:id="54"/>
         </w:tc>
       </w:tr>
     </w:tbl>
@@ -5855,17 +5883,17 @@
     <w:tbl>
       <w:tblPr>
         <w:tblStyle w:val="Table"/>
-        <w:tblW w:type="dxa" w:w="9638"/>
-        <w:tblLayout w:type="autofit"/>
+        <w:tblW w:type="pct" w:w="5000"/>
+        <w:tblLayout w:type="fixed"/>
         <w:tblLook w:firstRow="0" w:lastRow="0" w:firstColumn="0" w:lastColumn="0" w:noHBand="0" w:noVBand="0" w:val="0000"/>
       </w:tblPr>
       <w:tblGrid>
-        <w:gridCol w:w="9638"/>
+        <w:gridCol w:w="7920"/>
       </w:tblGrid>
       <w:tr>
         <w:tc>
           <w:tcPr/>
-          <w:bookmarkStart w:id="45" w:name="fig-npub"/>
+          <w:bookmarkStart w:id="58" w:name="fig-npub"/>
           <w:p>
             <w:pPr>
               <w:pStyle w:val="Compact"/>
@@ -5876,18 +5904,18 @@
                 <wp:inline>
                   <wp:extent cx="5334000" cy="3388658"/>
                   <wp:effectExtent b="0" l="0" r="0" t="0"/>
-                  <wp:docPr descr="" title="" id="43" name="Picture"/>
+                  <wp:docPr descr="" title="" id="56" name="Picture"/>
                   <a:graphic>
                     <a:graphicData uri="http://schemas.openxmlformats.org/drawingml/2006/picture">
                       <pic:pic>
                         <pic:nvPicPr>
-                          <pic:cNvPr descr="../Wykresy/praca/fig_02c_npub.png" id="44" name="Picture"/>
+                          <pic:cNvPr descr="../Wykresy/praca/fig_02c_npub.png" id="57" name="Picture"/>
                           <pic:cNvPicPr>
                             <a:picLocks noChangeArrowheads="1" noChangeAspect="1"/>
                           </pic:cNvPicPr>
                         </pic:nvPicPr>
                         <pic:blipFill>
-                          <a:blip r:embed="rId42"/>
+                          <a:blip r:embed="rId55"/>
                           <a:stretch>
                             <a:fillRect/>
                           </a:stretch>
@@ -5919,7 +5947,7 @@
               <w:jc w:val="center"/>
             </w:pPr>
             <w:pPr>
-              <w:jc w:val="left"/>
+              <w:jc w:val="start"/>
               <w:spacing w:before="200"/>
               <w:pStyle w:val="ImageCaption"/>
             </w:pPr>
@@ -5927,7 +5955,7 @@
               <w:t xml:space="preserve">Rysunek 6: Wykres pudełkowy liczby publikacji w dwuczynnikowym układzie uczelnia × stanowisko; oznaczenia grup jednorodnych (CLD) opisano w tekście powyżej.</w:t>
             </w:r>
           </w:p>
-          <w:bookmarkEnd w:id="45"/>
+          <w:bookmarkEnd w:id="58"/>
         </w:tc>
       </w:tr>
     </w:tbl>
@@ -5980,23 +6008,23 @@
     <w:tbl>
       <w:tblPr>
         <w:tblStyle w:val="Table"/>
-        <w:tblW w:type="dxa" w:w="9638"/>
-        <w:tblLayout w:type="autofit"/>
+        <w:tblW w:type="pct" w:w="5000"/>
+        <w:tblLayout w:type="fixed"/>
         <w:tblLook w:firstRow="0" w:lastRow="0" w:firstColumn="0" w:lastColumn="0" w:noHBand="0" w:noVBand="0" w:val="0000"/>
       </w:tblPr>
       <w:tblGrid>
-        <w:gridCol w:w="9638"/>
+        <w:gridCol w:w="7920"/>
       </w:tblGrid>
       <w:tr>
         <w:tc>
           <w:tcPr/>
-          <w:bookmarkStart w:id="46" w:name="tbl-roznicowanie"/>
+          <w:bookmarkStart w:id="59" w:name="tbl-roznicowanie"/>
           <w:p>
             <w:pPr>
               <w:jc w:val="center"/>
             </w:pPr>
             <w:pPr>
-              <w:jc w:val="left"/>
+              <w:jc w:val="start"/>
               <w:spacing w:before="200"/>
               <w:pStyle w:val="ImageCaption"/>
             </w:pPr>
@@ -6006,16 +6034,16 @@
           </w:p>
           <w:tbl xmlns:w="http://schemas.openxmlformats.org/wordprocessingml/2006/main" xmlns:r="http://schemas.openxmlformats.org/officeDocument/2006/relationships" xmlns:w14="http://schemas.microsoft.com/office/word/2010/wordml" xmlns:wp="http://schemas.openxmlformats.org/drawingml/2006/wordprocessingDrawing" xmlns:a="http://schemas.openxmlformats.org/drawingml/2006/main" xmlns:pic="http://schemas.openxmlformats.org/drawingml/2006/picture">
             <w:tblPr>
-              <w:tblLayout w:type="autofit"/>
+              <w:tblLayout w:type="fixed"/>
               <w:jc w:val="center"/>
               <w:tblLook w:firstRow="1" w:lastRow="0" w:firstColumn="0" w:lastColumn="0" w:noHBand="0" w:noVBand="1"/>
             </w:tblPr>
             <w:tblGrid>
-              <w:gridCol w:w="3074"/>
-              <w:gridCol w:w="1579"/>
-              <w:gridCol w:w="1412"/>
-              <w:gridCol w:w="1828"/>
-              <w:gridCol w:w="1745"/>
+              <w:gridCol w:w="2664"/>
+              <w:gridCol w:w="1368"/>
+              <w:gridCol w:w="1224"/>
+              <w:gridCol w:w="1584"/>
+              <w:gridCol w:w="1512"/>
             </w:tblGrid>
             <w:tr>
               <w:trPr>
@@ -8004,7 +8032,7 @@
               </w:tc>
             </w:tr>
           </w:tbl>
-          <w:bookmarkEnd w:id="46"/>
+          <w:bookmarkEnd w:id="59"/>
         </w:tc>
       </w:tr>
     </w:tbl>
@@ -8032,8 +8060,8 @@
         <w:t xml:space="preserve">Podsumowując, wraz z wyższym stanowiskiem rosną wartości większości wskaźników bibliometrycznych. Zależność ta była istotna statystycznie dla pięciu z sześciu analizowanych metryk.</w:t>
       </w:r>
     </w:p>
-    <w:bookmarkEnd w:id="47"/>
-    <w:bookmarkStart w:id="55" w:name="X88ab428eb81e048ab5c69c902d08d12ccb60c6c"/>
+    <w:bookmarkEnd w:id="60"/>
+    <w:bookmarkStart w:id="68" w:name="X88ab428eb81e048ab5c69c902d08d12ccb60c6c"/>
     <w:p>
       <w:pPr>
         <w:pStyle w:val="Heading2"/>
@@ -8103,17 +8131,17 @@
     <w:tbl>
       <w:tblPr>
         <w:tblStyle w:val="Table"/>
-        <w:tblW w:type="dxa" w:w="9638"/>
-        <w:tblLayout w:type="autofit"/>
+        <w:tblW w:type="pct" w:w="5000"/>
+        <w:tblLayout w:type="fixed"/>
         <w:tblLook w:firstRow="0" w:lastRow="0" w:firstColumn="0" w:lastColumn="0" w:noHBand="0" w:noVBand="0" w:val="0000"/>
       </w:tblPr>
       <w:tblGrid>
-        <w:gridCol w:w="9638"/>
+        <w:gridCol w:w="7920"/>
       </w:tblGrid>
       <w:tr>
         <w:tc>
           <w:tcPr/>
-          <w:bookmarkStart w:id="51" w:name="fig-klastry"/>
+          <w:bookmarkStart w:id="64" w:name="fig-klastry"/>
           <w:p>
             <w:pPr>
               <w:pStyle w:val="Compact"/>
@@ -8124,18 +8152,18 @@
                 <wp:inline>
                   <wp:extent cx="5334000" cy="4000499"/>
                   <wp:effectExtent b="0" l="0" r="0" t="0"/>
-                  <wp:docPr descr="" title="" id="49" name="Picture"/>
+                  <wp:docPr descr="" title="" id="62" name="Picture"/>
                   <a:graphic>
                     <a:graphicData uri="http://schemas.openxmlformats.org/drawingml/2006/picture">
                       <pic:pic>
                         <pic:nvPicPr>
-                          <pic:cNvPr descr="../Wykresy/praca/fig_03a_klastry.png" id="50" name="Picture"/>
+                          <pic:cNvPr descr="../Wykresy/praca/fig_03a_klastry.png" id="63" name="Picture"/>
                           <pic:cNvPicPr>
                             <a:picLocks noChangeArrowheads="1" noChangeAspect="1"/>
                           </pic:cNvPicPr>
                         </pic:nvPicPr>
                         <pic:blipFill>
-                          <a:blip r:embed="rId48"/>
+                          <a:blip r:embed="rId61"/>
                           <a:stretch>
                             <a:fillRect/>
                           </a:stretch>
@@ -8167,7 +8195,7 @@
               <w:jc w:val="center"/>
             </w:pPr>
             <w:pPr>
-              <w:jc w:val="left"/>
+              <w:jc w:val="start"/>
               <w:spacing w:before="200"/>
               <w:pStyle w:val="ImageCaption"/>
             </w:pPr>
@@ -8175,7 +8203,7 @@
               <w:t xml:space="preserve">Rysunek 7: Klastrowanie k-means w przestrzeni dwóch pierwszych składowych głównych (PCA).</w:t>
             </w:r>
           </w:p>
-          <w:bookmarkEnd w:id="51"/>
+          <w:bookmarkEnd w:id="64"/>
         </w:tc>
       </w:tr>
     </w:tbl>
@@ -8233,23 +8261,23 @@
     <w:tbl>
       <w:tblPr>
         <w:tblStyle w:val="Table"/>
-        <w:tblW w:type="dxa" w:w="9638"/>
-        <w:tblLayout w:type="autofit"/>
+        <w:tblW w:type="pct" w:w="5000"/>
+        <w:tblLayout w:type="fixed"/>
         <w:tblLook w:firstRow="0" w:lastRow="0" w:firstColumn="0" w:lastColumn="0" w:noHBand="0" w:noVBand="0" w:val="0000"/>
       </w:tblPr>
       <w:tblGrid>
-        <w:gridCol w:w="9638"/>
+        <w:gridCol w:w="7920"/>
       </w:tblGrid>
       <w:tr>
         <w:tc>
           <w:tcPr/>
-          <w:bookmarkStart w:id="52" w:name="tbl-klastry2"/>
+          <w:bookmarkStart w:id="65" w:name="tbl-klastry2"/>
           <w:p>
             <w:pPr>
               <w:jc w:val="center"/>
             </w:pPr>
             <w:pPr>
-              <w:jc w:val="left"/>
+              <w:jc w:val="start"/>
               <w:spacing w:before="200"/>
               <w:pStyle w:val="ImageCaption"/>
             </w:pPr>
@@ -8259,17 +8287,17 @@
           </w:p>
           <w:tbl xmlns:w="http://schemas.openxmlformats.org/wordprocessingml/2006/main" xmlns:r="http://schemas.openxmlformats.org/officeDocument/2006/relationships" xmlns:w14="http://schemas.microsoft.com/office/word/2010/wordml" xmlns:wp="http://schemas.openxmlformats.org/drawingml/2006/wordprocessingDrawing" xmlns:a="http://schemas.openxmlformats.org/drawingml/2006/main" xmlns:pic="http://schemas.openxmlformats.org/drawingml/2006/picture">
             <w:tblPr>
-              <w:tblLayout w:type="autofit"/>
+              <w:tblLayout w:type="fixed"/>
               <w:jc w:val="center"/>
               <w:tblLook w:firstRow="1" w:lastRow="0" w:firstColumn="0" w:lastColumn="0" w:noHBand="0" w:noVBand="1"/>
             </w:tblPr>
             <w:tblGrid>
-              <w:gridCol w:w="2429"/>
-              <w:gridCol w:w="784"/>
-              <w:gridCol w:w="1489"/>
-              <w:gridCol w:w="1646"/>
-              <w:gridCol w:w="1646"/>
-              <w:gridCol w:w="1644"/>
+              <w:gridCol w:w="2232"/>
+              <w:gridCol w:w="720"/>
+              <w:gridCol w:w="1368"/>
+              <w:gridCol w:w="1512"/>
+              <w:gridCol w:w="1512"/>
+              <w:gridCol w:w="1512"/>
             </w:tblGrid>
             <w:tr>
               <w:trPr>
@@ -9260,7 +9288,7 @@
               </w:tc>
             </w:tr>
           </w:tbl>
-          <w:bookmarkEnd w:id="52"/>
+          <w:bookmarkEnd w:id="65"/>
         </w:tc>
       </w:tr>
     </w:tbl>
@@ -9353,23 +9381,23 @@
     <w:tbl>
       <w:tblPr>
         <w:tblStyle w:val="Table"/>
-        <w:tblW w:type="dxa" w:w="9638"/>
-        <w:tblLayout w:type="autofit"/>
+        <w:tblW w:type="pct" w:w="5000"/>
+        <w:tblLayout w:type="fixed"/>
         <w:tblLook w:firstRow="0" w:lastRow="0" w:firstColumn="0" w:lastColumn="0" w:noHBand="0" w:noVBand="0" w:val="0000"/>
       </w:tblPr>
       <w:tblGrid>
-        <w:gridCol w:w="9638"/>
+        <w:gridCol w:w="7920"/>
       </w:tblGrid>
       <w:tr>
         <w:tc>
           <w:tcPr/>
-          <w:bookmarkStart w:id="53" w:name="tbl-replikacja"/>
+          <w:bookmarkStart w:id="66" w:name="tbl-replikacja"/>
           <w:p>
             <w:pPr>
               <w:jc w:val="center"/>
             </w:pPr>
             <w:pPr>
-              <w:jc w:val="left"/>
+              <w:jc w:val="start"/>
               <w:spacing w:before="200"/>
               <w:pStyle w:val="ImageCaption"/>
             </w:pPr>
@@ -9379,17 +9407,17 @@
           </w:p>
           <w:tbl xmlns:w="http://schemas.openxmlformats.org/wordprocessingml/2006/main" xmlns:r="http://schemas.openxmlformats.org/officeDocument/2006/relationships" xmlns:w14="http://schemas.microsoft.com/office/word/2010/wordml" xmlns:wp="http://schemas.openxmlformats.org/drawingml/2006/wordprocessingDrawing" xmlns:a="http://schemas.openxmlformats.org/drawingml/2006/main" xmlns:pic="http://schemas.openxmlformats.org/drawingml/2006/picture">
             <w:tblPr>
-              <w:tblLayout w:type="autofit"/>
+              <w:tblLayout w:type="fixed"/>
               <w:jc w:val="center"/>
               <w:tblLook w:firstRow="1" w:lastRow="0" w:firstColumn="0" w:lastColumn="0" w:noHBand="0" w:noVBand="1"/>
             </w:tblPr>
             <w:tblGrid>
-              <w:gridCol w:w="1501"/>
-              <w:gridCol w:w="1659"/>
-              <w:gridCol w:w="1501"/>
-              <w:gridCol w:w="1580"/>
-              <w:gridCol w:w="1738"/>
-              <w:gridCol w:w="1659"/>
+              <w:gridCol w:w="1368"/>
+              <w:gridCol w:w="1512"/>
+              <w:gridCol w:w="1368"/>
+              <w:gridCol w:w="1440"/>
+              <w:gridCol w:w="1584"/>
+              <w:gridCol w:w="1512"/>
             </w:tblGrid>
             <w:tr>
               <w:trPr>
@@ -11487,7 +11515,7 @@
               </w:tc>
             </w:tr>
           </w:tbl>
-          <w:bookmarkEnd w:id="53"/>
+          <w:bookmarkEnd w:id="66"/>
         </w:tc>
       </w:tr>
     </w:tbl>
@@ -11521,23 +11549,23 @@
     <w:tbl>
       <w:tblPr>
         <w:tblStyle w:val="Table"/>
-        <w:tblW w:type="dxa" w:w="9638"/>
-        <w:tblLayout w:type="autofit"/>
+        <w:tblW w:type="pct" w:w="5000"/>
+        <w:tblLayout w:type="fixed"/>
         <w:tblLook w:firstRow="0" w:lastRow="0" w:firstColumn="0" w:lastColumn="0" w:noHBand="0" w:noVBand="0" w:val="0000"/>
       </w:tblPr>
       <w:tblGrid>
-        <w:gridCol w:w="9638"/>
+        <w:gridCol w:w="7920"/>
       </w:tblGrid>
       <w:tr>
         <w:tc>
           <w:tcPr/>
-          <w:bookmarkStart w:id="54" w:name="tbl-klastry3"/>
+          <w:bookmarkStart w:id="67" w:name="tbl-klastry3"/>
           <w:p>
             <w:pPr>
               <w:jc w:val="center"/>
             </w:pPr>
             <w:pPr>
-              <w:jc w:val="left"/>
+              <w:jc w:val="start"/>
               <w:spacing w:before="200"/>
               <w:pStyle w:val="ImageCaption"/>
             </w:pPr>
@@ -11547,17 +11575,17 @@
           </w:p>
           <w:tbl xmlns:w="http://schemas.openxmlformats.org/wordprocessingml/2006/main" xmlns:r="http://schemas.openxmlformats.org/officeDocument/2006/relationships" xmlns:w14="http://schemas.microsoft.com/office/word/2010/wordml" xmlns:wp="http://schemas.openxmlformats.org/drawingml/2006/wordprocessingDrawing" xmlns:a="http://schemas.openxmlformats.org/drawingml/2006/main" xmlns:pic="http://schemas.openxmlformats.org/drawingml/2006/picture">
             <w:tblPr>
-              <w:tblLayout w:type="autofit"/>
+              <w:tblLayout w:type="fixed"/>
               <w:jc w:val="center"/>
               <w:tblLook w:firstRow="1" w:lastRow="0" w:firstColumn="0" w:lastColumn="0" w:noHBand="0" w:noVBand="1"/>
             </w:tblPr>
             <w:tblGrid>
-              <w:gridCol w:w="2907"/>
-              <w:gridCol w:w="612"/>
-              <w:gridCol w:w="1377"/>
-              <w:gridCol w:w="1377"/>
-              <w:gridCol w:w="1224"/>
-              <w:gridCol w:w="2141"/>
+              <w:gridCol w:w="2736"/>
+              <w:gridCol w:w="576"/>
+              <w:gridCol w:w="1296"/>
+              <w:gridCol w:w="1296"/>
+              <w:gridCol w:w="1152"/>
+              <w:gridCol w:w="2016"/>
             </w:tblGrid>
             <w:tr>
               <w:trPr>
@@ -12997,7 +13025,7 @@
               </w:tc>
             </w:tr>
           </w:tbl>
-          <w:bookmarkEnd w:id="54"/>
+          <w:bookmarkEnd w:id="67"/>
         </w:tc>
       </w:tr>
     </w:tbl>
@@ -13017,8 +13045,8 @@
         <w:t xml:space="preserve">Wynik ten pokazuje, że wysoki wpływ naukowy nie musi wynikać wyłącznie z długiego stażu i dużej liczby publikacji. Poza wielkością dorobku znaczenie ma także jego jakość: wysokie wartości wskaźników osiągają również młodsi badacze z mniejszą liczbą publikacji. Także w wariancie z trzema klastrami typologia pozostaje niezależna od uczelni (Craméra V = 0,10). Jej związek ze stanowiskiem jest natomiast słabszy niż w podziale na dwa klastry (V = 0,38), ponieważ profil jakościowy obejmuje osoby z różnych poziomów hierarchii akademickiej.</w:t>
       </w:r>
     </w:p>
-    <w:bookmarkEnd w:id="55"/>
-    <w:bookmarkStart w:id="67" w:name="Xbd5b45b451445d4809baed400770e4b8ffa7ad0"/>
+    <w:bookmarkEnd w:id="68"/>
+    <w:bookmarkStart w:id="80" w:name="Xbd5b45b451445d4809baed400770e4b8ffa7ad0"/>
     <w:p>
       <w:pPr>
         <w:pStyle w:val="Heading2"/>
@@ -13111,23 +13139,23 @@
     <w:tbl>
       <w:tblPr>
         <w:tblStyle w:val="Table"/>
-        <w:tblW w:type="dxa" w:w="9638"/>
-        <w:tblLayout w:type="autofit"/>
+        <w:tblW w:type="pct" w:w="5000"/>
+        <w:tblLayout w:type="fixed"/>
         <w:tblLook w:firstRow="0" w:lastRow="0" w:firstColumn="0" w:lastColumn="0" w:noHBand="0" w:noVBand="0" w:val="0000"/>
       </w:tblPr>
       <w:tblGrid>
-        <w:gridCol w:w="9638"/>
+        <w:gridCol w:w="7920"/>
       </w:tblGrid>
       <w:tr>
         <w:tc>
           <w:tcPr/>
-          <w:bookmarkStart w:id="56" w:name="tbl-modele"/>
+          <w:bookmarkStart w:id="69" w:name="tbl-modele"/>
           <w:p>
             <w:pPr>
               <w:jc w:val="center"/>
             </w:pPr>
             <w:pPr>
-              <w:jc w:val="left"/>
+              <w:jc w:val="start"/>
               <w:spacing w:before="200"/>
               <w:pStyle w:val="ImageCaption"/>
             </w:pPr>
@@ -13137,16 +13165,16 @@
           </w:p>
           <w:tbl xmlns:w="http://schemas.openxmlformats.org/wordprocessingml/2006/main" xmlns:r="http://schemas.openxmlformats.org/officeDocument/2006/relationships" xmlns:w14="http://schemas.microsoft.com/office/word/2010/wordml" xmlns:wp="http://schemas.openxmlformats.org/drawingml/2006/wordprocessingDrawing" xmlns:a="http://schemas.openxmlformats.org/drawingml/2006/main" xmlns:pic="http://schemas.openxmlformats.org/drawingml/2006/picture">
             <w:tblPr>
-              <w:tblLayout w:type="autofit"/>
+              <w:tblLayout w:type="fixed"/>
               <w:jc w:val="center"/>
               <w:tblLook w:firstRow="1" w:lastRow="0" w:firstColumn="0" w:lastColumn="0" w:noHBand="0" w:noVBand="1"/>
             </w:tblPr>
             <w:tblGrid>
-              <w:gridCol w:w="2570"/>
-              <w:gridCol w:w="1767"/>
-              <w:gridCol w:w="1767"/>
-              <w:gridCol w:w="1767"/>
-              <w:gridCol w:w="1767"/>
+              <w:gridCol w:w="2304"/>
+              <w:gridCol w:w="1584"/>
+              <w:gridCol w:w="1584"/>
+              <w:gridCol w:w="1584"/>
+              <w:gridCol w:w="1584"/>
             </w:tblGrid>
             <w:tr>
               <w:trPr>
@@ -14095,7 +14123,7 @@
               </w:tc>
             </w:tr>
           </w:tbl>
-          <w:bookmarkEnd w:id="56"/>
+          <w:bookmarkEnd w:id="69"/>
         </w:tc>
       </w:tr>
     </w:tbl>
@@ -14173,23 +14201,23 @@
     <w:tbl>
       <w:tblPr>
         <w:tblStyle w:val="Table"/>
-        <w:tblW w:type="dxa" w:w="9638"/>
-        <w:tblLayout w:type="autofit"/>
+        <w:tblW w:type="pct" w:w="5000"/>
+        <w:tblLayout w:type="fixed"/>
         <w:tblLook w:firstRow="0" w:lastRow="0" w:firstColumn="0" w:lastColumn="0" w:noHBand="0" w:noVBand="0" w:val="0000"/>
       </w:tblPr>
       <w:tblGrid>
-        <w:gridCol w:w="9638"/>
+        <w:gridCol w:w="7920"/>
       </w:tblGrid>
       <w:tr>
         <w:tc>
           <w:tcPr/>
-          <w:bookmarkStart w:id="57" w:name="tbl-prog"/>
+          <w:bookmarkStart w:id="70" w:name="tbl-prog"/>
           <w:p>
             <w:pPr>
               <w:jc w:val="center"/>
             </w:pPr>
             <w:pPr>
-              <w:jc w:val="left"/>
+              <w:jc w:val="start"/>
               <w:spacing w:before="200"/>
               <w:pStyle w:val="ImageCaption"/>
             </w:pPr>
@@ -14199,16 +14227,16 @@
           </w:p>
           <w:tbl xmlns:w="http://schemas.openxmlformats.org/wordprocessingml/2006/main" xmlns:r="http://schemas.openxmlformats.org/officeDocument/2006/relationships" xmlns:w14="http://schemas.microsoft.com/office/word/2010/wordml" xmlns:wp="http://schemas.openxmlformats.org/drawingml/2006/wordprocessingDrawing" xmlns:a="http://schemas.openxmlformats.org/drawingml/2006/main" xmlns:pic="http://schemas.openxmlformats.org/drawingml/2006/picture">
             <w:tblPr>
-              <w:tblLayout w:type="autofit"/>
+              <w:tblLayout w:type="fixed"/>
               <w:jc w:val="center"/>
               <w:tblLook w:firstRow="1" w:lastRow="0" w:firstColumn="0" w:lastColumn="0" w:noHBand="0" w:noVBand="1"/>
             </w:tblPr>
             <w:tblGrid>
-              <w:gridCol w:w="2923"/>
-              <w:gridCol w:w="1422"/>
-              <w:gridCol w:w="1580"/>
-              <w:gridCol w:w="1343"/>
-              <w:gridCol w:w="2370"/>
+              <w:gridCol w:w="2664"/>
+              <w:gridCol w:w="1296"/>
+              <w:gridCol w:w="1440"/>
+              <w:gridCol w:w="1224"/>
+              <w:gridCol w:w="2160"/>
             </w:tblGrid>
             <w:tr>
               <w:trPr>
@@ -15157,7 +15185,7 @@
               </w:tc>
             </w:tr>
           </w:tbl>
-          <w:bookmarkEnd w:id="57"/>
+          <w:bookmarkEnd w:id="70"/>
         </w:tc>
       </w:tr>
     </w:tbl>
@@ -15202,17 +15230,17 @@
     <w:tbl>
       <w:tblPr>
         <w:tblStyle w:val="Table"/>
-        <w:tblW w:type="dxa" w:w="9638"/>
-        <w:tblLayout w:type="autofit"/>
+        <w:tblW w:type="pct" w:w="5000"/>
+        <w:tblLayout w:type="fixed"/>
         <w:tblLook w:firstRow="0" w:lastRow="0" w:firstColumn="0" w:lastColumn="0" w:noHBand="0" w:noVBand="0" w:val="0000"/>
       </w:tblPr>
       <w:tblGrid>
-        <w:gridCol w:w="9638"/>
+        <w:gridCol w:w="7920"/>
       </w:tblGrid>
       <w:tr>
         <w:tc>
           <w:tcPr/>
-          <w:bookmarkStart w:id="61" w:name="fig-waznosc"/>
+          <w:bookmarkStart w:id="74" w:name="fig-waznosc"/>
           <w:p>
             <w:pPr>
               <w:pStyle w:val="Compact"/>
@@ -15223,18 +15251,18 @@
                 <wp:inline>
                   <wp:extent cx="5334000" cy="3006436"/>
                   <wp:effectExtent b="0" l="0" r="0" t="0"/>
-                  <wp:docPr descr="" title="" id="59" name="Picture"/>
+                  <wp:docPr descr="" title="" id="72" name="Picture"/>
                   <a:graphic>
                     <a:graphicData uri="http://schemas.openxmlformats.org/drawingml/2006/picture">
                       <pic:pic>
                         <pic:nvPicPr>
-                          <pic:cNvPr descr="../Wykresy/praca/fig_04b_waznosc.png" id="60" name="Picture"/>
+                          <pic:cNvPr descr="../Wykresy/praca/fig_04b_waznosc.png" id="73" name="Picture"/>
                           <pic:cNvPicPr>
                             <a:picLocks noChangeArrowheads="1" noChangeAspect="1"/>
                           </pic:cNvPicPr>
                         </pic:nvPicPr>
                         <pic:blipFill>
-                          <a:blip r:embed="rId58"/>
+                          <a:blip r:embed="rId71"/>
                           <a:stretch>
                             <a:fillRect/>
                           </a:stretch>
@@ -15266,7 +15294,7 @@
               <w:jc w:val="center"/>
             </w:pPr>
             <w:pPr>
-              <w:jc w:val="left"/>
+              <w:jc w:val="start"/>
               <w:spacing w:before="200"/>
               <w:pStyle w:val="ImageCaption"/>
             </w:pPr>
@@ -15274,7 +15302,7 @@
               <w:t xml:space="preserve">Rysunek 8: Najważniejsze predyktory wysokiego wpływu publikacyjnego w modelu Random Forest (ważność permutacyjna). Kolor oznacza kategorię cechy: produktywność, współpraca i cytowania oraz cechy formalne (uczelnia, stanowisko).</w:t>
             </w:r>
           </w:p>
-          <w:bookmarkEnd w:id="61"/>
+          <w:bookmarkEnd w:id="74"/>
         </w:tc>
       </w:tr>
     </w:tbl>
@@ -15286,7 +15314,7 @@
         <w:t xml:space="preserve">W odpowiedzi na pytanie 3 wyniki pokazują, że wysoki wpływ naukowy można przewidywać na podstawie cech strukturalnych badaczy. Model osiągnął bardzo dobrą zdolność rozróżniania osób o wysokim i niższym wpływie naukowym (AUC ok. 0,97).</w:t>
       </w:r>
     </w:p>
-    <w:bookmarkStart w:id="66" w:name="X799efba27fc6d09a0b5025f13f38b8866705e0f"/>
+    <w:bookmarkStart w:id="79" w:name="X799efba27fc6d09a0b5025f13f38b8866705e0f"/>
     <w:p>
       <w:pPr>
         <w:pStyle w:val="Heading3"/>
@@ -15341,17 +15369,17 @@
     <w:tbl>
       <w:tblPr>
         <w:tblStyle w:val="Table"/>
-        <w:tblW w:type="dxa" w:w="9638"/>
-        <w:tblLayout w:type="autofit"/>
+        <w:tblW w:type="pct" w:w="5000"/>
+        <w:tblLayout w:type="fixed"/>
         <w:tblLook w:firstRow="0" w:lastRow="0" w:firstColumn="0" w:lastColumn="0" w:noHBand="0" w:noVBand="0" w:val="0000"/>
       </w:tblPr>
       <w:tblGrid>
-        <w:gridCol w:w="9638"/>
+        <w:gridCol w:w="7920"/>
       </w:tblGrid>
       <w:tr>
         <w:tc>
           <w:tcPr/>
-          <w:bookmarkStart w:id="65" w:name="fig-waznosc-jakosc"/>
+          <w:bookmarkStart w:id="78" w:name="fig-waznosc-jakosc"/>
           <w:p>
             <w:pPr>
               <w:pStyle w:val="Compact"/>
@@ -15362,18 +15390,18 @@
                 <wp:inline>
                   <wp:extent cx="5334000" cy="3006436"/>
                   <wp:effectExtent b="0" l="0" r="0" t="0"/>
-                  <wp:docPr descr="" title="" id="63" name="Picture"/>
+                  <wp:docPr descr="" title="" id="76" name="Picture"/>
                   <a:graphic>
                     <a:graphicData uri="http://schemas.openxmlformats.org/drawingml/2006/picture">
                       <pic:pic>
                         <pic:nvPicPr>
-                          <pic:cNvPr descr="../Wykresy/praca/fig_04c_waznosc_jakosc.png" id="64" name="Picture"/>
+                          <pic:cNvPr descr="../Wykresy/praca/fig_04c_waznosc_jakosc.png" id="77" name="Picture"/>
                           <pic:cNvPicPr>
                             <a:picLocks noChangeArrowheads="1" noChangeAspect="1"/>
                           </pic:cNvPicPr>
                         </pic:nvPicPr>
                         <pic:blipFill>
-                          <a:blip r:embed="rId62"/>
+                          <a:blip r:embed="rId75"/>
                           <a:stretch>
                             <a:fillRect/>
                           </a:stretch>
@@ -15405,7 +15433,7 @@
               <w:jc w:val="center"/>
             </w:pPr>
             <w:pPr>
-              <w:jc w:val="left"/>
+              <w:jc w:val="start"/>
               <w:spacing w:before="200"/>
               <w:pStyle w:val="ImageCaption"/>
             </w:pPr>
@@ -15413,7 +15441,7 @@
               <w:t xml:space="preserve">Rysunek 9: Najważniejsze predyktory jakości dorobku w modelu Random Forest. Model przewidywał, czy średni FWCI badacza przekracza 1. Największe znaczenie miały cechy współpracy naukowej, zwłaszcza średnia liczba autorów jednej publikacji i liczba unikalnych współautorów. Wiek akademicki, liczba publikacji, stanowisko i uczelnia miały mniejsze znaczenie. Kolor oznacza kategorię zmiennej.</w:t>
             </w:r>
           </w:p>
-          <w:bookmarkEnd w:id="65"/>
+          <w:bookmarkEnd w:id="78"/>
         </w:tc>
       </w:tr>
     </w:tbl>
@@ -15425,9 +15453,9 @@
         <w:t xml:space="preserve">Oznacza to, że wysoki wpływ pojedynczych publikacji częściej wiąże się z pracą w szerszych, wieloautorskich zespołach niż ze stażem, liczbą publikacji czy formalnym stanowiskiem. Podobny wniosek wynikał już z analizy klastrów, w której wyróżniono profil jakościowy obejmujący wielu młodszych badaczy. Pokazuje to, że wysoka jakość dorobku nie musi być związana z długim stażem ani dużą liczbą publikacji.</w:t>
       </w:r>
     </w:p>
-    <w:bookmarkEnd w:id="66"/>
-    <w:bookmarkEnd w:id="67"/>
-    <w:bookmarkStart w:id="77" w:name="sieć-współautorstwa-pytanie-4"/>
+    <w:bookmarkEnd w:id="79"/>
+    <w:bookmarkEnd w:id="80"/>
+    <w:bookmarkStart w:id="90" w:name="sieć-współautorstwa-pytanie-4"/>
     <w:p>
       <w:pPr>
         <w:pStyle w:val="Heading2"/>
@@ -15455,17 +15483,17 @@
     <w:tbl>
       <w:tblPr>
         <w:tblStyle w:val="Table"/>
-        <w:tblW w:type="dxa" w:w="9638"/>
-        <w:tblLayout w:type="autofit"/>
+        <w:tblW w:type="pct" w:w="5000"/>
+        <w:tblLayout w:type="fixed"/>
         <w:tblLook w:firstRow="0" w:lastRow="0" w:firstColumn="0" w:lastColumn="0" w:noHBand="0" w:noVBand="0" w:val="0000"/>
       </w:tblPr>
       <w:tblGrid>
-        <w:gridCol w:w="9638"/>
+        <w:gridCol w:w="7920"/>
       </w:tblGrid>
       <w:tr>
         <w:tc>
           <w:tcPr/>
-          <w:bookmarkStart w:id="71" w:name="fig-siec"/>
+          <w:bookmarkStart w:id="84" w:name="fig-siec"/>
           <w:p>
             <w:pPr>
               <w:pStyle w:val="Compact"/>
@@ -15476,18 +15504,18 @@
                 <wp:inline>
                   <wp:extent cx="5067300" cy="4504266"/>
                   <wp:effectExtent b="0" l="0" r="0" t="0"/>
-                  <wp:docPr descr="" title="" id="69" name="Picture"/>
+                  <wp:docPr descr="" title="" id="82" name="Picture"/>
                   <a:graphic>
                     <a:graphicData uri="http://schemas.openxmlformats.org/drawingml/2006/picture">
                       <pic:pic>
                         <pic:nvPicPr>
-                          <pic:cNvPr descr="../Wykresy/praca/fig_05a_siec.png" id="70" name="Picture"/>
+                          <pic:cNvPr descr="../Wykresy/praca/fig_05a_siec.png" id="83" name="Picture"/>
                           <pic:cNvPicPr>
                             <a:picLocks noChangeArrowheads="1" noChangeAspect="1"/>
                           </pic:cNvPicPr>
                         </pic:nvPicPr>
                         <pic:blipFill>
-                          <a:blip r:embed="rId68"/>
+                          <a:blip r:embed="rId81"/>
                           <a:stretch>
                             <a:fillRect/>
                           </a:stretch>
@@ -15519,7 +15547,7 @@
               <w:jc w:val="center"/>
             </w:pPr>
             <w:pPr>
-              <w:jc w:val="left"/>
+              <w:jc w:val="start"/>
               <w:spacing w:before="200"/>
               <w:pStyle w:val="ImageCaption"/>
             </w:pPr>
@@ -15527,7 +15555,7 @@
               <w:t xml:space="preserve">Rysunek 10: Sieć współautorstwa naukowców badanej dyscypliny. Węzły to badacze (kolor oznacza uczelnię, wielkość liczbę połączeń), a krawędzie wspólne publikacje. Skupiska tej samej barwy pokazują, że współpraca koncentruje się wewnątrz uczelni.</w:t>
             </w:r>
           </w:p>
-          <w:bookmarkEnd w:id="71"/>
+          <w:bookmarkEnd w:id="84"/>
         </w:tc>
       </w:tr>
     </w:tbl>
@@ -15595,23 +15623,23 @@
     <w:tbl>
       <w:tblPr>
         <w:tblStyle w:val="Table"/>
-        <w:tblW w:type="dxa" w:w="9638"/>
-        <w:tblLayout w:type="autofit"/>
+        <w:tblW w:type="pct" w:w="5000"/>
+        <w:tblLayout w:type="fixed"/>
         <w:tblLook w:firstRow="0" w:lastRow="0" w:firstColumn="0" w:lastColumn="0" w:noHBand="0" w:noVBand="0" w:val="0000"/>
       </w:tblPr>
       <w:tblGrid>
-        <w:gridCol w:w="9638"/>
+        <w:gridCol w:w="7920"/>
       </w:tblGrid>
       <w:tr>
         <w:tc>
           <w:tcPr/>
-          <w:bookmarkStart w:id="72" w:name="tbl-spolecznosci"/>
+          <w:bookmarkStart w:id="85" w:name="tbl-spolecznosci"/>
           <w:p>
             <w:pPr>
               <w:jc w:val="center"/>
             </w:pPr>
             <w:pPr>
-              <w:jc w:val="left"/>
+              <w:jc w:val="start"/>
               <w:spacing w:before="200"/>
               <w:pStyle w:val="ImageCaption"/>
             </w:pPr>
@@ -15621,14 +15649,14 @@
           </w:p>
           <w:tbl xmlns:w="http://schemas.openxmlformats.org/wordprocessingml/2006/main" xmlns:r="http://schemas.openxmlformats.org/officeDocument/2006/relationships" xmlns:w14="http://schemas.microsoft.com/office/word/2010/wordml" xmlns:wp="http://schemas.openxmlformats.org/drawingml/2006/wordprocessingDrawing" xmlns:a="http://schemas.openxmlformats.org/drawingml/2006/main" xmlns:pic="http://schemas.openxmlformats.org/drawingml/2006/picture">
             <w:tblPr>
-              <w:tblLayout w:type="autofit"/>
+              <w:tblLayout w:type="fixed"/>
               <w:jc w:val="center"/>
               <w:tblLook w:firstRow="1" w:lastRow="0" w:firstColumn="0" w:lastColumn="0" w:noHBand="0" w:noVBand="1"/>
             </w:tblPr>
             <w:tblGrid>
-              <w:gridCol w:w="5484"/>
-              <w:gridCol w:w="2077"/>
-              <w:gridCol w:w="2077"/>
+              <w:gridCol w:w="4752"/>
+              <w:gridCol w:w="1800"/>
+              <w:gridCol w:w="1800"/>
             </w:tblGrid>
             <w:tr>
               <w:trPr>
@@ -16253,24 +16281,24 @@
               </w:tc>
             </w:tr>
           </w:tbl>
-          <w:bookmarkEnd w:id="72"/>
+          <w:bookmarkEnd w:id="85"/>
         </w:tc>
       </w:tr>
     </w:tbl>
     <w:tbl>
       <w:tblPr>
         <w:tblStyle w:val="Table"/>
-        <w:tblW w:type="dxa" w:w="9638"/>
-        <w:tblLayout w:type="autofit"/>
+        <w:tblW w:type="pct" w:w="5000"/>
+        <w:tblLayout w:type="fixed"/>
         <w:tblLook w:firstRow="0" w:lastRow="0" w:firstColumn="0" w:lastColumn="0" w:noHBand="0" w:noVBand="0" w:val="0000"/>
       </w:tblPr>
       <w:tblGrid>
-        <w:gridCol w:w="9638"/>
+        <w:gridCol w:w="7920"/>
       </w:tblGrid>
       <w:tr>
         <w:tc>
           <w:tcPr/>
-          <w:bookmarkStart w:id="76" w:name="fig-spolecznosci"/>
+          <w:bookmarkStart w:id="89" w:name="fig-spolecznosci"/>
           <w:p>
             <w:pPr>
               <w:pStyle w:val="Compact"/>
@@ -16281,18 +16309,18 @@
                 <wp:inline>
                   <wp:extent cx="5334000" cy="6096000"/>
                   <wp:effectExtent b="0" l="0" r="0" t="0"/>
-                  <wp:docPr descr="" title="" id="74" name="Picture"/>
+                  <wp:docPr descr="" title="" id="87" name="Picture"/>
                   <a:graphic>
                     <a:graphicData uri="http://schemas.openxmlformats.org/drawingml/2006/picture">
                       <pic:pic>
                         <pic:nvPicPr>
-                          <pic:cNvPr descr="../Wykresy/praca/fig_05b_spolecznosci.png" id="75" name="Picture"/>
+                          <pic:cNvPr descr="../Wykresy/praca/fig_05b_spolecznosci.png" id="88" name="Picture"/>
                           <pic:cNvPicPr>
                             <a:picLocks noChangeArrowheads="1" noChangeAspect="1"/>
                           </pic:cNvPicPr>
                         </pic:nvPicPr>
                         <pic:blipFill>
-                          <a:blip r:embed="rId73"/>
+                          <a:blip r:embed="rId86"/>
                           <a:stretch>
                             <a:fillRect/>
                           </a:stretch>
@@ -16324,7 +16352,7 @@
               <w:jc w:val="center"/>
             </w:pPr>
             <w:pPr>
-              <w:jc w:val="left"/>
+              <w:jc w:val="start"/>
               <w:spacing w:before="200"/>
               <w:pStyle w:val="ImageCaption"/>
             </w:pPr>
@@ -16332,7 +16360,7 @@
               <w:t xml:space="preserve">Rysunek 11: Zgodność społeczności Louvain z uczelnią. Każdy wiersz to jedna społeczność (uporządkowane według wielkości); wartość i intensywność oznaczają udział danej uczelni, a kolor typ społeczności: czerwień to społeczność jednouczelniana, turkus to społeczność mieszana (współpraca międzyuczelniana). Niemal wszystkie społeczności są jednorodne uczelniano.</w:t>
             </w:r>
           </w:p>
-          <w:bookmarkEnd w:id="76"/>
+          <w:bookmarkEnd w:id="89"/>
         </w:tc>
       </w:tr>
     </w:tbl>
@@ -16371,9 +16399,9 @@
         <w:t xml:space="preserve">Najwyższą centralność stopnia, czyli największą liczbę bezpośrednich powiązań współautorskich, osiąga profesor z URK (S. Smoleń). Wśród najbardziej centralnych osób znajduje się także grupa badaczy gleboznawczych z UPWr.</w:t>
       </w:r>
     </w:p>
-    <w:bookmarkEnd w:id="77"/>
-    <w:bookmarkEnd w:id="78"/>
-    <w:bookmarkStart w:id="88" w:name="dyskusja"/>
+    <w:bookmarkEnd w:id="90"/>
+    <w:bookmarkEnd w:id="91"/>
+    <w:bookmarkStart w:id="101" w:name="dyskusja"/>
     <w:p>
       <w:pPr>
         <w:pStyle w:val="Heading1"/>
@@ -16382,7 +16410,7 @@
         <w:t xml:space="preserve">Dyskusja</w:t>
       </w:r>
     </w:p>
-    <w:bookmarkStart w:id="79" w:name="X8e8cd80b7d1e8d8e23d38bfd67a798253a95b88"/>
+    <w:bookmarkStart w:id="92" w:name="X8e8cd80b7d1e8d8e23d38bfd67a798253a95b88"/>
     <w:p>
       <w:pPr>
         <w:pStyle w:val="Heading2"/>
@@ -16431,8 +16459,8 @@
         <w:t xml:space="preserve">Taki układ może wynikać ze specyfiki nauk rolniczych. W tej dziedzinie część badań jest silnie związana z lokalną infrastrukturą i warunkami prowadzenia eksperymentów, takimi jak pola doświadczalne, stacje badawcze czy lokalne uwarunkowania glebowo-klimatyczne. Może to sprzyjać współpracy w obrębie tej samej uczelni lub ośrodka badawczego.</w:t>
       </w:r>
     </w:p>
-    <w:bookmarkEnd w:id="79"/>
-    <w:bookmarkStart w:id="80" w:name="X55d3951ebce5c318a1ba2b13bef613b3921736b"/>
+    <w:bookmarkEnd w:id="92"/>
+    <w:bookmarkStart w:id="93" w:name="X55d3951ebce5c318a1ba2b13bef613b3921736b"/>
     <w:p>
       <w:pPr>
         <w:pStyle w:val="Heading2"/>
@@ -16481,8 +16509,8 @@
         <w:t xml:space="preserve">Spójny obraz daje też wariant klastrowania k = 3, w którym wyodrębniono profil jakościowy zdominowany przez asystentów i adiunktów o wysokim FWCI i IF na publikację. Może to odzwierciedlać zmianę pokoleniową, w której młodsi badacze częściej publikują w prestiżowych czasopismach o szerokim zasięgu, w ramach większych zespołów współautorskich, zamiast budować dużą liczbę prac o niższym oddziaływaniu. Ponieważ dane mają charakter przekrojowy, interpretację tę należy traktować jako hipotezę: nie można odróżnić rzeczywistego efektu pokoleniowego od efektu etapu kariery ani od selekcji osób pozostających w nauce.</w:t>
       </w:r>
     </w:p>
-    <w:bookmarkEnd w:id="80"/>
-    <w:bookmarkStart w:id="81" w:name="kategoria-ewaluacyjna-mein"/>
+    <w:bookmarkEnd w:id="93"/>
+    <w:bookmarkStart w:id="94" w:name="kategoria-ewaluacyjna-mein"/>
     <w:p>
       <w:pPr>
         <w:pStyle w:val="Heading2"/>
@@ -16515,8 +16543,8 @@
         <w:t xml:space="preserve">Wniosek ten należy jednak traktować ostrożnie. W badaniu uwzględniono tylko jedną uczelnię z kategorią B+, dlatego zależność między kategorią ewaluacyjną a indywidualnym dorobkiem naukowców wymagałaby sprawdzenia na większej próbie uczelni.</w:t>
       </w:r>
     </w:p>
-    <w:bookmarkEnd w:id="81"/>
-    <w:bookmarkStart w:id="86" w:name="Xc8114be83f87911a3e825982079ac6b9186de2d"/>
+    <w:bookmarkEnd w:id="94"/>
+    <w:bookmarkStart w:id="99" w:name="Xc8114be83f87911a3e825982079ac6b9186de2d"/>
     <w:p>
       <w:pPr>
         <w:pStyle w:val="Heading2"/>
@@ -16571,17 +16599,17 @@
     <w:tbl>
       <w:tblPr>
         <w:tblStyle w:val="Table"/>
-        <w:tblW w:type="dxa" w:w="9638"/>
-        <w:tblLayout w:type="autofit"/>
+        <w:tblW w:type="pct" w:w="5000"/>
+        <w:tblLayout w:type="fixed"/>
         <w:tblLook w:firstRow="0" w:lastRow="0" w:firstColumn="0" w:lastColumn="0" w:noHBand="0" w:noVBand="0" w:val="0000"/>
       </w:tblPr>
       <w:tblGrid>
-        <w:gridCol w:w="9638"/>
+        <w:gridCol w:w="7920"/>
       </w:tblGrid>
       <w:tr>
         <w:tc>
           <w:tcPr/>
-          <w:bookmarkStart w:id="85" w:name="fig-dynamika"/>
+          <w:bookmarkStart w:id="98" w:name="fig-dynamika"/>
           <w:p>
             <w:pPr>
               <w:pStyle w:val="Compact"/>
@@ -16592,18 +16620,18 @@
                 <wp:inline>
                   <wp:extent cx="4267200" cy="2607733"/>
                   <wp:effectExtent b="0" l="0" r="0" t="0"/>
-                  <wp:docPr descr="" title="" id="83" name="Picture"/>
+                  <wp:docPr descr="" title="" id="96" name="Picture"/>
                   <a:graphic>
                     <a:graphicData uri="http://schemas.openxmlformats.org/drawingml/2006/picture">
                       <pic:pic>
                         <pic:nvPicPr>
-                          <pic:cNvPr descr="../Wykresy/praca/fig_06_dynamika_porownanie.png" id="84" name="Picture"/>
+                          <pic:cNvPr descr="../Wykresy/praca/fig_06_dynamika_porownanie.png" id="97" name="Picture"/>
                           <pic:cNvPicPr>
                             <a:picLocks noChangeArrowheads="1" noChangeAspect="1"/>
                           </pic:cNvPicPr>
                         </pic:nvPicPr>
                         <pic:blipFill>
-                          <a:blip r:embed="rId82"/>
+                          <a:blip r:embed="rId95"/>
                           <a:stretch>
                             <a:fillRect/>
                           </a:stretch>
@@ -16635,7 +16663,7 @@
               <w:jc w:val="center"/>
             </w:pPr>
             <w:pPr>
-              <w:jc w:val="left"/>
+              <w:jc w:val="start"/>
               <w:spacing w:before="200"/>
               <w:pStyle w:val="ImageCaption"/>
             </w:pPr>
@@ -16643,7 +16671,7 @@
               <w:t xml:space="preserve">Rysunek 12: Roczne tempo wzrostu liczby publikacji na badacza według danych OpenAlex i Omega-PSIR. Linie pokazują 95% przedziały ufności. Wyniki wskazują, że ocena dynamiki rozwoju uczelni zależy od źródła danych.</w:t>
             </w:r>
           </w:p>
-          <w:bookmarkEnd w:id="85"/>
+          <w:bookmarkEnd w:id="98"/>
         </w:tc>
       </w:tr>
     </w:tbl>
@@ -16679,8 +16707,8 @@
         <w:t xml:space="preserve">Różnice między uczelniami należy jednak interpretować ostrożnie, ponieważ przedziały ufności są szerokie i częściowo się nakładają. Bardziej wiarygodny jest ogólny podział na uczelnie o wyższym tempie wzrostu (URK, UWM) oraz uczelnie o bardziej ustabilizowanej produktywności (UPWr, SGGW), niż dokładny ranking uczelni.</w:t>
       </w:r>
     </w:p>
-    <w:bookmarkEnd w:id="86"/>
-    <w:bookmarkStart w:id="87" w:name="ograniczenia-badania"/>
+    <w:bookmarkEnd w:id="99"/>
+    <w:bookmarkStart w:id="100" w:name="ograniczenia-badania"/>
     <w:p>
       <w:pPr>
         <w:pStyle w:val="Heading2"/>
@@ -16839,7 +16867,7 @@
           <w:rPr>
             <w:rStyle w:val="Hyperlink"/>
           </w:rPr>
-          <w:t xml:space="preserve">Culbert et al. 2025</w:t>
+          <w:t xml:space="preserve">Culbert i in. 2025</w:t>
         </w:r>
       </w:hyperlink>
       <w:r>
@@ -16849,9 +16877,9 @@
         <w:t xml:space="preserve">. Dlatego Omega-PSIR przyjęto jako źródło podstawowe, a OpenAlex jako źródło uzupełniające.</w:t>
       </w:r>
     </w:p>
-    <w:bookmarkEnd w:id="87"/>
-    <w:bookmarkEnd w:id="88"/>
-    <w:bookmarkStart w:id="90" w:name="wnioski"/>
+    <w:bookmarkEnd w:id="100"/>
+    <w:bookmarkEnd w:id="101"/>
+    <w:bookmarkStart w:id="103" w:name="wnioski"/>
     <w:p>
       <w:pPr>
         <w:pStyle w:val="Heading1"/>
@@ -16916,7 +16944,7 @@
         <w:t xml:space="preserve">Łącznie wyniki pokazują, że indywidualny dorobek naukowców jest związany głównie z etapem kariery, natomiast współpraca naukowa przebiega przede wszystkim w obrębie uczelni. Praca potwierdza także znaczenie jednorodnego źródła danych. Wykorzystanie systemów Omega-PSIR umożliwiło porównywalne pozyskanie wskaźników bibliometrycznych z czterech uczelni, co byłoby znacznie trudniejsze przy użyciu różnych, niejednolitych repozytoriów.</w:t>
       </w:r>
     </w:p>
-    <w:bookmarkStart w:id="89" w:name="wnioski-dla-praktyki"/>
+    <w:bookmarkStart w:id="102" w:name="wnioski-dla-praktyki"/>
     <w:p>
       <w:pPr>
         <w:pStyle w:val="Heading2"/>
@@ -16957,10 +16985,15 @@
         <w:t xml:space="preserve">Po trzecie, wyniki sugerują, że wysoka jakość dorobku nie musi być związana wyłącznie z długim stażem czy dużą liczbą publikacji. W analizie widoczna była grupa młodszych badaczy o wysokich wskaźnikach jakościowych. Ich wyniki wiązały się przede wszystkim z udziałem w szerszej, wieloautorskiej współpracy. Wniosek ten wymaga jednak potwierdzenia w badaniach podłużnych, zanim mógłby zostać wykorzystany jako podstawa praktycznych zaleceń dotyczących budowania zespołów badawczych.</w:t>
       </w:r>
     </w:p>
-    <w:bookmarkEnd w:id="89"/>
-    <w:bookmarkEnd w:id="90"/>
-    <w:bookmarkStart w:id="128" w:name="bibliografia"/>
     <w:p>
+      <w:r>
+        <w:br w:type="page"/>
+      </w:r>
+    </w:p>
+    <w:bookmarkEnd w:id="102"/>
+    <w:bookmarkEnd w:id="103"/>
+    <w:bookmarkStart w:id="141" w:name="bibliografia"/>
+    <w:p>
       <w:pPr>
         <w:pStyle w:val="Heading1"/>
       </w:pPr>
@@ -16968,8 +17001,8 @@
         <w:t xml:space="preserve">Bibliografia</w:t>
       </w:r>
     </w:p>
-    <w:bookmarkStart w:id="127" w:name="refs"/>
-    <w:bookmarkStart w:id="92" w:name="ref-ariaBibliometrix2017"/>
+    <w:bookmarkStart w:id="140" w:name="refs"/>
+    <w:bookmarkStart w:id="105" w:name="ref-ariaBibliometrix2017"/>
     <w:p>
       <w:pPr>
         <w:pStyle w:val="Bibliography"/>
@@ -17014,7 +17047,7 @@
       <w:r>
         <w:t xml:space="preserve"> </w:t>
       </w:r>
-      <w:hyperlink r:id="rId91">
+      <w:hyperlink r:id="rId104">
         <w:r>
           <w:rPr>
             <w:rStyle w:val="Hyperlink"/>
@@ -17026,8 +17059,8 @@
         <w:t xml:space="preserve">.</w:t>
       </w:r>
     </w:p>
-    <w:bookmarkEnd w:id="92"/>
-    <w:bookmarkStart w:id="94" w:name="ref-ariaOpenalexR2024"/>
+    <w:bookmarkEnd w:id="105"/>
+    <w:bookmarkStart w:id="107" w:name="ref-ariaOpenalexR2024"/>
     <w:p>
       <w:pPr>
         <w:pStyle w:val="Bibliography"/>
@@ -17087,7 +17120,7 @@
       <w:r>
         <w:t xml:space="preserve"> </w:t>
       </w:r>
-      <w:hyperlink r:id="rId93">
+      <w:hyperlink r:id="rId106">
         <w:r>
           <w:rPr>
             <w:rStyle w:val="Hyperlink"/>
@@ -17099,8 +17132,8 @@
         <w:t xml:space="preserve">.</w:t>
       </w:r>
     </w:p>
-    <w:bookmarkEnd w:id="94"/>
-    <w:bookmarkStart w:id="95" w:name="ref-blondel2008"/>
+    <w:bookmarkEnd w:id="107"/>
+    <w:bookmarkStart w:id="108" w:name="ref-blondel2008"/>
     <w:p>
       <w:pPr>
         <w:pStyle w:val="Bibliography"/>
@@ -17134,8 +17167,8 @@
         <w:t xml:space="preserve">2008 (10): P10008.</w:t>
       </w:r>
     </w:p>
-    <w:bookmarkEnd w:id="95"/>
-    <w:bookmarkStart w:id="96" w:name="ref-breiman2001"/>
+    <w:bookmarkEnd w:id="108"/>
+    <w:bookmarkStart w:id="109" w:name="ref-breiman2001"/>
     <w:p>
       <w:pPr>
         <w:pStyle w:val="Bibliography"/>
@@ -17169,8 +17202,8 @@
         <w:t xml:space="preserve">45 (1): 5–32.</w:t>
       </w:r>
     </w:p>
-    <w:bookmarkEnd w:id="96"/>
-    <w:bookmarkStart w:id="97" w:name="ref-chen2016"/>
+    <w:bookmarkEnd w:id="109"/>
+    <w:bookmarkStart w:id="110" w:name="ref-chen2016"/>
     <w:p>
       <w:pPr>
         <w:pStyle w:val="Bibliography"/>
@@ -17191,7 +17224,7 @@
         <w:t xml:space="preserve">: A scalable tree boosting system”</w:t>
       </w:r>
       <w:r>
-        <w:t xml:space="preserve">.</w:t>
+        <w:t xml:space="preserve">. W</w:t>
       </w:r>
       <w:r>
         <w:t xml:space="preserve"> </w:t>
@@ -17207,14 +17240,14 @@
         <w:t xml:space="preserve">, 785–94.</w:t>
       </w:r>
     </w:p>
-    <w:bookmarkEnd w:id="97"/>
-    <w:bookmarkStart w:id="99" w:name="ref-culbertReferenceCoverageAnalysis2025"/>
+    <w:bookmarkEnd w:id="110"/>
+    <w:bookmarkStart w:id="112" w:name="ref-culbertReferenceCoverageAnalysis2025"/>
     <w:p>
       <w:pPr>
         <w:pStyle w:val="Bibliography"/>
       </w:pPr>
       <w:r>
-        <w:t xml:space="preserve">Culbert, Jack H., Anne Hobert, Najko Jahn, et al. 2025.</w:t>
+        <w:t xml:space="preserve">Culbert, Jack H., Anne Hobert, Najko Jahn, Nick Haupka, Marion Schmidt, Paul Donner, i Philipp Mayr. 2025.</w:t>
       </w:r>
       <w:r>
         <w:t xml:space="preserve"> </w:t>
@@ -17277,7 +17310,7 @@
       <w:r>
         <w:t xml:space="preserve"> </w:t>
       </w:r>
-      <w:hyperlink r:id="rId98">
+      <w:hyperlink r:id="rId111">
         <w:r>
           <w:rPr>
             <w:rStyle w:val="Hyperlink"/>
@@ -17289,8 +17322,8 @@
         <w:t xml:space="preserve">.</w:t>
       </w:r>
     </w:p>
-    <w:bookmarkEnd w:id="99"/>
-    <w:bookmarkStart w:id="100" w:name="ref-Drabek2012"/>
+    <w:bookmarkEnd w:id="112"/>
+    <w:bookmarkStart w:id="113" w:name="ref-Drabek2012"/>
     <w:p>
       <w:pPr>
         <w:pStyle w:val="Bibliography"/>
@@ -17324,8 +17357,8 @@
         <w:t xml:space="preserve">130 (3).</w:t>
       </w:r>
     </w:p>
-    <w:bookmarkEnd w:id="100"/>
-    <w:bookmarkStart w:id="101" w:name="ref-garfield2006"/>
+    <w:bookmarkEnd w:id="113"/>
+    <w:bookmarkStart w:id="114" w:name="ref-garfield2006"/>
     <w:p>
       <w:pPr>
         <w:pStyle w:val="Bibliography"/>
@@ -17359,8 +17392,8 @@
         <w:t xml:space="preserve">295 (1): 90–93.</w:t>
       </w:r>
     </w:p>
-    <w:bookmarkEnd w:id="101"/>
-    <w:bookmarkStart w:id="102" w:name="ref-Grygiel2009"/>
+    <w:bookmarkEnd w:id="114"/>
+    <w:bookmarkStart w:id="115" w:name="ref-Grygiel2009"/>
     <w:p>
       <w:pPr>
         <w:pStyle w:val="Bibliography"/>
@@ -17403,17 +17436,14 @@
         <w:t xml:space="preserve">7 (3): 65–84.</w:t>
       </w:r>
     </w:p>
-    <w:bookmarkEnd w:id="102"/>
-    <w:bookmarkStart w:id="104" w:name="X0b33f87ae5ad4597f5248ccd3781f8ded4d6a31"/>
+    <w:bookmarkEnd w:id="115"/>
+    <w:bookmarkStart w:id="117" w:name="X0b33f87ae5ad4597f5248ccd3781f8ded4d6a31"/>
     <w:p>
       <w:pPr>
         <w:pStyle w:val="Bibliography"/>
       </w:pPr>
       <w:r>
-        <w:t xml:space="preserve">Hicks, Diana, Paul Wouters, Ludo Waltman, Sarah de Rijcke, i Ismael Rafols</w:t>
-      </w:r>
-      <w:r>
-        <w:t xml:space="preserve">. 2015.</w:t>
+        <w:t xml:space="preserve">Hicks, Diana, Paul Wouters, Ludo Waltman, Sarah de Rijcke, i Ismael Rafols. 2015.</w:t>
       </w:r>
       <w:r>
         <w:t xml:space="preserve"> </w:t>
@@ -17455,7 +17485,7 @@
       <w:r>
         <w:t xml:space="preserve"> </w:t>
       </w:r>
-      <w:hyperlink r:id="rId103">
+      <w:hyperlink r:id="rId116">
         <w:r>
           <w:rPr>
             <w:rStyle w:val="Hyperlink"/>
@@ -17467,8 +17497,8 @@
         <w:t xml:space="preserve">.</w:t>
       </w:r>
     </w:p>
-    <w:bookmarkEnd w:id="104"/>
-    <w:bookmarkStart w:id="105" w:name="ref-hirsch2005"/>
+    <w:bookmarkEnd w:id="117"/>
+    <w:bookmarkStart w:id="118" w:name="ref-hirsch2005"/>
     <w:p>
       <w:pPr>
         <w:pStyle w:val="Bibliography"/>
@@ -17502,8 +17532,8 @@
         <w:t xml:space="preserve">102 (46): 16569–72.</w:t>
       </w:r>
     </w:p>
-    <w:bookmarkEnd w:id="105"/>
-    <w:bookmarkStart w:id="106" w:name="ref-hubert1985"/>
+    <w:bookmarkEnd w:id="118"/>
+    <w:bookmarkStart w:id="119" w:name="ref-hubert1985"/>
     <w:p>
       <w:pPr>
         <w:pStyle w:val="Bibliography"/>
@@ -17537,8 +17567,8 @@
         <w:t xml:space="preserve">2 (1): 193–218.</w:t>
       </w:r>
     </w:p>
-    <w:bookmarkEnd w:id="106"/>
-    <w:bookmarkStart w:id="108" w:name="ref-koperwas2015omega"/>
+    <w:bookmarkEnd w:id="119"/>
+    <w:bookmarkStart w:id="121" w:name="ref-koperwas2015omega"/>
     <w:p>
       <w:pPr>
         <w:pStyle w:val="Bibliography"/>
@@ -17562,7 +17592,7 @@
         <w:t xml:space="preserve">– a solution for implementing university research knowledge base”</w:t>
       </w:r>
       <w:r>
-        <w:t xml:space="preserve">.</w:t>
+        <w:t xml:space="preserve">. W</w:t>
       </w:r>
       <w:r>
         <w:t xml:space="preserve"> </w:t>
@@ -17575,15 +17605,12 @@
         <w:t xml:space="preserve">Proceedings of the 21st EUNIS Congress</w:t>
       </w:r>
       <w:r>
-        <w:t xml:space="preserve"> </w:t>
-      </w:r>
-      <w:r>
-        <w:t xml:space="preserve">(Dundee).</w:t>
-      </w:r>
-      <w:r>
-        <w:t xml:space="preserve"> </w:t>
-      </w:r>
-      <w:hyperlink r:id="rId107">
+        <w:t xml:space="preserve">. Dundee: European University Information Systems Organisation (EUNIS).</w:t>
+      </w:r>
+      <w:r>
+        <w:t xml:space="preserve"> </w:t>
+      </w:r>
+      <w:hyperlink r:id="rId120">
         <w:r>
           <w:rPr>
             <w:rStyle w:val="Hyperlink"/>
@@ -17595,8 +17622,8 @@
         <w:t xml:space="preserve">.</w:t>
       </w:r>
     </w:p>
-    <w:bookmarkEnd w:id="108"/>
-    <w:bookmarkStart w:id="109" w:name="ref-Kulczycki2019"/>
+    <w:bookmarkEnd w:id="121"/>
+    <w:bookmarkStart w:id="122" w:name="ref-Kulczycki2019"/>
     <w:p>
       <w:pPr>
         <w:pStyle w:val="Bibliography"/>
@@ -17627,8 +17654,8 @@
         <w:t xml:space="preserve">, nr 6.</w:t>
       </w:r>
     </w:p>
-    <w:bookmarkEnd w:id="109"/>
-    <w:bookmarkStart w:id="110" w:name="ref-lundberg2017"/>
+    <w:bookmarkEnd w:id="122"/>
+    <w:bookmarkStart w:id="123" w:name="ref-lundberg2017"/>
     <w:p>
       <w:pPr>
         <w:pStyle w:val="Bibliography"/>
@@ -17643,7 +17670,7 @@
         <w:t xml:space="preserve">„A unified approach to interpreting model predictions”</w:t>
       </w:r>
       <w:r>
-        <w:t xml:space="preserve">.</w:t>
+        <w:t xml:space="preserve">. W</w:t>
       </w:r>
       <w:r>
         <w:t xml:space="preserve"> </w:t>
@@ -17656,14 +17683,11 @@
         <w:t xml:space="preserve">Advances in Neural Information Processing Systems</w:t>
       </w:r>
       <w:r>
-        <w:t xml:space="preserve"> </w:t>
-      </w:r>
-      <w:r>
-        <w:t xml:space="preserve">30: 4765–74.</w:t>
+        <w:t xml:space="preserve">, 30:4765–74.</w:t>
       </w:r>
     </w:p>
-    <w:bookmarkEnd w:id="110"/>
-    <w:bookmarkStart w:id="111" w:name="ref-rozp_ewaluacja2022"/>
+    <w:bookmarkEnd w:id="123"/>
+    <w:bookmarkStart w:id="124" w:name="ref-rozp_ewaluacja2022"/>
     <w:p>
       <w:pPr>
         <w:pStyle w:val="Bibliography"/>
@@ -17675,18 +17699,14 @@
         <w:t xml:space="preserve"> </w:t>
       </w:r>
       <w:r>
-        <w:rPr>
-          <w:i/>
-          <w:iCs/>
-        </w:rPr>
-        <w:t xml:space="preserve">Obwieszczenie Ministra Edukacji i Nauki z dnia 23 lutego 2022 r. w sprawie ogłoszenia jednolitego tekstu rozporządzenia Ministra Nauki i Szkolnictwa Wyższego w sprawie ewaluacji jakości działalności naukowej</w:t>
+        <w:t xml:space="preserve">„Obwieszczenie Ministra Edukacji i Nauki z dnia 23 lutego 2022 r. w sprawie ogłoszenia jednolitego tekstu rozporządzenia Ministra Nauki i Szkolnictwa Wyższego w sprawie ewaluacji jakości działalności naukowej”</w:t>
       </w:r>
       <w:r>
         <w:t xml:space="preserve">. Dz.U. 2022 poz. 661.</w:t>
       </w:r>
     </w:p>
-    <w:bookmarkEnd w:id="111"/>
-    <w:bookmarkStart w:id="112" w:name="ref-rozp_dyscypliny2025"/>
+    <w:bookmarkEnd w:id="124"/>
+    <w:bookmarkStart w:id="125" w:name="ref-rozp_dyscypliny2025"/>
     <w:p>
       <w:pPr>
         <w:pStyle w:val="Bibliography"/>
@@ -17698,41 +17718,33 @@
         <w:t xml:space="preserve"> </w:t>
       </w:r>
       <w:r>
-        <w:rPr>
-          <w:i/>
-          <w:iCs/>
-        </w:rPr>
-        <w:t xml:space="preserve">Obwieszczenie Ministra Nauki i Szkolnictwa Wyższego z dnia 12 lutego 2025 r. w sprawie ogłoszenia jednolitego tekstu rozporządzenia Ministra Edukacji i Nauki w sprawie dziedzin nauki i dyscyplin naukowych oraz dyscyplin artystycznych</w:t>
+        <w:t xml:space="preserve">„Obwieszczenie Ministra Nauki i Szkolnictwa Wyższego z dnia 12 lutego 2025 r. w sprawie ogłoszenia jednolitego tekstu rozporządzenia Ministra Edukacji i Nauki w sprawie dziedzin nauki i dyscyplin naukowych oraz dyscyplin artystycznych”</w:t>
       </w:r>
       <w:r>
         <w:t xml:space="preserve">. Dz.U. 2025 poz. 211.</w:t>
       </w:r>
     </w:p>
-    <w:bookmarkEnd w:id="112"/>
-    <w:bookmarkStart w:id="113" w:name="ref-rozp_ewaluacja_nowela2025"/>
+    <w:bookmarkEnd w:id="125"/>
+    <w:bookmarkStart w:id="126" w:name="ref-rozp_ewaluacja_nowela2025"/>
     <w:p>
       <w:pPr>
         <w:pStyle w:val="Bibliography"/>
       </w:pPr>
       <w:r>
-        <w:t xml:space="preserve">Minister Nauki i Szkolnictwa Wyższego. 2025b.</w:t>
-      </w:r>
-      <w:r>
-        <w:t xml:space="preserve"> </w:t>
-      </w:r>
-      <w:r>
-        <w:rPr>
-          <w:i/>
-          <w:iCs/>
-        </w:rPr>
-        <w:t xml:space="preserve">Rozporządzenie Ministra Nauki i Szkolnictwa Wyższego z dnia 30 lipca 2025 r. zmieniające rozporządzenie w sprawie ewaluacji jakości działalności naukowej</w:t>
+        <w:t xml:space="preserve">———. 2025b.</w:t>
+      </w:r>
+      <w:r>
+        <w:t xml:space="preserve"> </w:t>
+      </w:r>
+      <w:r>
+        <w:t xml:space="preserve">„Rozporządzenie Ministra Nauki i Szkolnictwa Wyższego z dnia 30 lipca 2025 r. zmieniające rozporządzenie w sprawie ewaluacji jakości działalności naukowej”</w:t>
       </w:r>
       <w:r>
         <w:t xml:space="preserve">. Dz.U. 2025 poz. 1053.</w:t>
       </w:r>
     </w:p>
-    <w:bookmarkEnd w:id="113"/>
-    <w:bookmarkStart w:id="114" w:name="ref-moed2010snip"/>
+    <w:bookmarkEnd w:id="126"/>
+    <w:bookmarkStart w:id="127" w:name="ref-moed2010snip"/>
     <w:p>
       <w:pPr>
         <w:pStyle w:val="Bibliography"/>
@@ -17766,8 +17778,8 @@
         <w:t xml:space="preserve">4 (3): 265–77.</w:t>
       </w:r>
     </w:p>
-    <w:bookmarkEnd w:id="114"/>
-    <w:bookmarkStart w:id="116" w:name="Xf57435758c1415795137dce9045dde0a68674c8"/>
+    <w:bookmarkEnd w:id="127"/>
+    <w:bookmarkStart w:id="129" w:name="Xf57435758c1415795137dce9045dde0a68674c8"/>
     <w:p>
       <w:pPr>
         <w:pStyle w:val="Bibliography"/>
@@ -17803,7 +17815,7 @@
       <w:r>
         <w:t xml:space="preserve"> </w:t>
       </w:r>
-      <w:hyperlink r:id="rId115">
+      <w:hyperlink r:id="rId128">
         <w:r>
           <w:rPr>
             <w:rStyle w:val="Hyperlink"/>
@@ -17815,14 +17827,14 @@
         <w:t xml:space="preserve">.</w:t>
       </w:r>
     </w:p>
-    <w:bookmarkEnd w:id="116"/>
-    <w:bookmarkStart w:id="117" w:name="ref-newman2006"/>
+    <w:bookmarkEnd w:id="129"/>
+    <w:bookmarkStart w:id="130" w:name="ref-newman2006"/>
     <w:p>
       <w:pPr>
         <w:pStyle w:val="Bibliography"/>
       </w:pPr>
       <w:r>
-        <w:t xml:space="preserve">Newman, Mark E. J. 2006.</w:t>
+        <w:t xml:space="preserve">———. 2006.</w:t>
       </w:r>
       <w:r>
         <w:t xml:space="preserve"> </w:t>
@@ -17850,8 +17862,8 @@
         <w:t xml:space="preserve">103 (23): 8577–82.</w:t>
       </w:r>
     </w:p>
-    <w:bookmarkEnd w:id="117"/>
-    <w:bookmarkStart w:id="118" w:name="ref-Opalinski2017"/>
+    <w:bookmarkEnd w:id="130"/>
+    <w:bookmarkStart w:id="131" w:name="ref-Opalinski2017"/>
     <w:p>
       <w:pPr>
         <w:pStyle w:val="Bibliography"/>
@@ -17885,8 +17897,8 @@
         <w:t xml:space="preserve">55 (1): 34–65.</w:t>
       </w:r>
     </w:p>
-    <w:bookmarkEnd w:id="118"/>
-    <w:bookmarkStart w:id="119" w:name="ref-openalex2022"/>
+    <w:bookmarkEnd w:id="131"/>
+    <w:bookmarkStart w:id="132" w:name="ref-openalex2022"/>
     <w:p>
       <w:pPr>
         <w:pStyle w:val="Bibliography"/>
@@ -17917,8 +17929,8 @@
         <w:t xml:space="preserve">.</w:t>
       </w:r>
     </w:p>
-    <w:bookmarkEnd w:id="119"/>
-    <w:bookmarkStart w:id="121" w:name="Xfa806a68882317565cd91e2502e10e0c6dc8daa"/>
+    <w:bookmarkEnd w:id="132"/>
+    <w:bookmarkStart w:id="134" w:name="Xfa806a68882317565cd91e2502e10e0c6dc8daa"/>
     <w:p>
       <w:pPr>
         <w:pStyle w:val="Bibliography"/>
@@ -17973,12 +17985,12 @@
         <w:t xml:space="preserve">ITlib. Informačné technológie a knižnice</w:t>
       </w:r>
       <w:r>
-        <w:t xml:space="preserve">, advance online publication.</w:t>
-      </w:r>
-      <w:r>
-        <w:t xml:space="preserve"> </w:t>
-      </w:r>
-      <w:hyperlink r:id="rId120">
+        <w:t xml:space="preserve">.</w:t>
+      </w:r>
+      <w:r>
+        <w:t xml:space="preserve"> </w:t>
+      </w:r>
+      <w:hyperlink r:id="rId133">
         <w:r>
           <w:rPr>
             <w:rStyle w:val="Hyperlink"/>
@@ -17990,8 +18002,8 @@
         <w:t xml:space="preserve">.</w:t>
       </w:r>
     </w:p>
-    <w:bookmarkEnd w:id="121"/>
-    <w:bookmarkStart w:id="122" w:name="ref-waltman2016review"/>
+    <w:bookmarkEnd w:id="134"/>
+    <w:bookmarkStart w:id="135" w:name="ref-waltman2016review"/>
     <w:p>
       <w:pPr>
         <w:pStyle w:val="Bibliography"/>
@@ -18025,8 +18037,8 @@
         <w:t xml:space="preserve">10 (2): 365–91.</w:t>
       </w:r>
     </w:p>
-    <w:bookmarkEnd w:id="122"/>
-    <w:bookmarkStart w:id="124" w:name="ref-omegapsir2024"/>
+    <w:bookmarkEnd w:id="135"/>
+    <w:bookmarkStart w:id="137" w:name="ref-omegapsir2024"/>
     <w:p>
       <w:pPr>
         <w:pStyle w:val="Bibliography"/>
@@ -18038,11 +18050,7 @@
         <w:t xml:space="preserve"> </w:t>
       </w:r>
       <w:r>
-        <w:rPr>
-          <w:i/>
-          <w:iCs/>
-        </w:rPr>
-        <w:t xml:space="preserve">Omega-PSIR: University Research Information System</w:t>
+        <w:t xml:space="preserve">„Omega-PSIR: University Research Information System”</w:t>
       </w:r>
       <w:r>
         <w:t xml:space="preserve">.</w:t>
@@ -18050,7 +18058,7 @@
       <w:r>
         <w:t xml:space="preserve"> </w:t>
       </w:r>
-      <w:hyperlink r:id="rId123">
+      <w:hyperlink r:id="rId136">
         <w:r>
           <w:rPr>
             <w:rStyle w:val="Hyperlink"/>
@@ -18062,8 +18070,8 @@
         <w:t xml:space="preserve">.</w:t>
       </w:r>
     </w:p>
-    <w:bookmarkEnd w:id="124"/>
-    <w:bookmarkStart w:id="125" w:name="ref-winkler1990"/>
+    <w:bookmarkEnd w:id="137"/>
+    <w:bookmarkStart w:id="138" w:name="ref-winkler1990"/>
     <w:p>
       <w:pPr>
         <w:pStyle w:val="Bibliography"/>
@@ -18106,8 +18114,8 @@
         <w:t xml:space="preserve">, 354–59.</w:t>
       </w:r>
     </w:p>
-    <w:bookmarkEnd w:id="125"/>
-    <w:bookmarkStart w:id="126" w:name="ref-youden1950"/>
+    <w:bookmarkEnd w:id="138"/>
+    <w:bookmarkStart w:id="139" w:name="ref-youden1950"/>
     <w:p>
       <w:pPr>
         <w:pStyle w:val="Bibliography"/>
@@ -18141,9 +18149,9 @@
         <w:t xml:space="preserve">3 (1): 32–35.</w:t>
       </w:r>
     </w:p>
-    <w:bookmarkEnd w:id="126"/>
-    <w:bookmarkEnd w:id="127"/>
-    <w:bookmarkEnd w:id="128"/>
+    <w:bookmarkEnd w:id="139"/>
+    <w:bookmarkEnd w:id="140"/>
+    <w:bookmarkEnd w:id="141"/>
     <w:sectPr>
       <w:footnotePr>
         <w:numRestart w:val="eachSect"/>
@@ -18492,10 +18500,10 @@
   <w:docDefaults>
     <w:rPrDefault>
       <w:rPr>
-        <w:rFonts w:asciiTheme="minorHAnsi" w:cstheme="minorBidi" w:eastAsiaTheme="minorEastAsia" w:hAnsiTheme="minorHAnsi"/>
+        <w:rFonts w:asciiTheme="minorHAnsi" w:cstheme="minorBidi" w:eastAsiaTheme="minorHAnsi" w:hAnsiTheme="minorHAnsi"/>
         <w:sz w:val="24"/>
         <w:szCs w:val="24"/>
-        <w:lang w:bidi="ar-SA" w:eastAsia="zh-CN" w:val="pl"/>
+        <w:lang w:bidi="ar-SA" w:eastAsia="en-US" w:val="pl"/>
       </w:rPr>
     </w:rPrDefault>
     <w:pPrDefault>
@@ -19036,6 +19044,13 @@
       </w:tblCellMar>
     </w:tblPr>
     <w:tblStylePr w:type="firstRow">
+      <w:tblPr>
+        <w:jc w:val="left"/>
+        <w:tblInd w:type="dxa" w:w="0"/>
+      </w:tblPr>
+      <w:trPr>
+        <w:jc w:val="left"/>
+      </w:trPr>
       <w:tcPr>
         <w:tcBorders>
           <w:bottom w:val="single"/>

</xml_diff>